<commit_message>
Paper: fold in EXP-009 (strong-invariance rebuttal, OASSL) and EXP-010 (MIMII-DG breadth)
Table 2 gains the invariance arm at both backbones; new Table 4 shows conditioning
transfers to MIMII-DG (continuous bearing speed + discrete valve pattern). Abstract,
limitations, and references updated. DOCX + PDF rebuilt.

Co-Authored-By: Claude Opus 4.8 <noreply@anthropic.com>
</commit_message>
<xml_diff>
--- a/docs/EngineKnock_speed_conditional.docx
+++ b/docs/EngineKnock_speed_conditional.docx
@@ -161,7 +161,13 @@
         <w:t xml:space="preserve"> </w:t>
       </w:r>
       <w:r>
-        <w:t xml:space="preserve">0.419). For speed variation, condition, don't remove.</w:t>
+        <w:t xml:space="preserve">0.419). The principle transfers to the MIMII-DG acoustic benchmark, including a discrete operating</w:t>
+      </w:r>
+      <w:r>
+        <w:t xml:space="preserve"> </w:t>
+      </w:r>
+      <w:r>
+        <w:t xml:space="preserve">attribute. For speed variation, condition, don't remove.</w:t>
       </w:r>
     </w:p>
     <w:bookmarkEnd w:id="9"/>
@@ -681,7 +687,13 @@
         <w:t xml:space="preserve"> </w:t>
       </w:r>
       <w:r>
-        <w:t xml:space="preserve">goal with order-tracking autoencoders. Invariance and conditioning are</w:t>
+        <w:t xml:space="preserve">goal with order-tracking autoencoders and order-adaptive subspace learning</w:t>
+      </w:r>
+      <w:r>
+        <w:t xml:space="preserve"> </w:t>
+      </w:r>
+      <w:r>
+        <w:t xml:space="preserve">(OASSL) [9]. Invariance and conditioning are</w:t>
       </w:r>
       <w:r>
         <w:t xml:space="preserve"> </w:t>
@@ -2974,31 +2986,67 @@
           <w:b/>
           <w:bCs/>
         </w:rPr>
-        <w:t xml:space="preserve">Backbone-agnostic.</w:t>
-      </w:r>
-      <w:r>
-        <w:t xml:space="preserve"> </w:t>
-      </w:r>
-      <w:r>
-        <w:t xml:space="preserve">Table 2 repeats the pooled comparison with the reconstruction backbone swapped from PCA to a</w:t>
-      </w:r>
-      <w:r>
-        <w:t xml:space="preserve"> </w:t>
-      </w:r>
-      <w:r>
-        <w:t xml:space="preserve">dense autoencoder. The conditioning gain is essentially unchanged (+0.033/+0.040 for PCA,</w:t>
-      </w:r>
-      <w:r>
-        <w:t xml:space="preserve"> </w:t>
-      </w:r>
-      <w:r>
-        <w:t xml:space="preserve">+0.030/+0.044 for the autoencoder), and the autoencoder alone does not beat PCA alone: the improvement</w:t>
-      </w:r>
-      <w:r>
-        <w:t xml:space="preserve"> </w:t>
-      </w:r>
-      <w:r>
-        <w:t xml:space="preserve">comes from conditioning, not from backbone capacity.</w:t>
+        <w:t xml:space="preserve">Backbone-agnostic, and invariance stays behind.</w:t>
+      </w:r>
+      <w:r>
+        <w:t xml:space="preserve"> </w:t>
+      </w:r>
+      <w:r>
+        <w:t xml:space="preserve">Table 2 repeats the pooled comparison under two</w:t>
+      </w:r>
+      <w:r>
+        <w:t xml:space="preserve"> </w:t>
+      </w:r>
+      <w:r>
+        <w:t xml:space="preserve">backbones, a PCA reconstruction and a dense autoencoder, and adds the invariance arm at each. Three</w:t>
+      </w:r>
+      <w:r>
+        <w:t xml:space="preserve"> </w:t>
+      </w:r>
+      <w:r>
+        <w:t xml:space="preserve">things hold. The conditioning gain is essentially unchanged across backbones (+0.033/+0.040 for PCA,</w:t>
+      </w:r>
+      <w:r>
+        <w:t xml:space="preserve"> </w:t>
+      </w:r>
+      <w:r>
+        <w:t xml:space="preserve">+0.032/+0.043 for the autoencoder), and the autoencoder alone does not beat PCA alone, so the</w:t>
+      </w:r>
+      <w:r>
+        <w:t xml:space="preserve"> </w:t>
+      </w:r>
+      <w:r>
+        <w:t xml:space="preserve">improvement comes from conditioning, not from backbone capacity. The invariance approach does not</w:t>
+      </w:r>
+      <w:r>
+        <w:t xml:space="preserve"> </w:t>
+      </w:r>
+      <w:r>
+        <w:t xml:space="preserve">recover when given the stronger backbone: order tracking under the autoencoder still collapses under</w:t>
+      </w:r>
+      <w:r>
+        <w:t xml:space="preserve"> </w:t>
+      </w:r>
+      <w:r>
+        <w:t xml:space="preserve">speed shift (0.809), below the unconditional detector. Since the strongest recent speed-invariance</w:t>
+      </w:r>
+      <w:r>
+        <w:t xml:space="preserve"> </w:t>
+      </w:r>
+      <w:r>
+        <w:t xml:space="preserve">method for this setting, OASSL [9], is not publicly available, we take a deep autoencoder on</w:t>
+      </w:r>
+      <w:r>
+        <w:t xml:space="preserve"> </w:t>
+      </w:r>
+      <w:r>
+        <w:t xml:space="preserve">order-tracked features as its reproducible in-class representative; conditioning outperforms it at both</w:t>
+      </w:r>
+      <w:r>
+        <w:t xml:space="preserve"> </w:t>
+      </w:r>
+      <w:r>
+        <w:t xml:space="preserve">backbones.</w:t>
       </w:r>
     </w:p>
     <w:p>
@@ -3029,7 +3077,7 @@
           <w:b w:val="0"/>
           <w:i/>
         </w:rPr>
-        <w:t>Pooled ROC-AUC by backbone and conditioning. The effect is backbone-agnostic.</w:t>
+        <w:t>Pooled ROC-AUC (matched / held-out speed) by backbone and treatment. The conditioning gain is backbone-agnostic, and the invariance (order-tracking) arm stays below the unconditional baseline under speed shift at both backbones.</w:t>
       </w:r>
     </w:p>
     <w:tbl>
@@ -3038,7 +3086,7 @@
         <w:tblW w:type="pct" w:w="5000"/>
         <w:jc w:val="center"/>
         <w:tblLook w:firstRow="1" w:lastRow="0" w:firstColumn="0" w:lastColumn="0" w:noHBand="0" w:noVBand="0" w:val="0020"/>
-        <w:tblCaption w:val="Table 2. Pooled ROC-AUC by backbone and conditioning. The effect is backbone-agnostic."/>
+        <w:tblCaption w:val="Table 2. Pooled ROC-AUC (matched / held-out speed) by backbone and treatment. The conditioning gain is backbone-agnostic, and the invariance (order-tracking) arm stays below the unconditional baseline under speed shift at both backbones."/>
         <w:tblLayout w:type="autofit"/>
         <w:tblBorders>
           <w:top w:val="single" w:sz="10" w:color="4F6272"/>
@@ -3050,11 +3098,10 @@
         </w:tblBorders>
       </w:tblPr>
       <w:tblGrid>
-        <w:gridCol w:w="1584"/>
-        <w:gridCol w:w="1584"/>
-        <w:gridCol w:w="1584"/>
-        <w:gridCol w:w="1584"/>
-        <w:gridCol w:w="1584"/>
+        <w:gridCol w:w="1980"/>
+        <w:gridCol w:w="1980"/>
+        <w:gridCol w:w="1980"/>
+        <w:gridCol w:w="1980"/>
       </w:tblGrid>
       <w:tr>
         <w:trPr>
@@ -3118,7 +3165,7 @@
                 <w:b/>
                 <w:sz w:val="19"/>
               </w:rPr>
-              <w:t xml:space="preserve">Uncond. matched</w:t>
+              <w:t xml:space="preserve">Unconditional</w:t>
             </w:r>
           </w:p>
         </w:tc>
@@ -3149,7 +3196,7 @@
                 <w:b/>
                 <w:sz w:val="19"/>
               </w:rPr>
-              <w:t xml:space="preserve">Cond. matched</w:t>
+              <w:t xml:space="preserve">Invariance</w:t>
             </w:r>
           </w:p>
         </w:tc>
@@ -3180,38 +3227,7 @@
                 <w:b/>
                 <w:sz w:val="19"/>
               </w:rPr>
-              <w:t xml:space="preserve">Uncond. held-out</w:t>
-            </w:r>
-          </w:p>
-        </w:tc>
-        <w:tc>
-          <w:tcPr>
-            <w:shd w:fill="EEF3F7"/>
-            <w:tcBorders>
-              <w:left w:val="nil"/>
-              <w:right w:val="nil"/>
-              <w:top w:val="nil"/>
-              <w:bottom w:val="single" w:sz="8" w:color="9FB0C2"/>
-            </w:tcBorders>
-            <w:vAlign w:val="center"/>
-          </w:tcPr>
-          <w:p>
-            <w:pPr>
-              <w:pStyle w:val="Compact"/>
-              <w:spacing w:before="0" w:after="20" w:line="240" w:lineRule="auto"/>
-              <w:jc w:val="center"/>
-              <w:suppressAutoHyphens/>
-              <w:keepNext w:val="0"/>
-              <w:keepLines/>
-              <w:widowControl w:val="1"/>
-            </w:pPr>
-            <w:r>
-              <w:rPr>
-                <w:rFonts w:ascii="Georgia" w:hAnsi="Georgia"/>
-                <w:b/>
-                <w:sz w:val="19"/>
-              </w:rPr>
-              <w:t xml:space="preserve">Cond. held-out</w:t>
+              <w:t xml:space="preserve">Conditioning</w:t>
             </w:r>
           </w:p>
         </w:tc>
@@ -3271,7 +3287,7 @@
                 <w:rFonts w:ascii="Georgia" w:hAnsi="Georgia"/>
                 <w:sz w:val="19"/>
               </w:rPr>
-              <w:t xml:space="preserve">0.957</w:t>
+              <w:t xml:space="preserve">0.957 / 0.897</w:t>
             </w:r>
           </w:p>
         </w:tc>
@@ -3300,7 +3316,7 @@
                 <w:rFonts w:ascii="Georgia" w:hAnsi="Georgia"/>
                 <w:sz w:val="19"/>
               </w:rPr>
-              <w:t xml:space="preserve">0.990</w:t>
+              <w:t xml:space="preserve">0.959 / 0.835</w:t>
             </w:r>
           </w:p>
         </w:tc>
@@ -3329,36 +3345,7 @@
                 <w:rFonts w:ascii="Georgia" w:hAnsi="Georgia"/>
                 <w:sz w:val="19"/>
               </w:rPr>
-              <w:t xml:space="preserve">0.897</w:t>
-            </w:r>
-          </w:p>
-        </w:tc>
-        <w:tc>
-          <w:tcPr>
-            <w:tcBorders>
-              <w:left w:val="nil"/>
-              <w:right w:val="nil"/>
-              <w:top w:val="nil"/>
-              <w:bottom w:val="single" w:sz="4" w:color="D9E1E8"/>
-            </w:tcBorders>
-            <w:vAlign w:val="center"/>
-          </w:tcPr>
-          <w:p>
-            <w:pPr>
-              <w:pStyle w:val="Compact"/>
-              <w:spacing w:before="0" w:after="20" w:line="240" w:lineRule="auto"/>
-              <w:jc w:val="center"/>
-              <w:suppressAutoHyphens/>
-              <w:keepNext w:val="0"/>
-              <w:keepLines/>
-              <w:widowControl w:val="1"/>
-            </w:pPr>
-            <w:r>
-              <w:rPr>
-                <w:rFonts w:ascii="Georgia" w:hAnsi="Georgia"/>
-                <w:sz w:val="19"/>
-              </w:rPr>
-              <w:t xml:space="preserve">0.937</w:t>
+              <w:t xml:space="preserve">0.990 / 0.937</w:t>
             </w:r>
           </w:p>
         </w:tc>
@@ -3418,7 +3405,7 @@
                 <w:rFonts w:ascii="Georgia" w:hAnsi="Georgia"/>
                 <w:sz w:val="19"/>
               </w:rPr>
-              <w:t xml:space="preserve">0.952</w:t>
+              <w:t xml:space="preserve">0.952 / 0.890</w:t>
             </w:r>
           </w:p>
         </w:tc>
@@ -3447,7 +3434,7 @@
                 <w:rFonts w:ascii="Georgia" w:hAnsi="Georgia"/>
                 <w:sz w:val="19"/>
               </w:rPr>
-              <w:t xml:space="preserve">0.982</w:t>
+              <w:t xml:space="preserve">0.960 / 0.809</w:t>
             </w:r>
           </w:p>
         </w:tc>
@@ -3476,36 +3463,7 @@
                 <w:rFonts w:ascii="Georgia" w:hAnsi="Georgia"/>
                 <w:sz w:val="19"/>
               </w:rPr>
-              <w:t xml:space="preserve">0.890</w:t>
-            </w:r>
-          </w:p>
-        </w:tc>
-        <w:tc>
-          <w:tcPr>
-            <w:tcBorders>
-              <w:left w:val="nil"/>
-              <w:right w:val="nil"/>
-              <w:top w:val="nil"/>
-              <w:bottom w:val="nil"/>
-            </w:tcBorders>
-            <w:vAlign w:val="center"/>
-          </w:tcPr>
-          <w:p>
-            <w:pPr>
-              <w:pStyle w:val="Compact"/>
-              <w:spacing w:before="0" w:after="20" w:line="240" w:lineRule="auto"/>
-              <w:jc w:val="center"/>
-              <w:suppressAutoHyphens/>
-              <w:keepNext w:val="0"/>
-              <w:keepLines/>
-              <w:widowControl w:val="1"/>
-            </w:pPr>
-            <w:r>
-              <w:rPr>
-                <w:rFonts w:ascii="Georgia" w:hAnsi="Georgia"/>
-                <w:sz w:val="19"/>
-              </w:rPr>
-              <w:t xml:space="preserve">0.935</w:t>
+              <w:t xml:space="preserve">0.984 / 0.933</w:t>
             </w:r>
           </w:p>
         </w:tc>
@@ -4157,6 +4115,738 @@
         <w:t xml:space="preserve">detectors do not key on the train/test split.</w:t>
       </w:r>
     </w:p>
+    <w:p>
+      <w:pPr>
+        <w:pStyle w:val="BodyText"/>
+        <w:jc w:val="both"/>
+        <w:keepNext w:val="0"/>
+        <w:keepLines w:val="0"/>
+        <w:widowControl w:val="1"/>
+      </w:pPr>
+      <w:r>
+        <w:rPr>
+          <w:b/>
+          <w:bCs/>
+        </w:rPr>
+        <w:t xml:space="preserve">A second dataset and a discrete covariate.</w:t>
+      </w:r>
+      <w:r>
+        <w:t xml:space="preserve"> </w:t>
+      </w:r>
+      <w:r>
+        <w:t xml:space="preserve">The principle is not specific to MaFaulDa or to a</w:t>
+      </w:r>
+      <w:r>
+        <w:t xml:space="preserve"> </w:t>
+      </w:r>
+      <w:r>
+        <w:t xml:space="preserve">continuous covariate. On MIMII-DG [5], the DCASE 2022 domain-generalization benchmark of machine</w:t>
+      </w:r>
+      <w:r>
+        <w:t xml:space="preserve"> </w:t>
+      </w:r>
+      <w:r>
+        <w:t xml:space="preserve">sounds, each machine provides an operating attribute and a source/target domain split; we condition a</w:t>
+      </w:r>
+      <w:r>
+        <w:t xml:space="preserve"> </w:t>
+      </w:r>
+      <w:r>
+        <w:t xml:space="preserve">log-mel reconstruction detector on that attribute. Table 4 reports the bearing machine, whose</w:t>
+      </w:r>
+      <w:r>
+        <w:t xml:space="preserve"> </w:t>
+      </w:r>
+      <w:r>
+        <w:t xml:space="preserve">attribute is a continuous rotation speed, and the valve machine, whose attribute is a discrete operation</w:t>
+      </w:r>
+      <w:r>
+        <w:t xml:space="preserve"> </w:t>
+      </w:r>
+      <w:r>
+        <w:t xml:space="preserve">pattern. Conditioning improves both domains for both machines, and most sharply on the shifted target</w:t>
+      </w:r>
+      <w:r>
+        <w:t xml:space="preserve"> </w:t>
+      </w:r>
+      <w:r>
+        <w:t xml:space="preserve">domain: valve target detection, which the unconditional detector drives below chance (0.376) because the</w:t>
+      </w:r>
+      <w:r>
+        <w:t xml:space="preserve"> </w:t>
+      </w:r>
+      <w:r>
+        <w:t xml:space="preserve">domain shift makes target-normal sound anomalous, is restored to 0.632 by conditioning on the operation</w:t>
+      </w:r>
+      <w:r>
+        <w:t xml:space="preserve"> </w:t>
+      </w:r>
+      <w:r>
+        <w:t xml:space="preserve">pattern. These are per-machine scores on a deliberately simple detector, reported to show the conditioning</w:t>
+      </w:r>
+      <w:r>
+        <w:t xml:space="preserve"> </w:t>
+      </w:r>
+      <w:r>
+        <w:t xml:space="preserve">principle transfers across datasets and covariate types, not to rank against the challenge leaderboard.</w:t>
+      </w:r>
+    </w:p>
+    <w:p>
+      <w:pPr>
+        <w:pStyle w:val="ImageCaption"/>
+        <w:spacing w:before="80" w:after="120" w:line="240" w:lineRule="auto"/>
+        <w:jc w:val="center"/>
+        <w:keepNext w:val="0"/>
+        <w:keepLines/>
+        <w:widowControl w:val="1"/>
+      </w:pPr>
+      <w:r>
+        <w:rPr>
+          <w:b/>
+          <w:i/>
+        </w:rPr>
+        <w:t>Table 4.</w:t>
+      </w:r>
+      <w:r>
+        <w:rPr>
+          <w:b w:val="0"/>
+          <w:i/>
+        </w:rPr>
+        <w:t xml:space="preserve"> </w:t>
+      </w:r>
+      <w:r>
+        <w:rPr>
+          <w:b w:val="0"/>
+          <w:i/>
+        </w:rPr>
+        <w:t>Cross-dataset breadth on MIMII-DG (DCASE 2022 domain generalization), ROC-AUC. Conditioning on the operating attribute helps on both the source and the shifted target domain, for a continuous covariate (bearing rotation speed) and a discrete one (valve operation pattern).</w:t>
+      </w:r>
+    </w:p>
+    <w:tbl>
+      <w:tblPr>
+        <w:tblStyle w:val="Table"/>
+        <w:tblW w:type="pct" w:w="5000"/>
+        <w:jc w:val="center"/>
+        <w:tblLook w:firstRow="1" w:lastRow="0" w:firstColumn="0" w:lastColumn="0" w:noHBand="0" w:noVBand="0" w:val="0020"/>
+        <w:tblCaption w:val="Table 4. Cross-dataset breadth on MIMII-DG (DCASE 2022 domain generalization), ROC-AUC. Conditioning on the operating attribute helps on both the source and the shifted target domain, for a continuous covariate (bearing rotation speed) and a discrete one (valve operation pattern)."/>
+        <w:tblLayout w:type="autofit"/>
+        <w:tblBorders>
+          <w:top w:val="single" w:sz="10" w:color="4F6272"/>
+          <w:bottom w:val="single" w:sz="10" w:color="4F6272"/>
+          <w:insideH w:val="single" w:sz="5" w:color="9FB0C2"/>
+          <w:left w:val="single" w:sz="6" w:color="9FB0C2"/>
+          <w:right w:val="single" w:sz="6" w:color="9FB0C2"/>
+          <w:insideV w:val="single" w:sz="5" w:color="D9E1E8"/>
+        </w:tblBorders>
+      </w:tblPr>
+      <w:tblGrid>
+        <w:gridCol w:w="1980"/>
+        <w:gridCol w:w="1980"/>
+        <w:gridCol w:w="1980"/>
+        <w:gridCol w:w="1980"/>
+      </w:tblGrid>
+      <w:tr>
+        <w:trPr>
+          <w:tblHeader w:val="on"/>
+        </w:trPr>
+        <w:tc>
+          <w:tcPr>
+            <w:shd w:fill="EEF3F7"/>
+            <w:tcBorders>
+              <w:left w:val="nil"/>
+              <w:right w:val="nil"/>
+              <w:top w:val="nil"/>
+              <w:bottom w:val="single" w:sz="8" w:color="9FB0C2"/>
+            </w:tcBorders>
+            <w:vAlign w:val="center"/>
+          </w:tcPr>
+          <w:p>
+            <w:pPr>
+              <w:pStyle w:val="Compact"/>
+              <w:spacing w:before="0" w:after="20" w:line="240" w:lineRule="auto"/>
+              <w:jc w:val="center"/>
+              <w:suppressAutoHyphens/>
+              <w:keepNext w:val="0"/>
+              <w:keepLines/>
+              <w:widowControl w:val="1"/>
+            </w:pPr>
+            <w:r>
+              <w:rPr>
+                <w:rFonts w:ascii="Georgia" w:hAnsi="Georgia"/>
+                <w:b/>
+                <w:sz w:val="19"/>
+              </w:rPr>
+              <w:t xml:space="preserve">Machine (attribute)</w:t>
+            </w:r>
+          </w:p>
+        </w:tc>
+        <w:tc>
+          <w:tcPr>
+            <w:shd w:fill="EEF3F7"/>
+            <w:tcBorders>
+              <w:left w:val="nil"/>
+              <w:right w:val="nil"/>
+              <w:top w:val="nil"/>
+              <w:bottom w:val="single" w:sz="8" w:color="9FB0C2"/>
+            </w:tcBorders>
+            <w:vAlign w:val="center"/>
+          </w:tcPr>
+          <w:p>
+            <w:pPr>
+              <w:pStyle w:val="Compact"/>
+              <w:spacing w:before="0" w:after="20" w:line="240" w:lineRule="auto"/>
+              <w:jc w:val="center"/>
+              <w:suppressAutoHyphens/>
+              <w:keepNext w:val="0"/>
+              <w:keepLines/>
+              <w:widowControl w:val="1"/>
+            </w:pPr>
+            <w:r>
+              <w:rPr>
+                <w:rFonts w:ascii="Georgia" w:hAnsi="Georgia"/>
+                <w:b/>
+                <w:sz w:val="19"/>
+              </w:rPr>
+              <w:t xml:space="preserve">Domain</w:t>
+            </w:r>
+          </w:p>
+        </w:tc>
+        <w:tc>
+          <w:tcPr>
+            <w:shd w:fill="EEF3F7"/>
+            <w:tcBorders>
+              <w:left w:val="nil"/>
+              <w:right w:val="nil"/>
+              <w:top w:val="nil"/>
+              <w:bottom w:val="single" w:sz="8" w:color="9FB0C2"/>
+            </w:tcBorders>
+            <w:vAlign w:val="center"/>
+          </w:tcPr>
+          <w:p>
+            <w:pPr>
+              <w:pStyle w:val="Compact"/>
+              <w:spacing w:before="0" w:after="20" w:line="240" w:lineRule="auto"/>
+              <w:jc w:val="center"/>
+              <w:suppressAutoHyphens/>
+              <w:keepNext w:val="0"/>
+              <w:keepLines/>
+              <w:widowControl w:val="1"/>
+            </w:pPr>
+            <w:r>
+              <w:rPr>
+                <w:rFonts w:ascii="Georgia" w:hAnsi="Georgia"/>
+                <w:b/>
+                <w:sz w:val="19"/>
+              </w:rPr>
+              <w:t xml:space="preserve">Unconditional</w:t>
+            </w:r>
+          </w:p>
+        </w:tc>
+        <w:tc>
+          <w:tcPr>
+            <w:shd w:fill="EEF3F7"/>
+            <w:tcBorders>
+              <w:left w:val="nil"/>
+              <w:right w:val="nil"/>
+              <w:top w:val="nil"/>
+              <w:bottom w:val="single" w:sz="8" w:color="9FB0C2"/>
+            </w:tcBorders>
+            <w:vAlign w:val="center"/>
+          </w:tcPr>
+          <w:p>
+            <w:pPr>
+              <w:pStyle w:val="Compact"/>
+              <w:spacing w:before="0" w:after="20" w:line="240" w:lineRule="auto"/>
+              <w:jc w:val="center"/>
+              <w:suppressAutoHyphens/>
+              <w:keepNext w:val="0"/>
+              <w:keepLines/>
+              <w:widowControl w:val="1"/>
+            </w:pPr>
+            <w:r>
+              <w:rPr>
+                <w:rFonts w:ascii="Georgia" w:hAnsi="Georgia"/>
+                <w:b/>
+                <w:sz w:val="19"/>
+              </w:rPr>
+              <w:t xml:space="preserve">Conditioning</w:t>
+            </w:r>
+          </w:p>
+        </w:tc>
+      </w:tr>
+      <w:tr>
+        <w:tc>
+          <w:tcPr>
+            <w:tcBorders>
+              <w:left w:val="nil"/>
+              <w:right w:val="nil"/>
+              <w:top w:val="nil"/>
+              <w:bottom w:val="single" w:sz="4" w:color="D9E1E8"/>
+            </w:tcBorders>
+            <w:vAlign w:val="center"/>
+          </w:tcPr>
+          <w:p>
+            <w:pPr>
+              <w:pStyle w:val="Compact"/>
+              <w:spacing w:before="0" w:after="20" w:line="240" w:lineRule="auto"/>
+              <w:jc w:val="center"/>
+              <w:suppressAutoHyphens/>
+              <w:keepNext w:val="0"/>
+              <w:keepLines/>
+              <w:widowControl w:val="1"/>
+            </w:pPr>
+            <w:r>
+              <w:rPr>
+                <w:rFonts w:ascii="Georgia" w:hAnsi="Georgia"/>
+                <w:sz w:val="19"/>
+              </w:rPr>
+              <w:t xml:space="preserve">Bearing (rotation speed)</w:t>
+            </w:r>
+          </w:p>
+        </w:tc>
+        <w:tc>
+          <w:tcPr>
+            <w:tcBorders>
+              <w:left w:val="nil"/>
+              <w:right w:val="nil"/>
+              <w:top w:val="nil"/>
+              <w:bottom w:val="single" w:sz="4" w:color="D9E1E8"/>
+            </w:tcBorders>
+            <w:vAlign w:val="center"/>
+          </w:tcPr>
+          <w:p>
+            <w:pPr>
+              <w:pStyle w:val="Compact"/>
+              <w:spacing w:before="0" w:after="20" w:line="240" w:lineRule="auto"/>
+              <w:jc w:val="center"/>
+              <w:suppressAutoHyphens/>
+              <w:keepNext w:val="0"/>
+              <w:keepLines/>
+              <w:widowControl w:val="1"/>
+            </w:pPr>
+            <w:r>
+              <w:rPr>
+                <w:rFonts w:ascii="Georgia" w:hAnsi="Georgia"/>
+                <w:sz w:val="19"/>
+              </w:rPr>
+              <w:t xml:space="preserve">source</w:t>
+            </w:r>
+          </w:p>
+        </w:tc>
+        <w:tc>
+          <w:tcPr>
+            <w:tcBorders>
+              <w:left w:val="nil"/>
+              <w:right w:val="nil"/>
+              <w:top w:val="nil"/>
+              <w:bottom w:val="single" w:sz="4" w:color="D9E1E8"/>
+            </w:tcBorders>
+            <w:vAlign w:val="center"/>
+          </w:tcPr>
+          <w:p>
+            <w:pPr>
+              <w:pStyle w:val="Compact"/>
+              <w:spacing w:before="0" w:after="20" w:line="240" w:lineRule="auto"/>
+              <w:jc w:val="center"/>
+              <w:suppressAutoHyphens/>
+              <w:keepNext w:val="0"/>
+              <w:keepLines/>
+              <w:widowControl w:val="1"/>
+            </w:pPr>
+            <w:r>
+              <w:rPr>
+                <w:rFonts w:ascii="Georgia" w:hAnsi="Georgia"/>
+                <w:sz w:val="19"/>
+              </w:rPr>
+              <w:t xml:space="preserve">0.609</w:t>
+            </w:r>
+          </w:p>
+        </w:tc>
+        <w:tc>
+          <w:tcPr>
+            <w:tcBorders>
+              <w:left w:val="nil"/>
+              <w:right w:val="nil"/>
+              <w:top w:val="nil"/>
+              <w:bottom w:val="single" w:sz="4" w:color="D9E1E8"/>
+            </w:tcBorders>
+            <w:vAlign w:val="center"/>
+          </w:tcPr>
+          <w:p>
+            <w:pPr>
+              <w:pStyle w:val="Compact"/>
+              <w:spacing w:before="0" w:after="20" w:line="240" w:lineRule="auto"/>
+              <w:jc w:val="center"/>
+              <w:suppressAutoHyphens/>
+              <w:keepNext w:val="0"/>
+              <w:keepLines/>
+              <w:widowControl w:val="1"/>
+            </w:pPr>
+            <w:r>
+              <w:rPr>
+                <w:rFonts w:ascii="Georgia" w:hAnsi="Georgia"/>
+                <w:sz w:val="19"/>
+              </w:rPr>
+              <w:t xml:space="preserve">0.649</w:t>
+            </w:r>
+          </w:p>
+        </w:tc>
+      </w:tr>
+      <w:tr>
+        <w:tc>
+          <w:tcPr>
+            <w:tcBorders>
+              <w:left w:val="nil"/>
+              <w:right w:val="nil"/>
+              <w:top w:val="nil"/>
+              <w:bottom w:val="single" w:sz="4" w:color="D9E1E8"/>
+            </w:tcBorders>
+            <w:vAlign w:val="center"/>
+          </w:tcPr>
+          <w:p>
+            <w:pPr>
+              <w:pStyle w:val="Compact"/>
+              <w:spacing w:before="0" w:after="20" w:line="240" w:lineRule="auto"/>
+              <w:jc w:val="center"/>
+              <w:suppressAutoHyphens/>
+              <w:keepNext w:val="0"/>
+              <w:keepLines/>
+              <w:widowControl w:val="1"/>
+            </w:pPr>
+            <w:r>
+              <w:rPr>
+                <w:rFonts w:ascii="Georgia" w:hAnsi="Georgia"/>
+                <w:sz w:val="19"/>
+              </w:rPr>
+              <w:t xml:space="preserve">Bearing (rotation speed)</w:t>
+            </w:r>
+          </w:p>
+        </w:tc>
+        <w:tc>
+          <w:tcPr>
+            <w:tcBorders>
+              <w:left w:val="nil"/>
+              <w:right w:val="nil"/>
+              <w:top w:val="nil"/>
+              <w:bottom w:val="single" w:sz="4" w:color="D9E1E8"/>
+            </w:tcBorders>
+            <w:vAlign w:val="center"/>
+          </w:tcPr>
+          <w:p>
+            <w:pPr>
+              <w:pStyle w:val="Compact"/>
+              <w:spacing w:before="0" w:after="20" w:line="240" w:lineRule="auto"/>
+              <w:jc w:val="center"/>
+              <w:suppressAutoHyphens/>
+              <w:keepNext w:val="0"/>
+              <w:keepLines/>
+              <w:widowControl w:val="1"/>
+            </w:pPr>
+            <w:r>
+              <w:rPr>
+                <w:rFonts w:ascii="Georgia" w:hAnsi="Georgia"/>
+                <w:sz w:val="19"/>
+              </w:rPr>
+              <w:t xml:space="preserve">target</w:t>
+            </w:r>
+          </w:p>
+        </w:tc>
+        <w:tc>
+          <w:tcPr>
+            <w:tcBorders>
+              <w:left w:val="nil"/>
+              <w:right w:val="nil"/>
+              <w:top w:val="nil"/>
+              <w:bottom w:val="single" w:sz="4" w:color="D9E1E8"/>
+            </w:tcBorders>
+            <w:vAlign w:val="center"/>
+          </w:tcPr>
+          <w:p>
+            <w:pPr>
+              <w:pStyle w:val="Compact"/>
+              <w:spacing w:before="0" w:after="20" w:line="240" w:lineRule="auto"/>
+              <w:jc w:val="center"/>
+              <w:suppressAutoHyphens/>
+              <w:keepNext w:val="0"/>
+              <w:keepLines/>
+              <w:widowControl w:val="1"/>
+            </w:pPr>
+            <w:r>
+              <w:rPr>
+                <w:rFonts w:ascii="Georgia" w:hAnsi="Georgia"/>
+                <w:sz w:val="19"/>
+              </w:rPr>
+              <w:t xml:space="preserve">0.623</w:t>
+            </w:r>
+          </w:p>
+        </w:tc>
+        <w:tc>
+          <w:tcPr>
+            <w:tcBorders>
+              <w:left w:val="nil"/>
+              <w:right w:val="nil"/>
+              <w:top w:val="nil"/>
+              <w:bottom w:val="single" w:sz="4" w:color="D9E1E8"/>
+            </w:tcBorders>
+            <w:vAlign w:val="center"/>
+          </w:tcPr>
+          <w:p>
+            <w:pPr>
+              <w:pStyle w:val="Compact"/>
+              <w:spacing w:before="0" w:after="20" w:line="240" w:lineRule="auto"/>
+              <w:jc w:val="center"/>
+              <w:suppressAutoHyphens/>
+              <w:keepNext w:val="0"/>
+              <w:keepLines/>
+              <w:widowControl w:val="1"/>
+            </w:pPr>
+            <w:r>
+              <w:rPr>
+                <w:rFonts w:ascii="Georgia" w:hAnsi="Georgia"/>
+                <w:sz w:val="19"/>
+              </w:rPr>
+              <w:t xml:space="preserve">0.645</w:t>
+            </w:r>
+          </w:p>
+        </w:tc>
+      </w:tr>
+      <w:tr>
+        <w:tc>
+          <w:tcPr>
+            <w:tcBorders>
+              <w:left w:val="nil"/>
+              <w:right w:val="nil"/>
+              <w:top w:val="nil"/>
+              <w:bottom w:val="single" w:sz="4" w:color="D9E1E8"/>
+            </w:tcBorders>
+            <w:vAlign w:val="center"/>
+          </w:tcPr>
+          <w:p>
+            <w:pPr>
+              <w:pStyle w:val="Compact"/>
+              <w:spacing w:before="0" w:after="20" w:line="240" w:lineRule="auto"/>
+              <w:jc w:val="center"/>
+              <w:suppressAutoHyphens/>
+              <w:keepNext w:val="0"/>
+              <w:keepLines/>
+              <w:widowControl w:val="1"/>
+            </w:pPr>
+            <w:r>
+              <w:rPr>
+                <w:rFonts w:ascii="Georgia" w:hAnsi="Georgia"/>
+                <w:sz w:val="19"/>
+              </w:rPr>
+              <w:t xml:space="preserve">Valve (operation pattern)</w:t>
+            </w:r>
+          </w:p>
+        </w:tc>
+        <w:tc>
+          <w:tcPr>
+            <w:tcBorders>
+              <w:left w:val="nil"/>
+              <w:right w:val="nil"/>
+              <w:top w:val="nil"/>
+              <w:bottom w:val="single" w:sz="4" w:color="D9E1E8"/>
+            </w:tcBorders>
+            <w:vAlign w:val="center"/>
+          </w:tcPr>
+          <w:p>
+            <w:pPr>
+              <w:pStyle w:val="Compact"/>
+              <w:spacing w:before="0" w:after="20" w:line="240" w:lineRule="auto"/>
+              <w:jc w:val="center"/>
+              <w:suppressAutoHyphens/>
+              <w:keepNext w:val="0"/>
+              <w:keepLines/>
+              <w:widowControl w:val="1"/>
+            </w:pPr>
+            <w:r>
+              <w:rPr>
+                <w:rFonts w:ascii="Georgia" w:hAnsi="Georgia"/>
+                <w:sz w:val="19"/>
+              </w:rPr>
+              <w:t xml:space="preserve">source</w:t>
+            </w:r>
+          </w:p>
+        </w:tc>
+        <w:tc>
+          <w:tcPr>
+            <w:tcBorders>
+              <w:left w:val="nil"/>
+              <w:right w:val="nil"/>
+              <w:top w:val="nil"/>
+              <w:bottom w:val="single" w:sz="4" w:color="D9E1E8"/>
+            </w:tcBorders>
+            <w:vAlign w:val="center"/>
+          </w:tcPr>
+          <w:p>
+            <w:pPr>
+              <w:pStyle w:val="Compact"/>
+              <w:spacing w:before="0" w:after="20" w:line="240" w:lineRule="auto"/>
+              <w:jc w:val="center"/>
+              <w:suppressAutoHyphens/>
+              <w:keepNext w:val="0"/>
+              <w:keepLines/>
+              <w:widowControl w:val="1"/>
+            </w:pPr>
+            <w:r>
+              <w:rPr>
+                <w:rFonts w:ascii="Georgia" w:hAnsi="Georgia"/>
+                <w:sz w:val="19"/>
+              </w:rPr>
+              <w:t xml:space="preserve">0.690</w:t>
+            </w:r>
+          </w:p>
+        </w:tc>
+        <w:tc>
+          <w:tcPr>
+            <w:tcBorders>
+              <w:left w:val="nil"/>
+              <w:right w:val="nil"/>
+              <w:top w:val="nil"/>
+              <w:bottom w:val="single" w:sz="4" w:color="D9E1E8"/>
+            </w:tcBorders>
+            <w:vAlign w:val="center"/>
+          </w:tcPr>
+          <w:p>
+            <w:pPr>
+              <w:pStyle w:val="Compact"/>
+              <w:spacing w:before="0" w:after="20" w:line="240" w:lineRule="auto"/>
+              <w:jc w:val="center"/>
+              <w:suppressAutoHyphens/>
+              <w:keepNext w:val="0"/>
+              <w:keepLines/>
+              <w:widowControl w:val="1"/>
+            </w:pPr>
+            <w:r>
+              <w:rPr>
+                <w:rFonts w:ascii="Georgia" w:hAnsi="Georgia"/>
+                <w:sz w:val="19"/>
+              </w:rPr>
+              <w:t xml:space="preserve">0.734</w:t>
+            </w:r>
+          </w:p>
+        </w:tc>
+      </w:tr>
+      <w:tr>
+        <w:tc>
+          <w:tcPr>
+            <w:tcBorders>
+              <w:left w:val="nil"/>
+              <w:right w:val="nil"/>
+              <w:top w:val="nil"/>
+              <w:bottom w:val="nil"/>
+            </w:tcBorders>
+            <w:vAlign w:val="center"/>
+          </w:tcPr>
+          <w:p>
+            <w:pPr>
+              <w:pStyle w:val="Compact"/>
+              <w:spacing w:before="0" w:after="20" w:line="240" w:lineRule="auto"/>
+              <w:jc w:val="center"/>
+              <w:suppressAutoHyphens/>
+              <w:keepNext w:val="0"/>
+              <w:keepLines/>
+              <w:widowControl w:val="1"/>
+            </w:pPr>
+            <w:r>
+              <w:rPr>
+                <w:rFonts w:ascii="Georgia" w:hAnsi="Georgia"/>
+                <w:sz w:val="19"/>
+              </w:rPr>
+              <w:t xml:space="preserve">Valve (operation pattern)</w:t>
+            </w:r>
+          </w:p>
+        </w:tc>
+        <w:tc>
+          <w:tcPr>
+            <w:tcBorders>
+              <w:left w:val="nil"/>
+              <w:right w:val="nil"/>
+              <w:top w:val="nil"/>
+              <w:bottom w:val="nil"/>
+            </w:tcBorders>
+            <w:vAlign w:val="center"/>
+          </w:tcPr>
+          <w:p>
+            <w:pPr>
+              <w:pStyle w:val="Compact"/>
+              <w:spacing w:before="0" w:after="20" w:line="240" w:lineRule="auto"/>
+              <w:jc w:val="center"/>
+              <w:suppressAutoHyphens/>
+              <w:keepNext w:val="0"/>
+              <w:keepLines/>
+              <w:widowControl w:val="1"/>
+            </w:pPr>
+            <w:r>
+              <w:rPr>
+                <w:rFonts w:ascii="Georgia" w:hAnsi="Georgia"/>
+                <w:sz w:val="19"/>
+              </w:rPr>
+              <w:t xml:space="preserve">target</w:t>
+            </w:r>
+          </w:p>
+        </w:tc>
+        <w:tc>
+          <w:tcPr>
+            <w:tcBorders>
+              <w:left w:val="nil"/>
+              <w:right w:val="nil"/>
+              <w:top w:val="nil"/>
+              <w:bottom w:val="nil"/>
+            </w:tcBorders>
+            <w:vAlign w:val="center"/>
+          </w:tcPr>
+          <w:p>
+            <w:pPr>
+              <w:pStyle w:val="Compact"/>
+              <w:spacing w:before="0" w:after="20" w:line="240" w:lineRule="auto"/>
+              <w:jc w:val="center"/>
+              <w:suppressAutoHyphens/>
+              <w:keepNext w:val="0"/>
+              <w:keepLines/>
+              <w:widowControl w:val="1"/>
+            </w:pPr>
+            <w:r>
+              <w:rPr>
+                <w:rFonts w:ascii="Georgia" w:hAnsi="Georgia"/>
+                <w:sz w:val="19"/>
+              </w:rPr>
+              <w:t xml:space="preserve">0.376</w:t>
+            </w:r>
+          </w:p>
+        </w:tc>
+        <w:tc>
+          <w:tcPr>
+            <w:tcBorders>
+              <w:left w:val="nil"/>
+              <w:right w:val="nil"/>
+              <w:top w:val="nil"/>
+              <w:bottom w:val="nil"/>
+            </w:tcBorders>
+            <w:vAlign w:val="center"/>
+          </w:tcPr>
+          <w:p>
+            <w:pPr>
+              <w:pStyle w:val="Compact"/>
+              <w:spacing w:before="0" w:after="20" w:line="240" w:lineRule="auto"/>
+              <w:jc w:val="center"/>
+              <w:suppressAutoHyphens/>
+              <w:keepNext w:val="0"/>
+              <w:keepLines/>
+              <w:widowControl w:val="1"/>
+            </w:pPr>
+            <w:r>
+              <w:rPr>
+                <w:rFonts w:ascii="Georgia" w:hAnsi="Georgia"/>
+                <w:sz w:val="19"/>
+              </w:rPr>
+              <w:t xml:space="preserve">0.632</w:t>
+            </w:r>
+          </w:p>
+        </w:tc>
+      </w:tr>
+    </w:tbl>
     <w:bookmarkEnd w:id="17"/>
     <w:bookmarkStart w:id="18" w:name="discussion-and-limitations"/>
     <w:p>
@@ -4221,43 +4911,43 @@
         <w:t xml:space="preserve"> </w:t>
       </w:r>
       <w:r>
-        <w:t xml:space="preserve">scalar (rotation speed) with a reliable tachometer. Extending the conditioning to additional continuous</w:t>
-      </w:r>
-      <w:r>
-        <w:t xml:space="preserve"> </w:t>
-      </w:r>
-      <w:r>
-        <w:t xml:space="preserve">covariates (load, temperature) and to settings where the covariate is noisier or must be estimated from</w:t>
-      </w:r>
-      <w:r>
-        <w:t xml:space="preserve"> </w:t>
-      </w:r>
-      <w:r>
-        <w:t xml:space="preserve">the signal is future work, as is a comparison against discrete-domain conditioning on the DCASE</w:t>
-      </w:r>
-      <w:r>
-        <w:t xml:space="preserve"> </w:t>
-      </w:r>
-      <w:r>
-        <w:t xml:space="preserve">domain-generalization benchmarks, where no continuous tachometer covariate is provided. The conditional</w:t>
-      </w:r>
-      <w:r>
-        <w:t xml:space="preserve"> </w:t>
-      </w:r>
-      <w:r>
-        <w:t xml:space="preserve">mean estimator here is intentionally simple; richer conditional density models are a natural extension.</w:t>
-      </w:r>
-      <w:r>
-        <w:t xml:space="preserve"> </w:t>
-      </w:r>
-      <w:r>
-        <w:t xml:space="preserve">These are directions for broadening the result, not caveats on it: within the studied setting the effect</w:t>
-      </w:r>
-      <w:r>
-        <w:t xml:space="preserve"> </w:t>
-      </w:r>
-      <w:r>
-        <w:t xml:space="preserve">is consistent across fault types, backbones, channels, and a causal control.</w:t>
+        <w:t xml:space="preserve">scalar (rotation speed) with a reliable tachometer, with the MIMII-DG results extending it to an acoustic</w:t>
+      </w:r>
+      <w:r>
+        <w:t xml:space="preserve"> </w:t>
+      </w:r>
+      <w:r>
+        <w:t xml:space="preserve">benchmark and a discrete covariate. Extending the conditioning to additional continuous covariates (load,</w:t>
+      </w:r>
+      <w:r>
+        <w:t xml:space="preserve"> </w:t>
+      </w:r>
+      <w:r>
+        <w:t xml:space="preserve">temperature) and to settings where the covariate is noisier or must be estimated from the signal is future</w:t>
+      </w:r>
+      <w:r>
+        <w:t xml:space="preserve"> </w:t>
+      </w:r>
+      <w:r>
+        <w:t xml:space="preserve">work. The conditional mean estimator here is intentionally simple; richer conditional density models are a</w:t>
+      </w:r>
+      <w:r>
+        <w:t xml:space="preserve"> </w:t>
+      </w:r>
+      <w:r>
+        <w:t xml:space="preserve">natural extension. These are directions for broadening the result, not caveats on it: within the studied</w:t>
+      </w:r>
+      <w:r>
+        <w:t xml:space="preserve"> </w:t>
+      </w:r>
+      <w:r>
+        <w:t xml:space="preserve">setting the effect is consistent across fault types, backbones, channels, a second dataset, and a causal</w:t>
+      </w:r>
+      <w:r>
+        <w:t xml:space="preserve"> </w:t>
+      </w:r>
+      <w:r>
+        <w:t xml:space="preserve">control.</w:t>
       </w:r>
     </w:p>
     <w:bookmarkEnd w:id="18"/>
@@ -4550,6 +5240,39 @@
           <w:sz w:val="20"/>
         </w:rPr>
         <w:t xml:space="preserve">9. </w:t>
+      </w:r>
+      <w:r>
+        <w:t xml:space="preserve">[9] W. Wang, H. Wang, X. Cai, M. Xie. Order-adaptive subspace scale learning for</w:t>
+      </w:r>
+      <w:r>
+        <w:t xml:space="preserve"> </w:t>
+      </w:r>
+      <w:r>
+        <w:t xml:space="preserve">unsupervised anomaly detection under time-varying rotational speed conditions. Mechanical Systems and</w:t>
+      </w:r>
+      <w:r>
+        <w:t xml:space="preserve"> </w:t>
+      </w:r>
+      <w:r>
+        <w:t xml:space="preserve">Signal Processing, 248:114001, 2026.</w:t>
+      </w:r>
+    </w:p>
+    <w:p>
+      <w:pPr>
+        <w:pStyle w:val="ReferenceEntry"/>
+        <w:spacing w:after="100"/>
+        <w:ind w:left="475" w:hanging="475"/>
+        <w:jc w:val="left"/>
+        <w:keepNext w:val="0"/>
+        <w:keepLines w:val="0"/>
+        <w:widowControl w:val="1"/>
+      </w:pPr>
+      <w:r>
+        <w:rPr>
+          <w:rFonts w:ascii="Georgia" w:hAnsi="Georgia"/>
+          <w:sz w:val="20"/>
+        </w:rPr>
+        <w:t xml:space="preserve">10. </w:t>
       </w:r>
       <w:r>
         <w:t xml:space="preserve">Draft · results reproducible from the EngineKnock experiment registry (EXP-005–008).</w:t>

</xml_diff>

<commit_message>
Full-paper expansion (writing+figures): method w/ equations, ablations, stats
- New Problem-formulation and formal Method sections (53 native equations, algorithm box, complexity)
- Consolidated single-artifact numbers with bootstrap CIs, pAUC, Wilcoxon significance
- Ablations: k-sensitivity + continuous-vs-discrete-bin (Fig 2, Table 4) substantiating the novelty
- Scope/failure analysis: conditioning interpolates, does not extrapolate; aggregation note
- Novelty claim narrowed (Song et al. 2007), editorial prose fixed, data/code statement added
- DOCX + PDF rebuilt (9 pp, 5 tables, 2 figures)

Co-Authored-By: Claude Opus 4.8 <noreply@anthropic.com>
</commit_message>
<xml_diff>
--- a/docs/EngineKnock_speed_conditional.docx
+++ b/docs/EngineKnock_speed_conditional.docx
@@ -2,7 +2,7 @@
 <file path=word/document.xml><?xml version="1.0" encoding="utf-8"?>
 <w:document xmlns:w="http://schemas.openxmlformats.org/wordprocessingml/2006/main" xmlns:m="http://schemas.openxmlformats.org/officeDocument/2006/math" xmlns:r="http://schemas.openxmlformats.org/officeDocument/2006/relationships" xmlns:o="urn:schemas-microsoft-com:office:office" xmlns:v="urn:schemas-microsoft-com:vml" xmlns:w10="urn:schemas-microsoft-com:office:word" xmlns:a="http://schemas.openxmlformats.org/drawingml/2006/main" xmlns:pic="http://schemas.openxmlformats.org/drawingml/2006/picture" xmlns:wp="http://schemas.openxmlformats.org/drawingml/2006/wordprocessingDrawing">
   <w:body>
-    <w:bookmarkStart w:id="21" w:name="X240ac4f9193a8f0b19f5a6920322057aa9ce7f5"/>
+    <w:bookmarkStart w:id="25" w:name="X240ac4f9193a8f0b19f5a6920322057aa9ce7f5"/>
     <w:p>
       <w:pPr>
         <w:pStyle w:val="Title"/>
@@ -131,7 +131,7 @@
         <w:t xml:space="preserve"> </w:t>
       </w:r>
       <w:r>
-        <w:t xml:space="preserve">pooled ROC-AUC from 0.955 to 0.989 at matched speed and from 0.897 to 0.937 on held-out speeds,</w:t>
+        <w:t xml:space="preserve">pooled ROC-AUC from 0.956 to 0.989 at matched speed and from 0.897 to 0.937 on held-out speeds,</w:t>
       </w:r>
       <w:r>
         <w:t xml:space="preserve"> </w:t>
@@ -198,7 +198,7 @@
         <w:t xml:space="preserve"> </w:t>
       </w:r>
       <w:r>
-        <w:t xml:space="preserve">machinery. In deployment the honest formulation is unsupervised: a detector is trained only on</w:t>
+        <w:t xml:space="preserve">machinery. In deployment the operative formulation is unsupervised: a detector is trained only on</w:t>
       </w:r>
       <w:r>
         <w:t xml:space="preserve"> </w:t>
@@ -394,7 +394,7 @@
         <w:t xml:space="preserve"> </w:t>
       </w:r>
       <w:r>
-        <w:t xml:space="preserve">model on the operating covariate itself. Rotating machinery is almost always instrumented with a</w:t>
+        <w:t xml:space="preserve">model on the operating covariate itself. Rotating machinery is commonly instrumented with a</w:t>
       </w:r>
       <w:r>
         <w:t xml:space="preserve"> </w:t>
@@ -733,19 +733,31 @@
         <w:t xml:space="preserve"> </w:t>
       </w:r>
       <w:r>
-        <w:t xml:space="preserve">Conditioning a normal model on an auxiliary variable appears in conditional normalizing-flow</w:t>
-      </w:r>
-      <w:r>
-        <w:t xml:space="preserve"> </w:t>
-      </w:r>
-      <w:r>
-        <w:t xml:space="preserve">detectors that condition on spatial position and in autoencoders conditioned on a discrete machine</w:t>
-      </w:r>
-      <w:r>
-        <w:t xml:space="preserve"> </w:t>
-      </w:r>
-      <w:r>
-        <w:t xml:space="preserve">identity. To our knowledge, conditioning a normal-only detector on a</w:t>
+        <w:t xml:space="preserve">Conditioning a normal model on an auxiliary variable is an established idea: conditional (or</w:t>
+      </w:r>
+      <w:r>
+        <w:t xml:space="preserve"> </w:t>
+      </w:r>
+      <w:r>
+        <w:t xml:space="preserve">contextual) anomaly detection dates to Song et al. [10], and recent detectors condition</w:t>
+      </w:r>
+      <w:r>
+        <w:t xml:space="preserve"> </w:t>
+      </w:r>
+      <w:r>
+        <w:t xml:space="preserve">normalizing flows on spatial position [7] or autoencoders on a discrete machine identity [8].</w:t>
+      </w:r>
+      <w:r>
+        <w:t xml:space="preserve"> </w:t>
+      </w:r>
+      <w:r>
+        <w:t xml:space="preserve">What is specific here, and what we have not found addressed, is conditioning a normal-only</w:t>
+      </w:r>
+      <w:r>
+        <w:t xml:space="preserve"> </w:t>
+      </w:r>
+      <w:r>
+        <w:t xml:space="preserve">machine-fault detector on the</w:t>
       </w:r>
       <w:r>
         <w:t xml:space="preserve"> </w:t>
@@ -755,37 +767,41 @@
           <w:i/>
           <w:iCs/>
         </w:rPr>
-        <w:t xml:space="preserve">measured continuous physical</w:t>
-      </w:r>
-      <w:r>
-        <w:rPr>
-          <w:i/>
-          <w:iCs/>
-        </w:rPr>
-        <w:t xml:space="preserve"> </w:t>
-      </w:r>
-      <w:r>
-        <w:rPr>
-          <w:i/>
-          <w:iCs/>
-        </w:rPr>
-        <w:t xml:space="preserve">operating covariate</w:t>
-      </w:r>
-      <w:r>
-        <w:t xml:space="preserve"> </w:t>
-      </w:r>
-      <w:r>
-        <w:t xml:space="preserve">such as tachometer speed, and evaluating it under operating-speed shift, has</w:t>
-      </w:r>
-      <w:r>
-        <w:t xml:space="preserve"> </w:t>
-      </w:r>
-      <w:r>
-        <w:t xml:space="preserve">not been studied; that is the gap this paper addresses.</w:t>
+        <w:t xml:space="preserve">measured continuous rotation speed</w:t>
+      </w:r>
+      <w:r>
+        <w:t xml:space="preserve"> </w:t>
+      </w:r>
+      <w:r>
+        <w:t xml:space="preserve">from a tachometer and</w:t>
+      </w:r>
+      <w:r>
+        <w:t xml:space="preserve"> </w:t>
+      </w:r>
+      <w:r>
+        <w:t xml:space="preserve">evaluating it under operating-speed shift with a direct head-to-head against order-tracking invariance.</w:t>
+      </w:r>
+      <w:r>
+        <w:t xml:space="preserve"> </w:t>
+      </w:r>
+      <w:r>
+        <w:t xml:space="preserve">Our discrete-bin ablation makes the distinction concrete: conditioning on the continuous covariate</w:t>
+      </w:r>
+      <w:r>
+        <w:t xml:space="preserve"> </w:t>
+      </w:r>
+      <w:r>
+        <w:t xml:space="preserve">beats conditioning on a binned (discrete) version of it, which is the form the closest prior work</w:t>
+      </w:r>
+      <w:r>
+        <w:t xml:space="preserve"> </w:t>
+      </w:r>
+      <w:r>
+        <w:t xml:space="preserve">takes.</w:t>
       </w:r>
     </w:p>
     <w:bookmarkEnd w:id="11"/>
-    <w:bookmarkStart w:id="12" w:name="method"/>
+    <w:bookmarkStart w:id="12" w:name="problem-formulation"/>
     <w:p>
       <w:pPr>
         <w:pStyle w:val="Heading2"/>
@@ -794,7 +810,7 @@
         <w:widowControl w:val="1"/>
       </w:pPr>
       <w:r>
-        <w:t xml:space="preserve">3  Method</w:t>
+        <w:t xml:space="preserve">3  Problem formulation</w:t>
       </w:r>
     </w:p>
     <w:p>
@@ -806,65 +822,747 @@
         <w:widowControl w:val="1"/>
       </w:pPr>
       <w:r>
+        <w:t xml:space="preserve">We are given a training set of healthy windows</w:t>
+      </w:r>
+      <w:r>
+        <w:t xml:space="preserve"> </w:t>
+      </w:r>
+      <m:oMath>
+        <m:r>
+          <m:rPr>
+            <m:sty m:val="p"/>
+          </m:rPr>
+          <m:t>{</m:t>
+        </m:r>
+        <m:r>
+          <m:rPr>
+            <m:sty m:val="p"/>
+          </m:rPr>
+          <m:t>(</m:t>
+        </m:r>
+        <m:sSub>
+          <m:e>
+            <m:r>
+              <m:t>x</m:t>
+            </m:r>
+          </m:e>
+          <m:sub>
+            <m:r>
+              <m:t>i</m:t>
+            </m:r>
+          </m:sub>
+        </m:sSub>
+        <m:r>
+          <m:rPr>
+            <m:sty m:val="p"/>
+          </m:rPr>
+          <m:t>,</m:t>
+        </m:r>
+        <m:sSub>
+          <m:e>
+            <m:r>
+              <m:t>s</m:t>
+            </m:r>
+          </m:e>
+          <m:sub>
+            <m:r>
+              <m:t>i</m:t>
+            </m:r>
+          </m:sub>
+        </m:sSub>
+        <m:r>
+          <m:rPr>
+            <m:sty m:val="p"/>
+          </m:rPr>
+          <m:t>)</m:t>
+        </m:r>
+        <m:sSubSup>
+          <m:e>
+            <m:r>
+              <m:rPr>
+                <m:sty m:val="p"/>
+              </m:rPr>
+              <m:t>}</m:t>
+            </m:r>
+          </m:e>
+          <m:sub>
+            <m:r>
+              <m:t>i</m:t>
+            </m:r>
+            <m:r>
+              <m:rPr>
+                <m:sty m:val="p"/>
+              </m:rPr>
+              <m:t>=</m:t>
+            </m:r>
+            <m:r>
+              <m:t>1</m:t>
+            </m:r>
+          </m:sub>
+          <m:sup>
+            <m:r>
+              <m:t>n</m:t>
+            </m:r>
+          </m:sup>
+        </m:sSubSup>
+      </m:oMath>
+      <w:r>
+        <w:t xml:space="preserve">, where $x_i \in</w:t>
+      </w:r>
+      <w:r>
+        <w:t xml:space="preserve"> </w:t>
+      </w:r>
+      <w:r>
+        <w:t xml:space="preserve">\mathbb{R}^d</w:t>
+      </w:r>
+      <m:oMath>
+        <m:r>
+          <m:t>i</m:t>
+        </m:r>
+        <m:r>
+          <m:t>s</m:t>
+        </m:r>
+        <m:r>
+          <m:t>a</m:t>
+        </m:r>
+        <m:r>
+          <m:t>f</m:t>
+        </m:r>
+        <m:r>
+          <m:t>e</m:t>
+        </m:r>
+        <m:r>
+          <m:t>a</m:t>
+        </m:r>
+        <m:r>
+          <m:t>t</m:t>
+        </m:r>
+        <m:r>
+          <m:t>u</m:t>
+        </m:r>
+        <m:r>
+          <m:t>r</m:t>
+        </m:r>
+        <m:r>
+          <m:t>e</m:t>
+        </m:r>
+        <m:r>
+          <m:t>v</m:t>
+        </m:r>
+        <m:r>
+          <m:t>e</m:t>
+        </m:r>
+        <m:r>
+          <m:t>c</m:t>
+        </m:r>
+        <m:r>
+          <m:t>t</m:t>
+        </m:r>
+        <m:r>
+          <m:t>o</m:t>
+        </m:r>
+        <m:r>
+          <m:t>r</m:t>
+        </m:r>
+        <m:r>
+          <m:t>a</m:t>
+        </m:r>
+        <m:r>
+          <m:t>n</m:t>
+        </m:r>
+        <m:r>
+          <m:t>d</m:t>
+        </m:r>
+      </m:oMath>
+      <w:r>
+        <w:t xml:space="preserve">s_i \in \mathbb{R}$ is the measured operating covariate, here the</w:t>
+      </w:r>
+      <w:r>
+        <w:t xml:space="preserve"> </w:t>
+      </w:r>
+      <w:r>
+        <w:t xml:space="preserve">rotation speed from a tachometer. Training contains no fault examples. At test time, given a window</w:t>
+      </w:r>
+      <w:r>
+        <w:t xml:space="preserve"> </w:t>
+      </w:r>
+      <m:oMath>
+        <m:r>
+          <m:rPr>
+            <m:sty m:val="p"/>
+          </m:rPr>
+          <m:t>(</m:t>
+        </m:r>
+        <m:r>
+          <m:t>x</m:t>
+        </m:r>
+        <m:r>
+          <m:rPr>
+            <m:sty m:val="p"/>
+          </m:rPr>
+          <m:t>,</m:t>
+        </m:r>
+        <m:r>
+          <m:t>s</m:t>
+        </m:r>
+        <m:r>
+          <m:rPr>
+            <m:sty m:val="p"/>
+          </m:rPr>
+          <m:t>)</m:t>
+        </m:r>
+      </m:oMath>
+      <w:r>
+        <w:t xml:space="preserve">, a detector outputs an anomaly score</w:t>
+      </w:r>
+      <w:r>
+        <w:t xml:space="preserve"> </w:t>
+      </w:r>
+      <m:oMath>
+        <m:r>
+          <m:t>A</m:t>
+        </m:r>
+        <m:r>
+          <m:rPr>
+            <m:sty m:val="p"/>
+          </m:rPr>
+          <m:t>(</m:t>
+        </m:r>
+        <m:r>
+          <m:t>x</m:t>
+        </m:r>
+        <m:r>
+          <m:rPr>
+            <m:sty m:val="p"/>
+          </m:rPr>
+          <m:t>,</m:t>
+        </m:r>
+        <m:r>
+          <m:t>s</m:t>
+        </m:r>
+        <m:r>
+          <m:rPr>
+            <m:sty m:val="p"/>
+          </m:rPr>
+          <m:t>)</m:t>
+        </m:r>
+      </m:oMath>
+      <w:r>
+        <w:t xml:space="preserve"> </w:t>
+      </w:r>
+      <w:r>
+        <w:t xml:space="preserve">that should be larger for faults than for</w:t>
+      </w:r>
+      <w:r>
+        <w:t xml:space="preserve"> </w:t>
+      </w:r>
+      <w:r>
+        <w:t xml:space="preserve">healthy windows. The difficulty is operating-condition shift: the healthy conditional</w:t>
+      </w:r>
+      <w:r>
+        <w:t xml:space="preserve"> </w:t>
+      </w:r>
+      <m:oMath>
+        <m:r>
+          <m:t>p</m:t>
+        </m:r>
+        <m:r>
+          <m:rPr>
+            <m:sty m:val="p"/>
+          </m:rPr>
+          <m:t>(</m:t>
+        </m:r>
+        <m:r>
+          <m:t>x</m:t>
+        </m:r>
+        <m:r>
+          <m:rPr>
+            <m:sty m:val="p"/>
+          </m:rPr>
+          <m:t>∣</m:t>
+        </m:r>
+        <m:r>
+          <m:t>s</m:t>
+        </m:r>
+        <m:r>
+          <m:rPr>
+            <m:sty m:val="p"/>
+          </m:rPr>
+          <m:t>)</m:t>
+        </m:r>
+      </m:oMath>
+      <w:r>
+        <w:t xml:space="preserve"> </w:t>
+      </w:r>
+      <w:r>
+        <w:t xml:space="preserve">varies strongly with</w:t>
+      </w:r>
+      <w:r>
+        <w:t xml:space="preserve"> </w:t>
+      </w:r>
+      <m:oMath>
+        <m:r>
+          <m:t>s</m:t>
+        </m:r>
+      </m:oMath>
+      <w:r>
+        <w:t xml:space="preserve">, so a fault at one speed can resemble a healthy window at another. Three model</w:t>
+      </w:r>
+      <w:r>
+        <w:t xml:space="preserve"> </w:t>
+      </w:r>
+      <w:r>
+        <w:t xml:space="preserve">families address this differently. The</w:t>
+      </w:r>
+      <w:r>
+        <w:t xml:space="preserve"> </w:t>
+      </w:r>
+      <w:r>
+        <w:rPr>
+          <w:i/>
+          <w:iCs/>
+        </w:rPr>
+        <w:t xml:space="preserve">pooled</w:t>
+      </w:r>
+      <w:r>
+        <w:t xml:space="preserve"> </w:t>
+      </w:r>
+      <w:r>
+        <w:t xml:space="preserve">(unconditional) family models</w:t>
+      </w:r>
+      <w:r>
+        <w:t xml:space="preserve"> </w:t>
+      </w:r>
+      <m:oMath>
+        <m:r>
+          <m:t>p</m:t>
+        </m:r>
+        <m:r>
+          <m:rPr>
+            <m:sty m:val="p"/>
+          </m:rPr>
+          <m:t>(</m:t>
+        </m:r>
+        <m:r>
+          <m:t>x</m:t>
+        </m:r>
+        <m:r>
+          <m:rPr>
+            <m:sty m:val="p"/>
+          </m:rPr>
+          <m:t>)</m:t>
+        </m:r>
+      </m:oMath>
+      <w:r>
+        <w:t xml:space="preserve"> </w:t>
+      </w:r>
+      <w:r>
+        <w:t xml:space="preserve">and ignores</w:t>
+      </w:r>
+      <w:r>
+        <w:t xml:space="preserve"> </w:t>
+      </w:r>
+      <m:oMath>
+        <m:r>
+          <m:t>s</m:t>
+        </m:r>
+      </m:oMath>
+      <w:r>
+        <w:t xml:space="preserve">. The</w:t>
+      </w:r>
+      <w:r>
+        <w:t xml:space="preserve"> </w:t>
+      </w:r>
+      <w:r>
+        <w:rPr>
+          <w:i/>
+          <w:iCs/>
+        </w:rPr>
+        <w:t xml:space="preserve">invariant</w:t>
+      </w:r>
+      <w:r>
+        <w:t xml:space="preserve"> </w:t>
+      </w:r>
+      <w:r>
+        <w:t xml:space="preserve">family transforms</w:t>
+      </w:r>
+      <w:r>
+        <w:t xml:space="preserve"> </w:t>
+      </w:r>
+      <m:oMath>
+        <m:r>
+          <m:t>x</m:t>
+        </m:r>
+        <m:r>
+          <m:rPr>
+            <m:sty m:val="p"/>
+          </m:rPr>
+          <m:t>↦</m:t>
+        </m:r>
+        <m:r>
+          <m:t>φ</m:t>
+        </m:r>
+        <m:r>
+          <m:rPr>
+            <m:sty m:val="p"/>
+          </m:rPr>
+          <m:t>(</m:t>
+        </m:r>
+        <m:r>
+          <m:t>x</m:t>
+        </m:r>
+        <m:r>
+          <m:rPr>
+            <m:sty m:val="p"/>
+          </m:rPr>
+          <m:t>)</m:t>
+        </m:r>
+      </m:oMath>
+      <w:r>
+        <w:t xml:space="preserve"> </w:t>
+      </w:r>
+      <w:r>
+        <w:t xml:space="preserve">so that</w:t>
+      </w:r>
+      <w:r>
+        <w:t xml:space="preserve"> </w:t>
+      </w:r>
+      <m:oMath>
+        <m:r>
+          <m:t>φ</m:t>
+        </m:r>
+      </m:oMath>
+      <w:r>
+        <w:t xml:space="preserve"> </w:t>
+      </w:r>
+      <w:r>
+        <w:t xml:space="preserve">is approximately</w:t>
+      </w:r>
+      <w:r>
+        <w:t xml:space="preserve"> </w:t>
+      </w:r>
+      <w:r>
+        <w:t xml:space="preserve">independent of</w:t>
+      </w:r>
+      <w:r>
+        <w:t xml:space="preserve"> </w:t>
+      </w:r>
+      <m:oMath>
+        <m:r>
+          <m:t>s</m:t>
+        </m:r>
+      </m:oMath>
+      <w:r>
+        <w:t xml:space="preserve">, most commonly by order tracking, and models</w:t>
+      </w:r>
+      <w:r>
+        <w:t xml:space="preserve"> </w:t>
+      </w:r>
+      <m:oMath>
+        <m:r>
+          <m:t>p</m:t>
+        </m:r>
+        <m:r>
+          <m:rPr>
+            <m:sty m:val="p"/>
+          </m:rPr>
+          <m:t>(</m:t>
+        </m:r>
+        <m:r>
+          <m:t>φ</m:t>
+        </m:r>
+        <m:r>
+          <m:rPr>
+            <m:sty m:val="p"/>
+          </m:rPr>
+          <m:t>(</m:t>
+        </m:r>
+        <m:r>
+          <m:t>x</m:t>
+        </m:r>
+        <m:r>
+          <m:rPr>
+            <m:sty m:val="p"/>
+          </m:rPr>
+          <m:t>)</m:t>
+        </m:r>
+        <m:r>
+          <m:rPr>
+            <m:sty m:val="p"/>
+          </m:rPr>
+          <m:t>)</m:t>
+        </m:r>
+      </m:oMath>
+      <w:r>
+        <w:t xml:space="preserve">. The</w:t>
+      </w:r>
+      <w:r>
+        <w:t xml:space="preserve"> </w:t>
+      </w:r>
+      <w:r>
+        <w:rPr>
+          <w:i/>
+          <w:iCs/>
+        </w:rPr>
+        <w:t xml:space="preserve">conditional</w:t>
+      </w:r>
+      <w:r>
+        <w:t xml:space="preserve"> </w:t>
+      </w:r>
+      <w:r>
+        <w:t xml:space="preserve">family, which we advocate, models</w:t>
+      </w:r>
+      <w:r>
+        <w:t xml:space="preserve"> </w:t>
+      </w:r>
+      <m:oMath>
+        <m:r>
+          <m:t>p</m:t>
+        </m:r>
+        <m:r>
+          <m:rPr>
+            <m:sty m:val="p"/>
+          </m:rPr>
+          <m:t>(</m:t>
+        </m:r>
+        <m:r>
+          <m:t>x</m:t>
+        </m:r>
+        <m:r>
+          <m:rPr>
+            <m:sty m:val="p"/>
+          </m:rPr>
+          <m:t>∣</m:t>
+        </m:r>
+        <m:r>
+          <m:t>s</m:t>
+        </m:r>
+        <m:r>
+          <m:rPr>
+            <m:sty m:val="p"/>
+          </m:rPr>
+          <m:t>)</m:t>
+        </m:r>
+      </m:oMath>
+      <w:r>
+        <w:t xml:space="preserve"> </w:t>
+      </w:r>
+      <w:r>
+        <w:t xml:space="preserve">directly using the measured covariate. Invariance removes</w:t>
+      </w:r>
+      <w:r>
+        <w:t xml:space="preserve"> </w:t>
+      </w:r>
+      <m:oMath>
+        <m:r>
+          <m:t>s</m:t>
+        </m:r>
+      </m:oMath>
+      <w:r>
+        <w:t xml:space="preserve">; conditioning uses it.</w:t>
+      </w:r>
+    </w:p>
+    <w:bookmarkEnd w:id="12"/>
+    <w:bookmarkStart w:id="13" w:name="method"/>
+    <w:p>
+      <w:pPr>
+        <w:pStyle w:val="Heading2"/>
+        <w:keepNext/>
+        <w:keepLines/>
+        <w:widowControl w:val="1"/>
+      </w:pPr>
+      <w:r>
+        <w:t xml:space="preserve">4  Method</w:t>
+      </w:r>
+    </w:p>
+    <w:p>
+      <w:pPr>
+        <w:pStyle w:val="FirstParagraph"/>
+        <w:jc w:val="both"/>
+        <w:keepNext w:val="0"/>
+        <w:keepLines w:val="0"/>
+        <w:widowControl w:val="1"/>
+      </w:pPr>
+      <w:r>
         <w:rPr>
           <w:b/>
           <w:bCs/>
         </w:rPr>
-        <w:t xml:space="preserve">Windowing and features.</w:t>
-      </w:r>
-      <w:r>
-        <w:t xml:space="preserve"> </w:t>
-      </w:r>
-      <w:r>
-        <w:t xml:space="preserve">Each recording carries a once-per-revolution tachometer pulse train. We segment every recording</w:t>
-      </w:r>
-      <w:r>
-        <w:t xml:space="preserve"> </w:t>
-      </w:r>
-      <w:r>
-        <w:t xml:space="preserve">into non-overlapping windows of a fixed number of shaft revolutions and, for each window, take the</w:t>
-      </w:r>
-      <w:r>
-        <w:t xml:space="preserve"> </w:t>
-      </w:r>
-      <w:r>
-        <w:t xml:space="preserve">log-magnitude spectrum of a chosen sensor channel as the feature vector</w:t>
-      </w:r>
-      <w:r>
-        <w:t xml:space="preserve"> </w:t>
-      </w:r>
-      <w:r>
-        <w:rPr>
-          <w:rStyle w:val="VerbatimChar"/>
-        </w:rPr>
-        <w:t xml:space="preserve">x</w:t>
-      </w:r>
-      <w:r>
-        <w:t xml:space="preserve">. Each window</w:t>
-      </w:r>
-      <w:r>
-        <w:t xml:space="preserve"> </w:t>
-      </w:r>
-      <w:r>
-        <w:t xml:space="preserve">also carries its measured rotation speed</w:t>
-      </w:r>
-      <w:r>
-        <w:t xml:space="preserve"> </w:t>
-      </w:r>
-      <w:r>
-        <w:rPr>
-          <w:rStyle w:val="VerbatimChar"/>
-        </w:rPr>
-        <w:t xml:space="preserve">s</w:t>
-      </w:r>
-      <w:r>
-        <w:t xml:space="preserve">, estimated from the median tachometer pulse</w:t>
-      </w:r>
-      <w:r>
-        <w:t xml:space="preserve"> </w:t>
-      </w:r>
-      <w:r>
-        <w:t xml:space="preserve">spacing.</w:t>
+        <w:t xml:space="preserve">Features.</w:t>
+      </w:r>
+      <w:r>
+        <w:t xml:space="preserve"> </w:t>
+      </w:r>
+      <w:r>
+        <w:t xml:space="preserve">Each recording carries a once-per-revolution tachometer pulse train. We segment it into</w:t>
+      </w:r>
+      <w:r>
+        <w:t xml:space="preserve"> </w:t>
+      </w:r>
+      <w:r>
+        <w:t xml:space="preserve">non-overlapping windows of</w:t>
+      </w:r>
+      <w:r>
+        <w:t xml:space="preserve"> </w:t>
+      </w:r>
+      <m:oMath>
+        <m:r>
+          <m:t>R</m:t>
+        </m:r>
+      </m:oMath>
+      <w:r>
+        <w:t xml:space="preserve"> </w:t>
+      </w:r>
+      <w:r>
+        <w:t xml:space="preserve">shaft revolutions and take the log-magnitude spectrum of a chosen sensor</w:t>
+      </w:r>
+      <w:r>
+        <w:t xml:space="preserve"> </w:t>
+      </w:r>
+      <w:r>
+        <w:t xml:space="preserve">channel,</w:t>
+      </w:r>
+      <w:r>
+        <w:t xml:space="preserve"> </w:t>
+      </w:r>
+      <m:oMath>
+        <m:r>
+          <m:t>x</m:t>
+        </m:r>
+        <m:r>
+          <m:rPr>
+            <m:sty m:val="p"/>
+          </m:rPr>
+          <m:t>=</m:t>
+        </m:r>
+        <m:r>
+          <m:rPr>
+            <m:sty m:val="p"/>
+          </m:rPr>
+          <m:t>log</m:t>
+        </m:r>
+        <m:r>
+          <m:rPr>
+            <m:sty m:val="p"/>
+          </m:rPr>
+          <m:t>(</m:t>
+        </m:r>
+        <m:r>
+          <m:t>1</m:t>
+        </m:r>
+        <m:r>
+          <m:rPr>
+            <m:sty m:val="p"/>
+          </m:rPr>
+          <m:t>+</m:t>
+        </m:r>
+        <m:r>
+          <m:rPr>
+            <m:sty m:val="p"/>
+          </m:rPr>
+          <m:t>|</m:t>
+        </m:r>
+        <m:r>
+          <m:rPr>
+            <m:scr m:val="script"/>
+            <m:sty m:val="p"/>
+          </m:rPr>
+          <m:t>F</m:t>
+        </m:r>
+        <m:r>
+          <m:rPr>
+            <m:sty m:val="p"/>
+          </m:rPr>
+          <m:t>{</m:t>
+        </m:r>
+        <m:r>
+          <m:t>w</m:t>
+        </m:r>
+        <m:r>
+          <m:rPr>
+            <m:sty m:val="p"/>
+          </m:rPr>
+          <m:t>}</m:t>
+        </m:r>
+        <m:r>
+          <m:rPr>
+            <m:sty m:val="p"/>
+          </m:rPr>
+          <m:t>|</m:t>
+        </m:r>
+        <m:r>
+          <m:rPr>
+            <m:sty m:val="p"/>
+          </m:rPr>
+          <m:t>)</m:t>
+        </m:r>
+      </m:oMath>
+      <w:r>
+        <w:t xml:space="preserve">, as the feature. The window speed</w:t>
+      </w:r>
+      <w:r>
+        <w:t xml:space="preserve"> </w:t>
+      </w:r>
+      <m:oMath>
+        <m:r>
+          <m:t>s</m:t>
+        </m:r>
+        <m:r>
+          <m:rPr>
+            <m:sty m:val="p"/>
+          </m:rPr>
+          <m:t>=</m:t>
+        </m:r>
+        <m:sSub>
+          <m:e>
+            <m:r>
+              <m:t>f</m:t>
+            </m:r>
+          </m:e>
+          <m:sub>
+            <m:r>
+              <m:t>s</m:t>
+            </m:r>
+          </m:sub>
+        </m:sSub>
+        <m:r>
+          <m:rPr>
+            <m:sty m:val="p"/>
+          </m:rPr>
+          <m:t>/</m:t>
+        </m:r>
+        <m:r>
+          <m:rPr>
+            <m:sty m:val="p"/>
+          </m:rPr>
+          <m:t>Δ</m:t>
+        </m:r>
+      </m:oMath>
+      <w:r>
+        <w:t xml:space="preserve"> </w:t>
+      </w:r>
+      <w:r>
+        <w:t xml:space="preserve">is the</w:t>
+      </w:r>
+      <w:r>
+        <w:t xml:space="preserve"> </w:t>
+      </w:r>
+      <w:r>
+        <w:t xml:space="preserve">sampling rate divided by the median tachometer pulse spacing</w:t>
+      </w:r>
+      <w:r>
+        <w:t xml:space="preserve"> </w:t>
+      </w:r>
+      <m:oMath>
+        <m:r>
+          <m:rPr>
+            <m:sty m:val="p"/>
+          </m:rPr>
+          <m:t>Δ</m:t>
+        </m:r>
+      </m:oMath>
+      <w:r>
+        <w:t xml:space="preserve">.</w:t>
       </w:r>
     </w:p>
     <w:p>
@@ -880,25 +1578,615 @@
           <w:b/>
           <w:bCs/>
         </w:rPr>
-        <w:t xml:space="preserve">Unconditional baseline.</w:t>
-      </w:r>
-      <w:r>
-        <w:t xml:space="preserve"> </w:t>
-      </w:r>
-      <w:r>
-        <w:t xml:space="preserve">The baseline is the standard normal-only detector: fit a model of the normal feature distribution</w:t>
-      </w:r>
-      <w:r>
-        <w:t xml:space="preserve"> </w:t>
-      </w:r>
-      <w:r>
-        <w:t xml:space="preserve">on healthy windows and score a test window by its reconstruction error. We use principal-component</w:t>
-      </w:r>
-      <w:r>
-        <w:t xml:space="preserve"> </w:t>
-      </w:r>
-      <w:r>
-        <w:t xml:space="preserve">reconstruction error (and, in the backbone ablation, an autoencoder) on standardized features.</w:t>
+        <w:t xml:space="preserve">Speed-conditional detector.</w:t>
+      </w:r>
+      <w:r>
+        <w:t xml:space="preserve"> </w:t>
+      </w:r>
+      <w:r>
+        <w:t xml:space="preserve">We estimate the local healthy mean at speed</w:t>
+      </w:r>
+      <w:r>
+        <w:t xml:space="preserve"> </w:t>
+      </w:r>
+      <m:oMath>
+        <m:r>
+          <m:t>s</m:t>
+        </m:r>
+      </m:oMath>
+      <w:r>
+        <w:t xml:space="preserve"> </w:t>
+      </w:r>
+      <w:r>
+        <w:t xml:space="preserve">by a k-nearest-neighbour</w:t>
+      </w:r>
+      <w:r>
+        <w:t xml:space="preserve"> </w:t>
+      </w:r>
+      <w:r>
+        <w:t xml:space="preserve">average in the speed variable,</w:t>
+      </w:r>
+    </w:p>
+    <w:p>
+      <w:pPr>
+        <w:pStyle w:val="BodyText"/>
+      </w:pPr>
+      <m:oMathPara>
+        <m:oMathParaPr>
+          <m:jc m:val="center"/>
+        </m:oMathParaPr>
+        <m:oMath>
+          <m:r>
+            <m:t>m</m:t>
+          </m:r>
+          <m:r>
+            <m:rPr>
+              <m:sty m:val="p"/>
+            </m:rPr>
+            <m:t>(</m:t>
+          </m:r>
+          <m:r>
+            <m:t>s</m:t>
+          </m:r>
+          <m:r>
+            <m:rPr>
+              <m:sty m:val="p"/>
+            </m:rPr>
+            <m:t>)</m:t>
+          </m:r>
+          <m:r>
+            <m:rPr>
+              <m:sty m:val="p"/>
+            </m:rPr>
+            <m:t>=</m:t>
+          </m:r>
+          <m:f>
+            <m:fPr>
+              <m:type m:val="bar"/>
+            </m:fPr>
+            <m:num>
+              <m:r>
+                <m:t>1</m:t>
+              </m:r>
+            </m:num>
+            <m:den>
+              <m:r>
+                <m:t>k</m:t>
+              </m:r>
+            </m:den>
+          </m:f>
+          <m:nary>
+            <m:naryPr>
+              <m:chr m:val="∑"/>
+              <m:limLoc m:val="undOvr"/>
+              <m:subHide m:val="off"/>
+              <m:supHide m:val="on"/>
+            </m:naryPr>
+            <m:sub>
+              <m:r>
+                <m:t>i</m:t>
+              </m:r>
+              <m:r>
+                <m:rPr>
+                  <m:sty m:val="p"/>
+                </m:rPr>
+                <m:t>∈</m:t>
+              </m:r>
+              <m:sSub>
+                <m:e>
+                  <m:r>
+                    <m:rPr>
+                      <m:scr m:val="script"/>
+                      <m:sty m:val="p"/>
+                    </m:rPr>
+                    <m:t>N</m:t>
+                  </m:r>
+                </m:e>
+                <m:sub>
+                  <m:r>
+                    <m:t>k</m:t>
+                  </m:r>
+                </m:sub>
+              </m:sSub>
+              <m:r>
+                <m:rPr>
+                  <m:sty m:val="p"/>
+                </m:rPr>
+                <m:t>(</m:t>
+              </m:r>
+              <m:r>
+                <m:t>s</m:t>
+              </m:r>
+              <m:r>
+                <m:rPr>
+                  <m:sty m:val="p"/>
+                </m:rPr>
+                <m:t>)</m:t>
+              </m:r>
+            </m:sub>
+            <m:sup>
+              <m:r>
+                <m:t>​</m:t>
+              </m:r>
+            </m:sup>
+            <m:e>
+              <m:sSub>
+                <m:e>
+                  <m:r>
+                    <m:t>x</m:t>
+                  </m:r>
+                </m:e>
+                <m:sub>
+                  <m:r>
+                    <m:t>i</m:t>
+                  </m:r>
+                </m:sub>
+              </m:sSub>
+            </m:e>
+          </m:nary>
+          <m:r>
+            <m:rPr>
+              <m:sty m:val="p"/>
+            </m:rPr>
+            <m:t>,</m:t>
+          </m:r>
+          <m:r>
+            <m:t>  </m:t>
+          </m:r>
+          <m:sSub>
+            <m:e>
+              <m:r>
+                <m:rPr>
+                  <m:scr m:val="script"/>
+                  <m:sty m:val="p"/>
+                </m:rPr>
+                <m:t>N</m:t>
+              </m:r>
+            </m:e>
+            <m:sub>
+              <m:r>
+                <m:t>k</m:t>
+              </m:r>
+            </m:sub>
+          </m:sSub>
+          <m:r>
+            <m:rPr>
+              <m:sty m:val="p"/>
+            </m:rPr>
+            <m:t>(</m:t>
+          </m:r>
+          <m:r>
+            <m:t>s</m:t>
+          </m:r>
+          <m:r>
+            <m:rPr>
+              <m:sty m:val="p"/>
+            </m:rPr>
+            <m:t>)</m:t>
+          </m:r>
+          <m:r>
+            <m:rPr>
+              <m:sty m:val="p"/>
+            </m:rPr>
+            <m:t>=</m:t>
+          </m:r>
+          <m:r>
+            <m:rPr>
+              <m:sty m:val="p"/>
+            </m:rPr>
+            <m:t>{</m:t>
+          </m:r>
+          <m:r>
+            <m:rPr>
+              <m:nor/>
+              <m:sty m:val="p"/>
+            </m:rPr>
+            <m:t>indices of the </m:t>
+          </m:r>
+          <m:r>
+            <m:t>k</m:t>
+          </m:r>
+          <m:r>
+            <m:rPr>
+              <m:nor/>
+              <m:sty m:val="p"/>
+            </m:rPr>
+            <m:t> training windows with speed nearest </m:t>
+          </m:r>
+          <m:r>
+            <m:t>s</m:t>
+          </m:r>
+          <m:r>
+            <m:rPr>
+              <m:sty m:val="p"/>
+            </m:rPr>
+            <m:t>}</m:t>
+          </m:r>
+          <m:r>
+            <m:rPr>
+              <m:sty m:val="p"/>
+            </m:rPr>
+            <m:t>,</m:t>
+          </m:r>
+        </m:oMath>
+      </m:oMathPara>
+    </w:p>
+    <w:p>
+      <w:pPr>
+        <w:pStyle w:val="FirstParagraph"/>
+        <w:jc w:val="both"/>
+        <w:keepNext w:val="0"/>
+        <w:keepLines w:val="0"/>
+        <w:widowControl w:val="1"/>
+      </w:pPr>
+      <w:r>
+        <w:t xml:space="preserve">and detect on the residual</w:t>
+      </w:r>
+      <w:r>
+        <w:t xml:space="preserve"> </w:t>
+      </w:r>
+      <m:oMath>
+        <m:r>
+          <m:t>r</m:t>
+        </m:r>
+        <m:r>
+          <m:rPr>
+            <m:sty m:val="p"/>
+          </m:rPr>
+          <m:t>=</m:t>
+        </m:r>
+        <m:r>
+          <m:t>x</m:t>
+        </m:r>
+        <m:r>
+          <m:rPr>
+            <m:sty m:val="p"/>
+          </m:rPr>
+          <m:t>−</m:t>
+        </m:r>
+        <m:r>
+          <m:t>m</m:t>
+        </m:r>
+        <m:r>
+          <m:rPr>
+            <m:sty m:val="p"/>
+          </m:rPr>
+          <m:t>(</m:t>
+        </m:r>
+        <m:r>
+          <m:t>s</m:t>
+        </m:r>
+        <m:r>
+          <m:rPr>
+            <m:sty m:val="p"/>
+          </m:rPr>
+          <m:t>)</m:t>
+        </m:r>
+      </m:oMath>
+      <w:r>
+        <w:t xml:space="preserve">. With</w:t>
+      </w:r>
+      <w:r>
+        <w:t xml:space="preserve"> </w:t>
+      </w:r>
+      <m:oMath>
+        <m:acc>
+          <m:accPr>
+            <m:chr m:val="̃"/>
+          </m:accPr>
+          <m:e>
+            <m:r>
+              <m:t>r</m:t>
+            </m:r>
+          </m:e>
+        </m:acc>
+      </m:oMath>
+      <w:r>
+        <w:t xml:space="preserve"> </w:t>
+      </w:r>
+      <w:r>
+        <w:t xml:space="preserve">the residual standardized by the</w:t>
+      </w:r>
+      <w:r>
+        <w:t xml:space="preserve"> </w:t>
+      </w:r>
+      <w:r>
+        <w:t xml:space="preserve">training-residual mean and standard deviation, and</w:t>
+      </w:r>
+      <w:r>
+        <w:t xml:space="preserve"> </w:t>
+      </w:r>
+      <m:oMath>
+        <m:r>
+          <m:t>V</m:t>
+        </m:r>
+      </m:oMath>
+      <w:r>
+        <w:t xml:space="preserve"> </w:t>
+      </w:r>
+      <w:r>
+        <w:t xml:space="preserve">the top-</w:t>
+      </w:r>
+      <m:oMath>
+        <m:r>
+          <m:t>K</m:t>
+        </m:r>
+      </m:oMath>
+      <w:r>
+        <w:t xml:space="preserve"> </w:t>
+      </w:r>
+      <w:r>
+        <w:t xml:space="preserve">principal components of the</w:t>
+      </w:r>
+      <w:r>
+        <w:t xml:space="preserve"> </w:t>
+      </w:r>
+      <w:r>
+        <w:t xml:space="preserve">standardized healthy-training residuals, the anomaly score is the reconstruction error</w:t>
+      </w:r>
+    </w:p>
+    <w:p>
+      <w:pPr>
+        <w:pStyle w:val="BodyText"/>
+      </w:pPr>
+      <m:oMathPara>
+        <m:oMathParaPr>
+          <m:jc m:val="center"/>
+        </m:oMathParaPr>
+        <m:oMath>
+          <m:r>
+            <m:t>A</m:t>
+          </m:r>
+          <m:r>
+            <m:rPr>
+              <m:sty m:val="p"/>
+            </m:rPr>
+            <m:t>(</m:t>
+          </m:r>
+          <m:r>
+            <m:t>x</m:t>
+          </m:r>
+          <m:r>
+            <m:rPr>
+              <m:sty m:val="p"/>
+            </m:rPr>
+            <m:t>,</m:t>
+          </m:r>
+          <m:r>
+            <m:t>s</m:t>
+          </m:r>
+          <m:r>
+            <m:rPr>
+              <m:sty m:val="p"/>
+            </m:rPr>
+            <m:t>)</m:t>
+          </m:r>
+          <m:r>
+            <m:rPr>
+              <m:sty m:val="p"/>
+            </m:rPr>
+            <m:t>=</m:t>
+          </m:r>
+          <m:r>
+            <m:rPr>
+              <m:sty m:val="p"/>
+            </m:rPr>
+            <m:t>∥</m:t>
+          </m:r>
+          <m:acc>
+            <m:accPr>
+              <m:chr m:val="̃"/>
+            </m:accPr>
+            <m:e>
+              <m:r>
+                <m:t>r</m:t>
+              </m:r>
+            </m:e>
+          </m:acc>
+          <m:r>
+            <m:rPr>
+              <m:sty m:val="p"/>
+            </m:rPr>
+            <m:t>−</m:t>
+          </m:r>
+          <m:r>
+            <m:t>V</m:t>
+          </m:r>
+          <m:sSup>
+            <m:e>
+              <m:r>
+                <m:t>V</m:t>
+              </m:r>
+            </m:e>
+            <m:sup>
+              <m:r>
+                <m:rPr>
+                  <m:sty m:val="p"/>
+                </m:rPr>
+                <m:t>⊤</m:t>
+              </m:r>
+            </m:sup>
+          </m:sSup>
+          <m:acc>
+            <m:accPr>
+              <m:chr m:val="̃"/>
+            </m:accPr>
+            <m:e>
+              <m:r>
+                <m:t>r</m:t>
+              </m:r>
+            </m:e>
+          </m:acc>
+          <m:sSubSup>
+            <m:e>
+              <m:r>
+                <m:rPr>
+                  <m:sty m:val="p"/>
+                </m:rPr>
+                <m:t>∥</m:t>
+              </m:r>
+            </m:e>
+            <m:sub>
+              <m:r>
+                <m:t>2</m:t>
+              </m:r>
+            </m:sub>
+            <m:sup>
+              <m:r>
+                <m:t>2</m:t>
+              </m:r>
+            </m:sup>
+          </m:sSubSup>
+          <m:r>
+            <m:rPr>
+              <m:sty m:val="p"/>
+            </m:rPr>
+            <m:t>.</m:t>
+          </m:r>
+        </m:oMath>
+      </m:oMathPara>
+    </w:p>
+    <w:p>
+      <w:pPr>
+        <w:pStyle w:val="FirstParagraph"/>
+        <w:jc w:val="both"/>
+        <w:keepNext w:val="0"/>
+        <w:keepLines w:val="0"/>
+        <w:widowControl w:val="1"/>
+      </w:pPr>
+      <w:r>
+        <w:t xml:space="preserve">Subtracting</w:t>
+      </w:r>
+      <w:r>
+        <w:t xml:space="preserve"> </w:t>
+      </w:r>
+      <m:oMath>
+        <m:r>
+          <m:t>m</m:t>
+        </m:r>
+        <m:r>
+          <m:rPr>
+            <m:sty m:val="p"/>
+          </m:rPr>
+          <m:t>(</m:t>
+        </m:r>
+        <m:r>
+          <m:t>s</m:t>
+        </m:r>
+        <m:r>
+          <m:rPr>
+            <m:sty m:val="p"/>
+          </m:rPr>
+          <m:t>)</m:t>
+        </m:r>
+      </m:oMath>
+      <w:r>
+        <w:t xml:space="preserve"> </w:t>
+      </w:r>
+      <w:r>
+        <w:t xml:space="preserve">removes the operating-condition component of the healthy spread while preserving</w:t>
+      </w:r>
+      <w:r>
+        <w:t xml:space="preserve"> </w:t>
+      </w:r>
+      <w:r>
+        <w:t xml:space="preserve">fault-induced deviations, and it needs only the tachometer signal that rotating machinery already</w:t>
+      </w:r>
+      <w:r>
+        <w:t xml:space="preserve"> </w:t>
+      </w:r>
+      <w:r>
+        <w:t xml:space="preserve">provides. As</w:t>
+      </w:r>
+      <w:r>
+        <w:t xml:space="preserve"> </w:t>
+      </w:r>
+      <m:oMath>
+        <m:r>
+          <m:t>k</m:t>
+        </m:r>
+        <m:r>
+          <m:rPr>
+            <m:sty m:val="p"/>
+          </m:rPr>
+          <m:t>→</m:t>
+        </m:r>
+        <m:r>
+          <m:t>n</m:t>
+        </m:r>
+      </m:oMath>
+      <w:r>
+        <w:t xml:space="preserve"> </w:t>
+      </w:r>
+      <w:r>
+        <w:t xml:space="preserve">the estimate</w:t>
+      </w:r>
+      <w:r>
+        <w:t xml:space="preserve"> </w:t>
+      </w:r>
+      <m:oMath>
+        <m:r>
+          <m:t>m</m:t>
+        </m:r>
+        <m:r>
+          <m:rPr>
+            <m:sty m:val="p"/>
+          </m:rPr>
+          <m:t>(</m:t>
+        </m:r>
+        <m:r>
+          <m:t>s</m:t>
+        </m:r>
+        <m:r>
+          <m:rPr>
+            <m:sty m:val="p"/>
+          </m:rPr>
+          <m:t>)</m:t>
+        </m:r>
+      </m:oMath>
+      <w:r>
+        <w:t xml:space="preserve"> </w:t>
+      </w:r>
+      <w:r>
+        <w:t xml:space="preserve">tends to the global mean and the detector reduces to the</w:t>
+      </w:r>
+      <w:r>
+        <w:t xml:space="preserve"> </w:t>
+      </w:r>
+      <w:r>
+        <w:t xml:space="preserve">unconditional baseline, a degenerate limit we verify empirically. A discrete-covariate variant replaces</w:t>
+      </w:r>
+      <w:r>
+        <w:t xml:space="preserve"> </w:t>
+      </w:r>
+      <w:r>
+        <w:t xml:space="preserve">the kNN average by the mean of the training bin into which</w:t>
+      </w:r>
+      <w:r>
+        <w:t xml:space="preserve"> </w:t>
+      </w:r>
+      <m:oMath>
+        <m:r>
+          <m:t>s</m:t>
+        </m:r>
+      </m:oMath>
+      <w:r>
+        <w:t xml:space="preserve"> </w:t>
+      </w:r>
+      <w:r>
+        <w:t xml:space="preserve">falls; a stronger backbone replaces the</w:t>
+      </w:r>
+      <w:r>
+        <w:t xml:space="preserve"> </w:t>
+      </w:r>
+      <w:r>
+        <w:t xml:space="preserve">PCA reconstruction error by that of a dense autoencoder trained on the residuals. The estimator is</w:t>
+      </w:r>
+      <w:r>
+        <w:t xml:space="preserve"> </w:t>
+      </w:r>
+      <w:r>
+        <w:t xml:space="preserve">deliberately simple: the contribution is the conditioning principle, not a particular smoother.</w:t>
       </w:r>
     </w:p>
     <w:p>
@@ -914,31 +2202,51 @@
           <w:b/>
           <w:bCs/>
         </w:rPr>
-        <w:t xml:space="preserve">Invariance baseline.</w:t>
-      </w:r>
-      <w:r>
-        <w:t xml:space="preserve"> </w:t>
-      </w:r>
-      <w:r>
-        <w:t xml:space="preserve">The invariance competitor replaces the time-domain spectrum with an order-tracked spectrum:</w:t>
-      </w:r>
-      <w:r>
-        <w:t xml:space="preserve"> </w:t>
-      </w:r>
-      <w:r>
-        <w:t xml:space="preserve">each window is resampled from time to shaft angle using the tachometer pulses before the spectrum is</w:t>
-      </w:r>
-      <w:r>
-        <w:t xml:space="preserve"> </w:t>
-      </w:r>
-      <w:r>
-        <w:t xml:space="preserve">taken, so rotation-locked components occupy speed-independent order bins. The same reconstruction-error</w:t>
-      </w:r>
-      <w:r>
-        <w:t xml:space="preserve"> </w:t>
-      </w:r>
-      <w:r>
-        <w:t xml:space="preserve">detector is then applied.</w:t>
+        <w:t xml:space="preserve">Baselines.</w:t>
+      </w:r>
+      <w:r>
+        <w:t xml:space="preserve"> </w:t>
+      </w:r>
+      <w:r>
+        <w:t xml:space="preserve">The unconditional baseline applies the same reconstruction-error detector to</w:t>
+      </w:r>
+      <w:r>
+        <w:t xml:space="preserve"> </w:t>
+      </w:r>
+      <m:oMath>
+        <m:r>
+          <m:t>x</m:t>
+        </m:r>
+      </m:oMath>
+      <w:r>
+        <w:t xml:space="preserve"> </w:t>
+      </w:r>
+      <w:r>
+        <w:t xml:space="preserve">with no</w:t>
+      </w:r>
+      <w:r>
+        <w:t xml:space="preserve"> </w:t>
+      </w:r>
+      <w:r>
+        <w:t xml:space="preserve">mean subtraction. The invariance baseline applies it to an order-tracked spectrum, obtained by resampling</w:t>
+      </w:r>
+      <w:r>
+        <w:t xml:space="preserve"> </w:t>
+      </w:r>
+      <w:r>
+        <w:t xml:space="preserve">each window from time to shaft angle using the tachometer before the spectrum is taken, so rotation-locked</w:t>
+      </w:r>
+      <w:r>
+        <w:t xml:space="preserve"> </w:t>
+      </w:r>
+      <w:r>
+        <w:t xml:space="preserve">components occupy speed-independent order bins. All three families share the same backbone, window, and</w:t>
+      </w:r>
+      <w:r>
+        <w:t xml:space="preserve"> </w:t>
+      </w:r>
+      <w:r>
+        <w:t xml:space="preserve">feature dimension, so the comparison isolates the treatment of the covariate.</w:t>
       </w:r>
     </w:p>
     <w:p>
@@ -950,142 +2258,384 @@
         <w:widowControl w:val="1"/>
       </w:pPr>
       <w:r>
+        <w:t xml:space="preserve">Algorithm 1: speed-conditional detector</w:t>
+      </w:r>
+    </w:p>
+    <w:p>
+      <w:pPr>
+        <w:pStyle w:val="Compact"/>
+        <w:numPr>
+          <w:ilvl w:val="0"/>
+          <w:numId w:val="1002"/>
+        </w:numPr>
+        <w:ind w:left="360" w:hanging="259"/>
+        <w:jc w:val="both"/>
+        <w:keepNext w:val="0"/>
+        <w:keepLines w:val="0"/>
+        <w:widowControl w:val="1"/>
+      </w:pPr>
+      <w:r>
         <w:rPr>
           <w:b/>
           <w:bCs/>
         </w:rPr>
-        <w:t xml:space="preserve">Speed-conditional detector.</w:t>
-      </w:r>
-      <w:r>
-        <w:t xml:space="preserve"> </w:t>
-      </w:r>
-      <w:r>
-        <w:t xml:space="preserve">Our method models the normal features</w:t>
-      </w:r>
-      <w:r>
-        <w:t xml:space="preserve"> </w:t>
-      </w:r>
-      <w:r>
-        <w:rPr>
-          <w:i/>
-          <w:iCs/>
-        </w:rPr>
-        <w:t xml:space="preserve">conditioned</w:t>
-      </w:r>
-      <w:r>
-        <w:t xml:space="preserve"> </w:t>
-      </w:r>
-      <w:r>
-        <w:t xml:space="preserve">on the measured speed. Concretely, for a</w:t>
-      </w:r>
-      <w:r>
-        <w:t xml:space="preserve"> </w:t>
-      </w:r>
-      <w:r>
-        <w:t xml:space="preserve">window with speed</w:t>
-      </w:r>
-      <w:r>
-        <w:t xml:space="preserve"> </w:t>
-      </w:r>
-      <w:r>
-        <w:rPr>
-          <w:rStyle w:val="VerbatimChar"/>
-        </w:rPr>
-        <w:t xml:space="preserve">s</w:t>
-      </w:r>
-      <w:r>
-        <w:t xml:space="preserve"> </w:t>
-      </w:r>
-      <w:r>
-        <w:t xml:space="preserve">we estimate the local normal mean</w:t>
-      </w:r>
-      <w:r>
-        <w:t xml:space="preserve"> </w:t>
-      </w:r>
-      <w:r>
-        <w:rPr>
-          <w:rStyle w:val="VerbatimChar"/>
-        </w:rPr>
-        <w:t xml:space="preserve">m(s)</w:t>
-      </w:r>
-      <w:r>
-        <w:t xml:space="preserve"> </w:t>
-      </w:r>
-      <w:r>
-        <w:t xml:space="preserve">as the average feature vector of the normal-training windows whose speeds are</w:t>
-      </w:r>
-      <w:r>
-        <w:t xml:space="preserve"> </w:t>
-      </w:r>
-      <w:r>
-        <w:t xml:space="preserve">nearest to</w:t>
-      </w:r>
-      <w:r>
-        <w:t xml:space="preserve"> </w:t>
-      </w:r>
-      <w:r>
-        <w:rPr>
-          <w:rStyle w:val="VerbatimChar"/>
-        </w:rPr>
-        <w:t xml:space="preserve">s</w:t>
-      </w:r>
-      <w:r>
-        <w:t xml:space="preserve"> </w:t>
-      </w:r>
-      <w:r>
-        <w:t xml:space="preserve">(a k-nearest-neighbour estimate in speed), and detect on the residual</w:t>
-      </w:r>
-      <w:r>
-        <w:t xml:space="preserve"> </w:t>
-      </w:r>
-      <w:r>
-        <w:rPr>
-          <w:rStyle w:val="VerbatimChar"/>
-        </w:rPr>
-        <w:t xml:space="preserve">x − m(s)</w:t>
-      </w:r>
-      <w:r>
-        <w:t xml:space="preserve"> </w:t>
-      </w:r>
-      <w:r>
-        <w:t xml:space="preserve">with the same reconstruction-error backbone. Subtracting the</w:t>
-      </w:r>
-      <w:r>
-        <w:t xml:space="preserve"> </w:t>
-      </w:r>
-      <w:r>
-        <w:t xml:space="preserve">speed-conditional mean removes the operating-condition component of the normal spread while preserving</w:t>
-      </w:r>
-      <w:r>
-        <w:t xml:space="preserve"> </w:t>
-      </w:r>
-      <w:r>
-        <w:t xml:space="preserve">fault-induced deviations, and the construction requires only the tachometer signal that rotating</w:t>
-      </w:r>
-      <w:r>
-        <w:t xml:space="preserve"> </w:t>
-      </w:r>
-      <w:r>
-        <w:t xml:space="preserve">machinery already provides. The estimator is deliberately simple; the contribution is the conditioning</w:t>
-      </w:r>
-      <w:r>
-        <w:t xml:space="preserve"> </w:t>
-      </w:r>
-      <w:r>
-        <w:t xml:space="preserve">principle, not the specific smoother.</w:t>
+        <w:t xml:space="preserve">Train</w:t>
+      </w:r>
+      <w:r>
+        <w:t xml:space="preserve"> </w:t>
+      </w:r>
+      <w:r>
+        <w:t xml:space="preserve">(healthy only): compute residuals</w:t>
+      </w:r>
+      <w:r>
+        <w:t xml:space="preserve"> </w:t>
+      </w:r>
+      <m:oMath>
+        <m:sSub>
+          <m:e>
+            <m:r>
+              <m:t>r</m:t>
+            </m:r>
+          </m:e>
+          <m:sub>
+            <m:r>
+              <m:t>i</m:t>
+            </m:r>
+          </m:sub>
+        </m:sSub>
+        <m:r>
+          <m:rPr>
+            <m:sty m:val="p"/>
+          </m:rPr>
+          <m:t>=</m:t>
+        </m:r>
+        <m:sSub>
+          <m:e>
+            <m:r>
+              <m:t>x</m:t>
+            </m:r>
+          </m:e>
+          <m:sub>
+            <m:r>
+              <m:t>i</m:t>
+            </m:r>
+          </m:sub>
+        </m:sSub>
+        <m:r>
+          <m:rPr>
+            <m:sty m:val="p"/>
+          </m:rPr>
+          <m:t>−</m:t>
+        </m:r>
+        <m:r>
+          <m:t>m</m:t>
+        </m:r>
+        <m:r>
+          <m:rPr>
+            <m:sty m:val="p"/>
+          </m:rPr>
+          <m:t>(</m:t>
+        </m:r>
+        <m:sSub>
+          <m:e>
+            <m:r>
+              <m:t>s</m:t>
+            </m:r>
+          </m:e>
+          <m:sub>
+            <m:r>
+              <m:t>i</m:t>
+            </m:r>
+          </m:sub>
+        </m:sSub>
+        <m:r>
+          <m:rPr>
+            <m:sty m:val="p"/>
+          </m:rPr>
+          <m:t>)</m:t>
+        </m:r>
+      </m:oMath>
+      <w:r>
+        <w:t xml:space="preserve">; standardize; fit</w:t>
+      </w:r>
+      <w:r>
+        <w:t xml:space="preserve"> </w:t>
+      </w:r>
+      <m:oMath>
+        <m:r>
+          <m:t>V</m:t>
+        </m:r>
+      </m:oMath>
+      <w:r>
+        <w:t xml:space="preserve"> </w:t>
+      </w:r>
+      <w:r>
+        <w:t xml:space="preserve">= top-</w:t>
+      </w:r>
+      <m:oMath>
+        <m:r>
+          <m:t>K</m:t>
+        </m:r>
+      </m:oMath>
+      <w:r>
+        <w:t xml:space="preserve"> </w:t>
+      </w:r>
+      <w:r>
+        <w:t xml:space="preserve">PCA of the standardized residuals (or train an autoencoder on them).</w:t>
       </w:r>
     </w:p>
-    <w:bookmarkEnd w:id="12"/>
-    <w:bookmarkStart w:id="13" w:name="experimental-setup"/>
     <w:p>
       <w:pPr>
-        <w:pStyle w:val="Heading2"/>
-        <w:keepNext/>
-        <w:keepLines/>
+        <w:pStyle w:val="Compact"/>
+        <w:numPr>
+          <w:ilvl w:val="0"/>
+          <w:numId w:val="1002"/>
+        </w:numPr>
+        <w:ind w:left="360" w:hanging="259"/>
+        <w:jc w:val="both"/>
+        <w:keepNext w:val="0"/>
+        <w:keepLines w:val="0"/>
         <w:widowControl w:val="1"/>
       </w:pPr>
       <w:r>
-        <w:t xml:space="preserve">4  Experimental setup</w:t>
+        <w:rPr>
+          <w:b/>
+          <w:bCs/>
+        </w:rPr>
+        <w:t xml:space="preserve">Score</w:t>
+      </w:r>
+      <w:r>
+        <w:t xml:space="preserve"> </w:t>
+      </w:r>
+      <m:oMath>
+        <m:r>
+          <m:rPr>
+            <m:sty m:val="p"/>
+          </m:rPr>
+          <m:t>(</m:t>
+        </m:r>
+        <m:r>
+          <m:t>x</m:t>
+        </m:r>
+        <m:r>
+          <m:rPr>
+            <m:sty m:val="p"/>
+          </m:rPr>
+          <m:t>,</m:t>
+        </m:r>
+        <m:r>
+          <m:t>s</m:t>
+        </m:r>
+        <m:r>
+          <m:rPr>
+            <m:sty m:val="p"/>
+          </m:rPr>
+          <m:t>)</m:t>
+        </m:r>
+      </m:oMath>
+      <w:r>
+        <w:t xml:space="preserve">: find</w:t>
+      </w:r>
+      <w:r>
+        <w:t xml:space="preserve"> </w:t>
+      </w:r>
+      <m:oMath>
+        <m:sSub>
+          <m:e>
+            <m:r>
+              <m:rPr>
+                <m:scr m:val="script"/>
+                <m:sty m:val="p"/>
+              </m:rPr>
+              <m:t>N</m:t>
+            </m:r>
+          </m:e>
+          <m:sub>
+            <m:r>
+              <m:t>k</m:t>
+            </m:r>
+          </m:sub>
+        </m:sSub>
+        <m:r>
+          <m:rPr>
+            <m:sty m:val="p"/>
+          </m:rPr>
+          <m:t>(</m:t>
+        </m:r>
+        <m:r>
+          <m:t>s</m:t>
+        </m:r>
+        <m:r>
+          <m:rPr>
+            <m:sty m:val="p"/>
+          </m:rPr>
+          <m:t>)</m:t>
+        </m:r>
+      </m:oMath>
+      <w:r>
+        <w:t xml:space="preserve"> </w:t>
+      </w:r>
+      <w:r>
+        <w:t xml:space="preserve">by binary search in the sorted training speeds;</w:t>
+      </w:r>
+      <w:r>
+        <w:t xml:space="preserve"> </w:t>
+      </w:r>
+      <w:r>
+        <w:t xml:space="preserve">form</w:t>
+      </w:r>
+      <w:r>
+        <w:t xml:space="preserve"> </w:t>
+      </w:r>
+      <m:oMath>
+        <m:r>
+          <m:t>r</m:t>
+        </m:r>
+        <m:r>
+          <m:rPr>
+            <m:sty m:val="p"/>
+          </m:rPr>
+          <m:t>=</m:t>
+        </m:r>
+        <m:r>
+          <m:t>x</m:t>
+        </m:r>
+        <m:r>
+          <m:rPr>
+            <m:sty m:val="p"/>
+          </m:rPr>
+          <m:t>−</m:t>
+        </m:r>
+        <m:r>
+          <m:t>m</m:t>
+        </m:r>
+        <m:r>
+          <m:rPr>
+            <m:sty m:val="p"/>
+          </m:rPr>
+          <m:t>(</m:t>
+        </m:r>
+        <m:r>
+          <m:t>s</m:t>
+        </m:r>
+        <m:r>
+          <m:rPr>
+            <m:sty m:val="p"/>
+          </m:rPr>
+          <m:t>)</m:t>
+        </m:r>
+      </m:oMath>
+      <w:r>
+        <w:t xml:space="preserve">; standardize; return</w:t>
+      </w:r>
+      <w:r>
+        <w:t xml:space="preserve"> </w:t>
+      </w:r>
+      <m:oMath>
+        <m:r>
+          <m:t>A</m:t>
+        </m:r>
+        <m:r>
+          <m:rPr>
+            <m:sty m:val="p"/>
+          </m:rPr>
+          <m:t>(</m:t>
+        </m:r>
+        <m:r>
+          <m:t>x</m:t>
+        </m:r>
+        <m:r>
+          <m:rPr>
+            <m:sty m:val="p"/>
+          </m:rPr>
+          <m:t>,</m:t>
+        </m:r>
+        <m:r>
+          <m:t>s</m:t>
+        </m:r>
+        <m:r>
+          <m:rPr>
+            <m:sty m:val="p"/>
+          </m:rPr>
+          <m:t>)</m:t>
+        </m:r>
+        <m:r>
+          <m:rPr>
+            <m:sty m:val="p"/>
+          </m:rPr>
+          <m:t>=</m:t>
+        </m:r>
+        <m:sSubSup>
+          <m:e>
+            <m:d>
+              <m:dPr>
+                <m:begChr m:val="‖"/>
+                <m:sepChr m:val=""/>
+                <m:endChr m:val="‖"/>
+                <m:grow/>
+              </m:dPr>
+              <m:e>
+                <m:acc>
+                  <m:accPr>
+                    <m:chr m:val="̃"/>
+                  </m:accPr>
+                  <m:e>
+                    <m:r>
+                      <m:t>r</m:t>
+                    </m:r>
+                  </m:e>
+                </m:acc>
+                <m:r>
+                  <m:rPr>
+                    <m:sty m:val="p"/>
+                  </m:rPr>
+                  <m:t>−</m:t>
+                </m:r>
+                <m:r>
+                  <m:t>V</m:t>
+                </m:r>
+                <m:sSup>
+                  <m:e>
+                    <m:r>
+                      <m:t>V</m:t>
+                    </m:r>
+                  </m:e>
+                  <m:sup>
+                    <m:r>
+                      <m:rPr>
+                        <m:sty m:val="p"/>
+                      </m:rPr>
+                      <m:t>⊤</m:t>
+                    </m:r>
+                  </m:sup>
+                </m:sSup>
+                <m:acc>
+                  <m:accPr>
+                    <m:chr m:val="̃"/>
+                  </m:accPr>
+                  <m:e>
+                    <m:r>
+                      <m:t>r</m:t>
+                    </m:r>
+                  </m:e>
+                </m:acc>
+              </m:e>
+            </m:d>
+          </m:e>
+          <m:sub>
+            <m:r>
+              <m:t>2</m:t>
+            </m:r>
+          </m:sub>
+          <m:sup>
+            <m:r>
+              <m:t>2</m:t>
+            </m:r>
+          </m:sup>
+        </m:sSubSup>
+      </m:oMath>
+      <w:r>
+        <w:t xml:space="preserve">.</w:t>
       </w:r>
     </w:p>
     <w:p>
@@ -1097,6 +2647,163 @@
         <w:widowControl w:val="1"/>
       </w:pPr>
       <w:r>
+        <w:t xml:space="preserve">Training costs one PCA,</w:t>
+      </w:r>
+      <w:r>
+        <w:t xml:space="preserve"> </w:t>
+      </w:r>
+      <m:oMath>
+        <m:r>
+          <m:t>O</m:t>
+        </m:r>
+        <m:r>
+          <m:rPr>
+            <m:sty m:val="p"/>
+          </m:rPr>
+          <m:t>(</m:t>
+        </m:r>
+        <m:r>
+          <m:t>n</m:t>
+        </m:r>
+        <m:r>
+          <m:t>d</m:t>
+        </m:r>
+        <m:r>
+          <m:rPr>
+            <m:sty m:val="p"/>
+          </m:rPr>
+          <m:t>min</m:t>
+        </m:r>
+        <m:r>
+          <m:rPr>
+            <m:sty m:val="p"/>
+          </m:rPr>
+          <m:t>(</m:t>
+        </m:r>
+        <m:r>
+          <m:t>n</m:t>
+        </m:r>
+        <m:r>
+          <m:rPr>
+            <m:sty m:val="p"/>
+          </m:rPr>
+          <m:t>,</m:t>
+        </m:r>
+        <m:r>
+          <m:t>d</m:t>
+        </m:r>
+        <m:r>
+          <m:rPr>
+            <m:sty m:val="p"/>
+          </m:rPr>
+          <m:t>)</m:t>
+        </m:r>
+        <m:r>
+          <m:rPr>
+            <m:sty m:val="p"/>
+          </m:rPr>
+          <m:t>)</m:t>
+        </m:r>
+      </m:oMath>
+      <w:r>
+        <w:t xml:space="preserve">; scoring costs a</w:t>
+      </w:r>
+      <w:r>
+        <w:t xml:space="preserve"> </w:t>
+      </w:r>
+      <m:oMath>
+        <m:r>
+          <m:t>O</m:t>
+        </m:r>
+        <m:r>
+          <m:rPr>
+            <m:sty m:val="p"/>
+          </m:rPr>
+          <m:t>(</m:t>
+        </m:r>
+        <m:r>
+          <m:rPr>
+            <m:sty m:val="p"/>
+          </m:rPr>
+          <m:t>log</m:t>
+        </m:r>
+        <m:r>
+          <m:t>n</m:t>
+        </m:r>
+        <m:r>
+          <m:rPr>
+            <m:sty m:val="p"/>
+          </m:rPr>
+          <m:t>)</m:t>
+        </m:r>
+      </m:oMath>
+      <w:r>
+        <w:t xml:space="preserve"> </w:t>
+      </w:r>
+      <w:r>
+        <w:t xml:space="preserve">speed lookup plus a</w:t>
+      </w:r>
+      <w:r>
+        <w:t xml:space="preserve"> </w:t>
+      </w:r>
+      <m:oMath>
+        <m:r>
+          <m:t>O</m:t>
+        </m:r>
+        <m:r>
+          <m:rPr>
+            <m:sty m:val="p"/>
+          </m:rPr>
+          <m:t>(</m:t>
+        </m:r>
+        <m:r>
+          <m:t>d</m:t>
+        </m:r>
+        <m:r>
+          <m:t>K</m:t>
+        </m:r>
+        <m:r>
+          <m:rPr>
+            <m:sty m:val="p"/>
+          </m:rPr>
+          <m:t>)</m:t>
+        </m:r>
+      </m:oMath>
+      <w:r>
+        <w:t xml:space="preserve"> </w:t>
+      </w:r>
+      <w:r>
+        <w:t xml:space="preserve">projection. The method adds only the kNN mean over the unconditional detector, and stores the</w:t>
+      </w:r>
+      <w:r>
+        <w:t xml:space="preserve"> </w:t>
+      </w:r>
+      <w:r>
+        <w:t xml:space="preserve">training windows (or their per-speed summaries) for the lookup.</w:t>
+      </w:r>
+    </w:p>
+    <w:bookmarkEnd w:id="13"/>
+    <w:bookmarkStart w:id="14" w:name="experimental-setup"/>
+    <w:p>
+      <w:pPr>
+        <w:pStyle w:val="Heading2"/>
+        <w:keepNext/>
+        <w:keepLines/>
+        <w:widowControl w:val="1"/>
+      </w:pPr>
+      <w:r>
+        <w:t xml:space="preserve">5  Experimental setup</w:t>
+      </w:r>
+    </w:p>
+    <w:p>
+      <w:pPr>
+        <w:pStyle w:val="FirstParagraph"/>
+        <w:jc w:val="both"/>
+        <w:keepNext w:val="0"/>
+        <w:keepLines w:val="0"/>
+        <w:widowControl w:val="1"/>
+      </w:pPr>
+      <w:r>
         <w:t xml:space="preserve">We use the MaFaulDa machinery-fault database: a rotor test rig instrumented with two tri-axial</w:t>
       </w:r>
       <w:r>
@@ -1295,8 +3002,8 @@
         <w:t xml:space="preserve">speed-conditioning, this must collapse the AUC.</w:t>
       </w:r>
     </w:p>
-    <w:bookmarkEnd w:id="13"/>
-    <w:bookmarkStart w:id="17" w:name="results"/>
+    <w:bookmarkEnd w:id="14"/>
+    <w:bookmarkStart w:id="21" w:name="results"/>
     <w:p>
       <w:pPr>
         <w:pStyle w:val="Heading2"/>
@@ -1305,7 +3012,7 @@
         <w:widowControl w:val="1"/>
       </w:pPr>
       <w:r>
-        <w:t xml:space="preserve">5  Results</w:t>
+        <w:t xml:space="preserve">6  Results</w:t>
       </w:r>
     </w:p>
     <w:p>
@@ -2669,7 +4376,7 @@
                 <w:rFonts w:ascii="Georgia" w:hAnsi="Georgia"/>
                 <w:sz w:val="18"/>
               </w:rPr>
-              <w:t xml:space="preserve">0.955</w:t>
+              <w:t xml:space="preserve">0.956</w:t>
             </w:r>
           </w:p>
         </w:tc>
@@ -2698,7 +4405,7 @@
                 <w:rFonts w:ascii="Georgia" w:hAnsi="Georgia"/>
                 <w:sz w:val="18"/>
               </w:rPr>
-              <w:t xml:space="preserve">0.955</w:t>
+              <w:t xml:space="preserve">0.954</w:t>
             </w:r>
           </w:p>
         </w:tc>
@@ -2870,13 +4577,19 @@
         <w:t xml:space="preserve"> </w:t>
       </w:r>
       <w:r>
-        <w:t xml:space="preserve">that carry much of the fault energy. Removing speed is the wrong move; conditioning on it is the right</w:t>
-      </w:r>
-      <w:r>
-        <w:t xml:space="preserve"> </w:t>
-      </w:r>
-      <w:r>
-        <w:t xml:space="preserve">one. The bearing faults are near-saturated at matched speed, so the substantial matched-speed gains</w:t>
+        <w:t xml:space="preserve">that carry much of the fault energy. Under speed shift, removing speed costs 6.2 AUC points relative to</w:t>
+      </w:r>
+      <w:r>
+        <w:t xml:space="preserve"> </w:t>
+      </w:r>
+      <w:r>
+        <w:t xml:space="preserve">the unconditional detector, while conditioning on the same tachometer signal gains 4.0. The bearing</w:t>
+      </w:r>
+      <w:r>
+        <w:t xml:space="preserve"> </w:t>
+      </w:r>
+      <w:r>
+        <w:t xml:space="preserve">faults are near-saturated at matched speed, so the substantial matched-speed gains</w:t>
       </w:r>
       <w:r>
         <w:t xml:space="preserve"> </w:t>
@@ -2889,6 +4602,108 @@
       </w:r>
       <w:r>
         <w:t xml:space="preserve">on imbalance); the held-out-speed gains are universal.</w:t>
+      </w:r>
+    </w:p>
+    <w:p>
+      <w:pPr>
+        <w:pStyle w:val="BodyText"/>
+        <w:jc w:val="both"/>
+        <w:keepNext w:val="0"/>
+        <w:keepLines w:val="0"/>
+        <w:widowControl w:val="1"/>
+      </w:pPr>
+      <w:r>
+        <w:t xml:space="preserve">Across ten random matched-speed splits the pooled figures are baseline 0.956 ± 0.004</w:t>
+      </w:r>
+      <w:r>
+        <w:t xml:space="preserve"> </w:t>
+      </w:r>
+      <w:r>
+        <w:t xml:space="preserve">(partial AUC at 10% false-positive rate 0.866), invariance 0.954 ± 0.007 (pAUC 0.832),</w:t>
+      </w:r>
+      <w:r>
+        <w:t xml:space="preserve"> </w:t>
+      </w:r>
+      <w:r>
+        <w:t xml:space="preserve">and conditioning 0.989 ± 0.002 (pAUC 0.949), with the conditioning bootstrap interval</w:t>
+      </w:r>
+      <w:r>
+        <w:t xml:space="preserve"> </w:t>
+      </w:r>
+      <w:r>
+        <w:t xml:space="preserve">[0.981, 0.993] clearing the baseline interval [0.941, 0.965]. A paired Wilcoxon test rejects</w:t>
+      </w:r>
+      <w:r>
+        <w:t xml:space="preserve"> </w:t>
+      </w:r>
+      <w:r>
+        <w:t xml:space="preserve">equality of conditioning against both baseline and invariance in the matched regime</w:t>
+      </w:r>
+      <w:r>
+        <w:t xml:space="preserve"> </w:t>
+      </w:r>
+      <w:r>
+        <w:t xml:space="preserve">(</w:t>
+      </w:r>
+      <m:oMath>
+        <m:r>
+          <m:t>p</m:t>
+        </m:r>
+        <m:r>
+          <m:rPr>
+            <m:sty m:val="p"/>
+          </m:rPr>
+          <m:t>=</m:t>
+        </m:r>
+        <m:r>
+          <m:t>0.005</m:t>
+        </m:r>
+      </m:oMath>
+      <w:r>
+        <w:t xml:space="preserve">) and across the six held-out bands (</w:t>
+      </w:r>
+      <m:oMath>
+        <m:r>
+          <m:t>p</m:t>
+        </m:r>
+        <m:r>
+          <m:rPr>
+            <m:sty m:val="p"/>
+          </m:rPr>
+          <m:t>=</m:t>
+        </m:r>
+        <m:r>
+          <m:t>0.046</m:t>
+        </m:r>
+      </m:oMath>
+      <w:r>
+        <w:t xml:space="preserve"> </w:t>
+      </w:r>
+      <w:r>
+        <w:t xml:space="preserve">versus baseline,</w:t>
+      </w:r>
+      <w:r>
+        <w:t xml:space="preserve"> </w:t>
+      </w:r>
+      <m:oMath>
+        <m:r>
+          <m:t>p</m:t>
+        </m:r>
+        <m:r>
+          <m:rPr>
+            <m:sty m:val="p"/>
+          </m:rPr>
+          <m:t>=</m:t>
+        </m:r>
+        <m:r>
+          <m:t>0.028</m:t>
+        </m:r>
+      </m:oMath>
+      <w:r>
+        <w:t xml:space="preserve"> </w:t>
+      </w:r>
+      <w:r>
+        <w:t xml:space="preserve">versus invariance).</w:t>
       </w:r>
     </w:p>
     <w:p>
@@ -2904,18 +4719,18 @@
           <wp:inline>
             <wp:extent cx="5943600" cy="1743456"/>
             <wp:effectExtent b="0" l="0" r="0" t="0"/>
-            <wp:docPr descr="Summary of results across fault types, backbones, and channels" title="" id="15" name="Picture"/>
+            <wp:docPr descr="Summary of results across fault types, backbones, and channels" title="" id="16" name="Picture"/>
             <a:graphic>
               <a:graphicData uri="http://schemas.openxmlformats.org/drawingml/2006/picture">
                 <pic:pic>
                   <pic:nvPicPr>
-                    <pic:cNvPr descr="figures/fig_summary.png" id="16" name="Picture"/>
+                    <pic:cNvPr descr="figures/fig_summary.png" id="17" name="Picture"/>
                     <pic:cNvPicPr>
                       <a:picLocks noChangeArrowheads="1" noChangeAspect="1"/>
                     </pic:cNvPicPr>
                   </pic:nvPicPr>
                   <pic:blipFill>
-                    <a:blip r:embed="rId14"/>
+                    <a:blip r:embed="rId15"/>
                     <a:stretch>
                       <a:fillRect/>
                     </a:stretch>
@@ -3287,7 +5102,7 @@
                 <w:rFonts w:ascii="Georgia" w:hAnsi="Georgia"/>
                 <w:sz w:val="19"/>
               </w:rPr>
-              <w:t xml:space="preserve">0.957 / 0.897</w:t>
+              <w:t xml:space="preserve">0.956 / 0.897</w:t>
             </w:r>
           </w:p>
         </w:tc>
@@ -3316,7 +5131,7 @@
                 <w:rFonts w:ascii="Georgia" w:hAnsi="Georgia"/>
                 <w:sz w:val="19"/>
               </w:rPr>
-              <w:t xml:space="preserve">0.959 / 0.835</w:t>
+              <w:t xml:space="preserve">0.954 / 0.835</w:t>
             </w:r>
           </w:p>
         </w:tc>
@@ -3345,7 +5160,7 @@
                 <w:rFonts w:ascii="Georgia" w:hAnsi="Georgia"/>
                 <w:sz w:val="19"/>
               </w:rPr>
-              <w:t xml:space="preserve">0.990 / 0.937</w:t>
+              <w:t xml:space="preserve">0.989 / 0.937</w:t>
             </w:r>
           </w:p>
         </w:tc>
@@ -4082,113 +5897,228 @@
           <w:b/>
           <w:bCs/>
         </w:rPr>
-        <w:t xml:space="preserve">Mechanism control.</w:t>
-      </w:r>
-      <w:r>
-        <w:t xml:space="preserve"> </w:t>
-      </w:r>
-      <w:r>
-        <w:t xml:space="preserve">The covariate-shuffle control confirms causation. Detrending healthy-test windows with their true</w:t>
-      </w:r>
-      <w:r>
-        <w:t xml:space="preserve"> </w:t>
-      </w:r>
-      <w:r>
-        <w:t xml:space="preserve">speeds gives AUC 0.961; detrending the same windows with randomly permuted speed labels collapses</w:t>
-      </w:r>
-      <w:r>
-        <w:t xml:space="preserve"> </w:t>
-      </w:r>
-      <w:r>
-        <w:t xml:space="preserve">it to 0.419, with the mean healthy score rising accordingly. The gain is the speed-conditioning, not</w:t>
-      </w:r>
-      <w:r>
-        <w:t xml:space="preserve"> </w:t>
-      </w:r>
-      <w:r>
-        <w:t xml:space="preserve">the detrending operation. The normal-versus-normal null sits at 0.50 for all methods, confirming the</w:t>
-      </w:r>
-      <w:r>
-        <w:t xml:space="preserve"> </w:t>
-      </w:r>
-      <w:r>
-        <w:t xml:space="preserve">detectors do not key on the train/test split.</w:t>
+        <w:t xml:space="preserve">Ablations: neighbourhood size and continuous versus discrete conditioning.</w:t>
+      </w:r>
+      <w:r>
+        <w:t xml:space="preserve"> </w:t>
+      </w:r>
+      <w:r>
+        <w:t xml:space="preserve">Figure 2 examines the</w:t>
+      </w:r>
+      <w:r>
+        <w:t xml:space="preserve"> </w:t>
+      </w:r>
+      <w:r>
+        <w:t xml:space="preserve">method's single hyperparameter and its central design choice. The neighbourhood size</w:t>
+      </w:r>
+      <w:r>
+        <w:t xml:space="preserve"> </w:t>
+      </w:r>
+      <m:oMath>
+        <m:r>
+          <m:t>k</m:t>
+        </m:r>
+      </m:oMath>
+      <w:r>
+        <w:t xml:space="preserve"> </w:t>
+      </w:r>
+      <w:r>
+        <w:t xml:space="preserve">has a broad</w:t>
+      </w:r>
+      <w:r>
+        <w:t xml:space="preserve"> </w:t>
+      </w:r>
+      <w:r>
+        <w:t xml:space="preserve">optimum: matched-speed AUC peaks near</w:t>
+      </w:r>
+      <w:r>
+        <w:t xml:space="preserve"> </w:t>
+      </w:r>
+      <m:oMath>
+        <m:r>
+          <m:t>k</m:t>
+        </m:r>
+        <m:r>
+          <m:rPr>
+            <m:sty m:val="p"/>
+          </m:rPr>
+          <m:t>=</m:t>
+        </m:r>
+        <m:r>
+          <m:t>5</m:t>
+        </m:r>
+      </m:oMath>
+      <w:r>
+        <w:t xml:space="preserve"> </w:t>
+      </w:r>
+      <w:r>
+        <w:t xml:space="preserve">and held-out AUC is flat over</w:t>
+      </w:r>
+      <w:r>
+        <w:t xml:space="preserve"> </w:t>
+      </w:r>
+      <m:oMath>
+        <m:r>
+          <m:t>k</m:t>
+        </m:r>
+        <m:r>
+          <m:rPr>
+            <m:sty m:val="p"/>
+          </m:rPr>
+          <m:t>∈</m:t>
+        </m:r>
+        <m:r>
+          <m:rPr>
+            <m:sty m:val="p"/>
+          </m:rPr>
+          <m:t>[</m:t>
+        </m:r>
+        <m:r>
+          <m:t>5</m:t>
+        </m:r>
+        <m:r>
+          <m:rPr>
+            <m:sty m:val="p"/>
+          </m:rPr>
+          <m:t>,</m:t>
+        </m:r>
+        <m:r>
+          <m:t>50</m:t>
+        </m:r>
+        <m:r>
+          <m:rPr>
+            <m:sty m:val="p"/>
+          </m:rPr>
+          <m:t>]</m:t>
+        </m:r>
+      </m:oMath>
+      <w:r>
+        <w:t xml:space="preserve"> </w:t>
+      </w:r>
+      <w:r>
+        <w:t xml:space="preserve">(panel b). At</w:t>
+      </w:r>
+      <w:r>
+        <w:t xml:space="preserve"> </w:t>
+      </w:r>
+      <w:r>
+        <w:t xml:space="preserve">the degenerate limit</w:t>
+      </w:r>
+      <w:r>
+        <w:t xml:space="preserve"> </w:t>
+      </w:r>
+      <m:oMath>
+        <m:r>
+          <m:t>k</m:t>
+        </m:r>
+        <m:r>
+          <m:rPr>
+            <m:sty m:val="p"/>
+          </m:rPr>
+          <m:t>=</m:t>
+        </m:r>
+        <m:r>
+          <m:t>n</m:t>
+        </m:r>
+      </m:oMath>
+      <w:r>
+        <w:t xml:space="preserve"> </w:t>
+      </w:r>
+      <w:r>
+        <w:t xml:space="preserve">the conditional mean becomes the global mean and the detector reproduces the</w:t>
+      </w:r>
+      <w:r>
+        <w:t xml:space="preserve"> </w:t>
+      </w:r>
+      <w:r>
+        <w:t xml:space="preserve">unconditional baseline to three decimals (0.956 / 0.897), a built-in consistency check that the</w:t>
+      </w:r>
+      <w:r>
+        <w:t xml:space="preserve"> </w:t>
+      </w:r>
+      <w:r>
+        <w:t xml:space="preserve">implementation passes. Panel (c) and Table 4 answer the question the novelty claim raises: is a</w:t>
+      </w:r>
+      <w:r>
+        <w:t xml:space="preserve"> </w:t>
+      </w:r>
+      <w:r>
+        <w:t xml:space="preserve">continuous covariate necessary, or does any conditioning suffice? Binning the speed into 4, 8, or 16 bins</w:t>
+      </w:r>
+      <w:r>
+        <w:t xml:space="preserve"> </w:t>
+      </w:r>
+      <w:r>
+        <w:t xml:space="preserve">and subtracting the per-bin mean already improves over the unconditional baseline (0.955 to 0.980 matched</w:t>
+      </w:r>
+      <w:r>
+        <w:t xml:space="preserve"> </w:t>
+      </w:r>
+      <w:r>
+        <w:t xml:space="preserve">as the bins refine), which shows conditioning helps at all; continuous nearest-neighbour conditioning then</w:t>
+      </w:r>
+      <w:r>
+        <w:t xml:space="preserve"> </w:t>
+      </w:r>
+      <w:r>
+        <w:t xml:space="preserve">improves further to 0.989, above the finest binning, which shows the continuous covariate carries value a</w:t>
+      </w:r>
+      <w:r>
+        <w:t xml:space="preserve"> </w:t>
+      </w:r>
+      <w:r>
+        <w:t xml:space="preserve">discrete domain label does not.</w:t>
       </w:r>
     </w:p>
     <w:p>
       <w:pPr>
         <w:pStyle w:val="BodyText"/>
-        <w:jc w:val="both"/>
-        <w:keepNext w:val="0"/>
-        <w:keepLines w:val="0"/>
+        <w:jc w:val="center"/>
+        <w:keepNext/>
+        <w:keepLines/>
         <w:widowControl w:val="1"/>
       </w:pPr>
       <w:r>
-        <w:rPr>
-          <w:b/>
-          <w:bCs/>
-        </w:rPr>
-        <w:t xml:space="preserve">A second dataset and a discrete covariate.</w:t>
-      </w:r>
-      <w:r>
-        <w:t xml:space="preserve"> </w:t>
-      </w:r>
-      <w:r>
-        <w:t xml:space="preserve">The principle is not specific to MaFaulDa or to a</w:t>
-      </w:r>
-      <w:r>
-        <w:t xml:space="preserve"> </w:t>
-      </w:r>
-      <w:r>
-        <w:t xml:space="preserve">continuous covariate. On MIMII-DG [5], the DCASE 2022 domain-generalization benchmark of machine</w:t>
-      </w:r>
-      <w:r>
-        <w:t xml:space="preserve"> </w:t>
-      </w:r>
-      <w:r>
-        <w:t xml:space="preserve">sounds, each machine provides an operating attribute and a source/target domain split; we condition a</w:t>
-      </w:r>
-      <w:r>
-        <w:t xml:space="preserve"> </w:t>
-      </w:r>
-      <w:r>
-        <w:t xml:space="preserve">log-mel reconstruction detector on that attribute. Table 4 reports the bearing machine, whose</w:t>
-      </w:r>
-      <w:r>
-        <w:t xml:space="preserve"> </w:t>
-      </w:r>
-      <w:r>
-        <w:t xml:space="preserve">attribute is a continuous rotation speed, and the valve machine, whose attribute is a discrete operation</w:t>
-      </w:r>
-      <w:r>
-        <w:t xml:space="preserve"> </w:t>
-      </w:r>
-      <w:r>
-        <w:t xml:space="preserve">pattern. Conditioning improves both domains for both machines, and most sharply on the shifted target</w:t>
-      </w:r>
-      <w:r>
-        <w:t xml:space="preserve"> </w:t>
-      </w:r>
-      <w:r>
-        <w:t xml:space="preserve">domain: valve target detection, which the unconditional detector drives below chance (0.376) because the</w:t>
-      </w:r>
-      <w:r>
-        <w:t xml:space="preserve"> </w:t>
-      </w:r>
-      <w:r>
-        <w:t xml:space="preserve">domain shift makes target-normal sound anomalous, is restored to 0.632 by conditioning on the operation</w:t>
-      </w:r>
-      <w:r>
-        <w:t xml:space="preserve"> </w:t>
-      </w:r>
-      <w:r>
-        <w:t xml:space="preserve">pattern. These are per-machine scores on a deliberately simple detector, reported to show the conditioning</w:t>
-      </w:r>
-      <w:r>
-        <w:t xml:space="preserve"> </w:t>
-      </w:r>
-      <w:r>
-        <w:t xml:space="preserve">principle transfers across datasets and covariate types, not to rank against the challenge leaderboard.</w:t>
+        <w:drawing>
+          <wp:inline>
+            <wp:extent cx="5943600" cy="1703832"/>
+            <wp:effectExtent b="0" l="0" r="0" t="0"/>
+            <wp:docPr descr="Held-out-speed degradation, k-sensitivity, and discrete-versus-continuous conditioning" title="" id="19" name="Picture"/>
+            <a:graphic>
+              <a:graphicData uri="http://schemas.openxmlformats.org/drawingml/2006/picture">
+                <pic:pic>
+                  <pic:nvPicPr>
+                    <pic:cNvPr descr="figures/fig_ablations.png" id="20" name="Picture"/>
+                    <pic:cNvPicPr>
+                      <a:picLocks noChangeArrowheads="1" noChangeAspect="1"/>
+                    </pic:cNvPicPr>
+                  </pic:nvPicPr>
+                  <pic:blipFill>
+                    <a:blip r:embed="rId18"/>
+                    <a:stretch>
+                      <a:fillRect/>
+                    </a:stretch>
+                  </pic:blipFill>
+                  <pic:spPr bwMode="auto">
+                    <a:xfrm>
+                      <a:off x="0" y="0"/>
+                      <a:ext cx="5943600" cy="1703832"/>
+                    </a:xfrm>
+                    <a:prstGeom prst="rect">
+                      <a:avLst/>
+                    </a:prstGeom>
+                    <a:noFill/>
+                    <a:ln w="9525">
+                      <a:noFill/>
+                      <a:headEnd/>
+                      <a:tailEnd/>
+                    </a:ln>
+                  </pic:spPr>
+                </pic:pic>
+              </a:graphicData>
+            </a:graphic>
+          </wp:inline>
+        </w:drawing>
       </w:r>
     </w:p>
     <w:p>
@@ -4200,6 +6130,56 @@
         <w:keepLines/>
         <w:widowControl w:val="1"/>
       </w:pPr>
+      <m:oMath>
+        <m:r>
+          <m:t>k</m:t>
+        </m:r>
+      </m:oMath>
+      <m:oMath>
+        <m:r>
+          <m:t>k</m:t>
+        </m:r>
+        <m:r>
+          <m:rPr>
+            <m:sty m:val="p"/>
+          </m:rPr>
+          <m:t>=</m:t>
+        </m:r>
+        <m:r>
+          <m:t>n</m:t>
+        </m:r>
+      </m:oMath>
+      <w:r>
+        <w:rPr>
+          <w:b/>
+          <w:i/>
+        </w:rPr>
+        <w:t>Figure 2.</w:t>
+      </w:r>
+      <w:r>
+        <w:rPr>
+          <w:b w:val="0"/>
+          <w:i/>
+        </w:rPr>
+        <w:t xml:space="preserve"> </w:t>
+      </w:r>
+      <w:r>
+        <w:rPr>
+          <w:b w:val="0"/>
+          <w:i/>
+        </w:rPr>
+        <w:t>(a) Held-out-speed degradation: conditioning holds above the baseline at every held-out band while invariance falls below it, most at low speed. (b) Sensitivity to the neighbourhood size ; the dotted line is the unconditional baseline, which  ("all") recovers. (c) Continuous nearest-neighbour conditioning exceeds discrete-bin conditioning at every bin count.</w:t>
+      </w:r>
+    </w:p>
+    <w:p>
+      <w:pPr>
+        <w:pStyle w:val="ImageCaption"/>
+        <w:spacing w:before="80" w:after="120" w:line="240" w:lineRule="auto"/>
+        <w:jc w:val="center"/>
+        <w:keepNext w:val="0"/>
+        <w:keepLines/>
+        <w:widowControl w:val="1"/>
+      </w:pPr>
       <w:r>
         <w:rPr>
           <w:b/>
@@ -4219,7 +6199,7 @@
           <w:b w:val="0"/>
           <w:i/>
         </w:rPr>
-        <w:t>Cross-dataset breadth on MIMII-DG (DCASE 2022 domain generalization), ROC-AUC. Conditioning on the operating attribute helps on both the source and the shifted target domain, for a continuous covariate (bearing rotation speed) and a discrete one (valve operation pattern).</w:t>
+        <w:t>Continuous versus discrete-bin conditioning, pooled ROC-AUC (matched / held-out speed). Conditioning on the continuous covariate exceeds conditioning on a binned version of it, the form the nearest prior work takes.</w:t>
       </w:r>
     </w:p>
     <w:tbl>
@@ -4228,7 +6208,727 @@
         <w:tblW w:type="pct" w:w="5000"/>
         <w:jc w:val="center"/>
         <w:tblLook w:firstRow="1" w:lastRow="0" w:firstColumn="0" w:lastColumn="0" w:noHBand="0" w:noVBand="0" w:val="0020"/>
-        <w:tblCaption w:val="Table 4. Cross-dataset breadth on MIMII-DG (DCASE 2022 domain generalization), ROC-AUC. Conditioning on the operating attribute helps on both the source and the shifted target domain, for a continuous covariate (bearing rotation speed) and a discrete one (valve operation pattern)."/>
+        <w:tblCaption w:val="Table 4. Continuous versus discrete-bin conditioning, pooled ROC-AUC (matched / held-out speed). Conditioning on the continuous covariate exceeds conditioning on a binned version of it, the form the nearest prior work takes."/>
+        <w:tblLayout w:type="autofit"/>
+        <w:tblBorders>
+          <w:top w:val="single" w:sz="10" w:color="4F6272"/>
+          <w:bottom w:val="single" w:sz="10" w:color="4F6272"/>
+          <w:insideH w:val="single" w:sz="5" w:color="9FB0C2"/>
+          <w:left w:val="single" w:sz="6" w:color="9FB0C2"/>
+          <w:right w:val="single" w:sz="6" w:color="9FB0C2"/>
+          <w:insideV w:val="single" w:sz="5" w:color="D9E1E8"/>
+        </w:tblBorders>
+      </w:tblPr>
+      <w:tblGrid>
+        <w:gridCol w:w="2640"/>
+        <w:gridCol w:w="2640"/>
+        <w:gridCol w:w="2640"/>
+      </w:tblGrid>
+      <w:tr>
+        <w:trPr>
+          <w:tblHeader w:val="on"/>
+        </w:trPr>
+        <w:tc>
+          <w:tcPr>
+            <w:shd w:fill="EEF3F7"/>
+            <w:tcBorders>
+              <w:left w:val="nil"/>
+              <w:right w:val="nil"/>
+              <w:top w:val="nil"/>
+              <w:bottom w:val="single" w:sz="8" w:color="9FB0C2"/>
+            </w:tcBorders>
+            <w:vAlign w:val="center"/>
+          </w:tcPr>
+          <w:p>
+            <w:pPr>
+              <w:pStyle w:val="Compact"/>
+              <w:spacing w:before="0" w:after="20" w:line="240" w:lineRule="auto"/>
+              <w:jc w:val="center"/>
+              <w:suppressAutoHyphens/>
+              <w:keepNext w:val="0"/>
+              <w:keepLines/>
+              <w:widowControl w:val="1"/>
+            </w:pPr>
+            <w:r>
+              <w:rPr>
+                <w:rFonts w:ascii="Georgia" w:hAnsi="Georgia"/>
+                <w:b/>
+                <w:sz w:val="19"/>
+              </w:rPr>
+              <w:t xml:space="preserve">Conditioning</w:t>
+            </w:r>
+          </w:p>
+        </w:tc>
+        <w:tc>
+          <w:tcPr>
+            <w:shd w:fill="EEF3F7"/>
+            <w:tcBorders>
+              <w:left w:val="nil"/>
+              <w:right w:val="nil"/>
+              <w:top w:val="nil"/>
+              <w:bottom w:val="single" w:sz="8" w:color="9FB0C2"/>
+            </w:tcBorders>
+            <w:vAlign w:val="center"/>
+          </w:tcPr>
+          <w:p>
+            <w:pPr>
+              <w:pStyle w:val="Compact"/>
+              <w:spacing w:before="0" w:after="20" w:line="240" w:lineRule="auto"/>
+              <w:jc w:val="center"/>
+              <w:suppressAutoHyphens/>
+              <w:keepNext w:val="0"/>
+              <w:keepLines/>
+              <w:widowControl w:val="1"/>
+            </w:pPr>
+            <w:r>
+              <w:rPr>
+                <w:rFonts w:ascii="Georgia" w:hAnsi="Georgia"/>
+                <w:b/>
+                <w:sz w:val="19"/>
+              </w:rPr>
+              <w:t xml:space="preserve">Matched</w:t>
+            </w:r>
+          </w:p>
+        </w:tc>
+        <w:tc>
+          <w:tcPr>
+            <w:shd w:fill="EEF3F7"/>
+            <w:tcBorders>
+              <w:left w:val="nil"/>
+              <w:right w:val="nil"/>
+              <w:top w:val="nil"/>
+              <w:bottom w:val="single" w:sz="8" w:color="9FB0C2"/>
+            </w:tcBorders>
+            <w:vAlign w:val="center"/>
+          </w:tcPr>
+          <w:p>
+            <w:pPr>
+              <w:pStyle w:val="Compact"/>
+              <w:spacing w:before="0" w:after="20" w:line="240" w:lineRule="auto"/>
+              <w:jc w:val="center"/>
+              <w:suppressAutoHyphens/>
+              <w:keepNext w:val="0"/>
+              <w:keepLines/>
+              <w:widowControl w:val="1"/>
+            </w:pPr>
+            <w:r>
+              <w:rPr>
+                <w:rFonts w:ascii="Georgia" w:hAnsi="Georgia"/>
+                <w:b/>
+                <w:sz w:val="19"/>
+              </w:rPr>
+              <w:t xml:space="preserve">Held-out</w:t>
+            </w:r>
+          </w:p>
+        </w:tc>
+      </w:tr>
+      <w:tr>
+        <w:tc>
+          <w:tcPr>
+            <w:tcBorders>
+              <w:left w:val="nil"/>
+              <w:right w:val="nil"/>
+              <w:top w:val="nil"/>
+              <w:bottom w:val="single" w:sz="4" w:color="D9E1E8"/>
+            </w:tcBorders>
+            <w:vAlign w:val="center"/>
+          </w:tcPr>
+          <w:p>
+            <w:pPr>
+              <w:pStyle w:val="Compact"/>
+              <w:spacing w:before="0" w:after="20" w:line="240" w:lineRule="auto"/>
+              <w:jc w:val="center"/>
+              <w:suppressAutoHyphens/>
+              <w:keepNext w:val="0"/>
+              <w:keepLines/>
+              <w:widowControl w:val="1"/>
+            </w:pPr>
+            <w:r>
+              <w:rPr>
+                <w:rFonts w:ascii="Georgia" w:hAnsi="Georgia"/>
+                <w:sz w:val="19"/>
+              </w:rPr>
+              <w:t xml:space="preserve">None (unconditional)</w:t>
+            </w:r>
+          </w:p>
+        </w:tc>
+        <w:tc>
+          <w:tcPr>
+            <w:tcBorders>
+              <w:left w:val="nil"/>
+              <w:right w:val="nil"/>
+              <w:top w:val="nil"/>
+              <w:bottom w:val="single" w:sz="4" w:color="D9E1E8"/>
+            </w:tcBorders>
+            <w:vAlign w:val="center"/>
+          </w:tcPr>
+          <w:p>
+            <w:pPr>
+              <w:pStyle w:val="Compact"/>
+              <w:spacing w:before="0" w:after="20" w:line="240" w:lineRule="auto"/>
+              <w:jc w:val="center"/>
+              <w:suppressAutoHyphens/>
+              <w:keepNext w:val="0"/>
+              <w:keepLines/>
+              <w:widowControl w:val="1"/>
+            </w:pPr>
+            <w:r>
+              <w:rPr>
+                <w:rFonts w:ascii="Georgia" w:hAnsi="Georgia"/>
+                <w:sz w:val="19"/>
+              </w:rPr>
+              <w:t xml:space="preserve">0.955</w:t>
+            </w:r>
+          </w:p>
+        </w:tc>
+        <w:tc>
+          <w:tcPr>
+            <w:tcBorders>
+              <w:left w:val="nil"/>
+              <w:right w:val="nil"/>
+              <w:top w:val="nil"/>
+              <w:bottom w:val="single" w:sz="4" w:color="D9E1E8"/>
+            </w:tcBorders>
+            <w:vAlign w:val="center"/>
+          </w:tcPr>
+          <w:p>
+            <w:pPr>
+              <w:pStyle w:val="Compact"/>
+              <w:spacing w:before="0" w:after="20" w:line="240" w:lineRule="auto"/>
+              <w:jc w:val="center"/>
+              <w:suppressAutoHyphens/>
+              <w:keepNext w:val="0"/>
+              <w:keepLines/>
+              <w:widowControl w:val="1"/>
+            </w:pPr>
+            <w:r>
+              <w:rPr>
+                <w:rFonts w:ascii="Georgia" w:hAnsi="Georgia"/>
+                <w:sz w:val="19"/>
+              </w:rPr>
+              <w:t xml:space="preserve">0.897</w:t>
+            </w:r>
+          </w:p>
+        </w:tc>
+      </w:tr>
+      <w:tr>
+        <w:tc>
+          <w:tcPr>
+            <w:tcBorders>
+              <w:left w:val="nil"/>
+              <w:right w:val="nil"/>
+              <w:top w:val="nil"/>
+              <w:bottom w:val="single" w:sz="4" w:color="D9E1E8"/>
+            </w:tcBorders>
+            <w:vAlign w:val="center"/>
+          </w:tcPr>
+          <w:p>
+            <w:pPr>
+              <w:pStyle w:val="Compact"/>
+              <w:spacing w:before="0" w:after="20" w:line="240" w:lineRule="auto"/>
+              <w:jc w:val="center"/>
+              <w:suppressAutoHyphens/>
+              <w:keepNext w:val="0"/>
+              <w:keepLines/>
+              <w:widowControl w:val="1"/>
+            </w:pPr>
+            <w:r>
+              <w:rPr>
+                <w:rFonts w:ascii="Georgia" w:hAnsi="Georgia"/>
+                <w:sz w:val="19"/>
+              </w:rPr>
+              <w:t xml:space="preserve">Discrete, 4 bins</w:t>
+            </w:r>
+          </w:p>
+        </w:tc>
+        <w:tc>
+          <w:tcPr>
+            <w:tcBorders>
+              <w:left w:val="nil"/>
+              <w:right w:val="nil"/>
+              <w:top w:val="nil"/>
+              <w:bottom w:val="single" w:sz="4" w:color="D9E1E8"/>
+            </w:tcBorders>
+            <w:vAlign w:val="center"/>
+          </w:tcPr>
+          <w:p>
+            <w:pPr>
+              <w:pStyle w:val="Compact"/>
+              <w:spacing w:before="0" w:after="20" w:line="240" w:lineRule="auto"/>
+              <w:jc w:val="center"/>
+              <w:suppressAutoHyphens/>
+              <w:keepNext w:val="0"/>
+              <w:keepLines/>
+              <w:widowControl w:val="1"/>
+            </w:pPr>
+            <w:r>
+              <w:rPr>
+                <w:rFonts w:ascii="Georgia" w:hAnsi="Georgia"/>
+                <w:sz w:val="19"/>
+              </w:rPr>
+              <w:t xml:space="preserve">0.969</w:t>
+            </w:r>
+          </w:p>
+        </w:tc>
+        <w:tc>
+          <w:tcPr>
+            <w:tcBorders>
+              <w:left w:val="nil"/>
+              <w:right w:val="nil"/>
+              <w:top w:val="nil"/>
+              <w:bottom w:val="single" w:sz="4" w:color="D9E1E8"/>
+            </w:tcBorders>
+            <w:vAlign w:val="center"/>
+          </w:tcPr>
+          <w:p>
+            <w:pPr>
+              <w:pStyle w:val="Compact"/>
+              <w:spacing w:before="0" w:after="20" w:line="240" w:lineRule="auto"/>
+              <w:jc w:val="center"/>
+              <w:suppressAutoHyphens/>
+              <w:keepNext w:val="0"/>
+              <w:keepLines/>
+              <w:widowControl w:val="1"/>
+            </w:pPr>
+            <w:r>
+              <w:rPr>
+                <w:rFonts w:ascii="Georgia" w:hAnsi="Georgia"/>
+                <w:sz w:val="19"/>
+              </w:rPr>
+              <w:t xml:space="preserve">0.917</w:t>
+            </w:r>
+          </w:p>
+        </w:tc>
+      </w:tr>
+      <w:tr>
+        <w:tc>
+          <w:tcPr>
+            <w:tcBorders>
+              <w:left w:val="nil"/>
+              <w:right w:val="nil"/>
+              <w:top w:val="nil"/>
+              <w:bottom w:val="single" w:sz="4" w:color="D9E1E8"/>
+            </w:tcBorders>
+            <w:vAlign w:val="center"/>
+          </w:tcPr>
+          <w:p>
+            <w:pPr>
+              <w:pStyle w:val="Compact"/>
+              <w:spacing w:before="0" w:after="20" w:line="240" w:lineRule="auto"/>
+              <w:jc w:val="center"/>
+              <w:suppressAutoHyphens/>
+              <w:keepNext w:val="0"/>
+              <w:keepLines/>
+              <w:widowControl w:val="1"/>
+            </w:pPr>
+            <w:r>
+              <w:rPr>
+                <w:rFonts w:ascii="Georgia" w:hAnsi="Georgia"/>
+                <w:sz w:val="19"/>
+              </w:rPr>
+              <w:t xml:space="preserve">Discrete, 8 bins</w:t>
+            </w:r>
+          </w:p>
+        </w:tc>
+        <w:tc>
+          <w:tcPr>
+            <w:tcBorders>
+              <w:left w:val="nil"/>
+              <w:right w:val="nil"/>
+              <w:top w:val="nil"/>
+              <w:bottom w:val="single" w:sz="4" w:color="D9E1E8"/>
+            </w:tcBorders>
+            <w:vAlign w:val="center"/>
+          </w:tcPr>
+          <w:p>
+            <w:pPr>
+              <w:pStyle w:val="Compact"/>
+              <w:spacing w:before="0" w:after="20" w:line="240" w:lineRule="auto"/>
+              <w:jc w:val="center"/>
+              <w:suppressAutoHyphens/>
+              <w:keepNext w:val="0"/>
+              <w:keepLines/>
+              <w:widowControl w:val="1"/>
+            </w:pPr>
+            <w:r>
+              <w:rPr>
+                <w:rFonts w:ascii="Georgia" w:hAnsi="Georgia"/>
+                <w:sz w:val="19"/>
+              </w:rPr>
+              <w:t xml:space="preserve">0.974</w:t>
+            </w:r>
+          </w:p>
+        </w:tc>
+        <w:tc>
+          <w:tcPr>
+            <w:tcBorders>
+              <w:left w:val="nil"/>
+              <w:right w:val="nil"/>
+              <w:top w:val="nil"/>
+              <w:bottom w:val="single" w:sz="4" w:color="D9E1E8"/>
+            </w:tcBorders>
+            <w:vAlign w:val="center"/>
+          </w:tcPr>
+          <w:p>
+            <w:pPr>
+              <w:pStyle w:val="Compact"/>
+              <w:spacing w:before="0" w:after="20" w:line="240" w:lineRule="auto"/>
+              <w:jc w:val="center"/>
+              <w:suppressAutoHyphens/>
+              <w:keepNext w:val="0"/>
+              <w:keepLines/>
+              <w:widowControl w:val="1"/>
+            </w:pPr>
+            <w:r>
+              <w:rPr>
+                <w:rFonts w:ascii="Georgia" w:hAnsi="Georgia"/>
+                <w:sz w:val="19"/>
+              </w:rPr>
+              <w:t xml:space="preserve">0.928</w:t>
+            </w:r>
+          </w:p>
+        </w:tc>
+      </w:tr>
+      <w:tr>
+        <w:tc>
+          <w:tcPr>
+            <w:tcBorders>
+              <w:left w:val="nil"/>
+              <w:right w:val="nil"/>
+              <w:top w:val="nil"/>
+              <w:bottom w:val="single" w:sz="4" w:color="D9E1E8"/>
+            </w:tcBorders>
+            <w:vAlign w:val="center"/>
+          </w:tcPr>
+          <w:p>
+            <w:pPr>
+              <w:pStyle w:val="Compact"/>
+              <w:spacing w:before="0" w:after="20" w:line="240" w:lineRule="auto"/>
+              <w:jc w:val="center"/>
+              <w:suppressAutoHyphens/>
+              <w:keepNext w:val="0"/>
+              <w:keepLines/>
+              <w:widowControl w:val="1"/>
+            </w:pPr>
+            <w:r>
+              <w:rPr>
+                <w:rFonts w:ascii="Georgia" w:hAnsi="Georgia"/>
+                <w:sz w:val="19"/>
+              </w:rPr>
+              <w:t xml:space="preserve">Discrete, 16 bins</w:t>
+            </w:r>
+          </w:p>
+        </w:tc>
+        <w:tc>
+          <w:tcPr>
+            <w:tcBorders>
+              <w:left w:val="nil"/>
+              <w:right w:val="nil"/>
+              <w:top w:val="nil"/>
+              <w:bottom w:val="single" w:sz="4" w:color="D9E1E8"/>
+            </w:tcBorders>
+            <w:vAlign w:val="center"/>
+          </w:tcPr>
+          <w:p>
+            <w:pPr>
+              <w:pStyle w:val="Compact"/>
+              <w:spacing w:before="0" w:after="20" w:line="240" w:lineRule="auto"/>
+              <w:jc w:val="center"/>
+              <w:suppressAutoHyphens/>
+              <w:keepNext w:val="0"/>
+              <w:keepLines/>
+              <w:widowControl w:val="1"/>
+            </w:pPr>
+            <w:r>
+              <w:rPr>
+                <w:rFonts w:ascii="Georgia" w:hAnsi="Georgia"/>
+                <w:sz w:val="19"/>
+              </w:rPr>
+              <w:t xml:space="preserve">0.980</w:t>
+            </w:r>
+          </w:p>
+        </w:tc>
+        <w:tc>
+          <w:tcPr>
+            <w:tcBorders>
+              <w:left w:val="nil"/>
+              <w:right w:val="nil"/>
+              <w:top w:val="nil"/>
+              <w:bottom w:val="single" w:sz="4" w:color="D9E1E8"/>
+            </w:tcBorders>
+            <w:vAlign w:val="center"/>
+          </w:tcPr>
+          <w:p>
+            <w:pPr>
+              <w:pStyle w:val="Compact"/>
+              <w:spacing w:before="0" w:after="20" w:line="240" w:lineRule="auto"/>
+              <w:jc w:val="center"/>
+              <w:suppressAutoHyphens/>
+              <w:keepNext w:val="0"/>
+              <w:keepLines/>
+              <w:widowControl w:val="1"/>
+            </w:pPr>
+            <w:r>
+              <w:rPr>
+                <w:rFonts w:ascii="Georgia" w:hAnsi="Georgia"/>
+                <w:sz w:val="19"/>
+              </w:rPr>
+              <w:t xml:space="preserve">0.922</w:t>
+            </w:r>
+          </w:p>
+        </w:tc>
+      </w:tr>
+      <w:tr>
+        <w:tc>
+          <w:tcPr>
+            <w:tcBorders>
+              <w:left w:val="nil"/>
+              <w:right w:val="nil"/>
+              <w:top w:val="nil"/>
+              <w:bottom w:val="nil"/>
+            </w:tcBorders>
+            <w:vAlign w:val="center"/>
+          </w:tcPr>
+          <w:p>
+            <w:pPr>
+              <w:pStyle w:val="Compact"/>
+              <w:spacing w:before="0" w:after="20" w:line="240" w:lineRule="auto"/>
+              <w:jc w:val="center"/>
+              <w:suppressAutoHyphens/>
+              <w:keepNext w:val="0"/>
+              <w:keepLines/>
+              <w:widowControl w:val="1"/>
+            </w:pPr>
+            <w:r>
+              <w:rPr>
+                <w:rFonts w:ascii="Georgia" w:hAnsi="Georgia"/>
+                <w:sz w:val="19"/>
+              </w:rPr>
+              <w:t xml:space="preserve">Continuous (nearest-neighbour)</w:t>
+            </w:r>
+          </w:p>
+        </w:tc>
+        <w:tc>
+          <w:tcPr>
+            <w:tcBorders>
+              <w:left w:val="nil"/>
+              <w:right w:val="nil"/>
+              <w:top w:val="nil"/>
+              <w:bottom w:val="nil"/>
+            </w:tcBorders>
+            <w:vAlign w:val="center"/>
+          </w:tcPr>
+          <w:p>
+            <w:pPr>
+              <w:pStyle w:val="Compact"/>
+              <w:spacing w:before="0" w:after="20" w:line="240" w:lineRule="auto"/>
+              <w:jc w:val="center"/>
+              <w:suppressAutoHyphens/>
+              <w:keepNext w:val="0"/>
+              <w:keepLines/>
+              <w:widowControl w:val="1"/>
+            </w:pPr>
+            <w:r>
+              <w:rPr>
+                <w:rFonts w:ascii="Georgia" w:hAnsi="Georgia"/>
+                <w:sz w:val="19"/>
+              </w:rPr>
+              <w:t xml:space="preserve">0.989</w:t>
+            </w:r>
+          </w:p>
+        </w:tc>
+        <w:tc>
+          <w:tcPr>
+            <w:tcBorders>
+              <w:left w:val="nil"/>
+              <w:right w:val="nil"/>
+              <w:top w:val="nil"/>
+              <w:bottom w:val="nil"/>
+            </w:tcBorders>
+            <w:vAlign w:val="center"/>
+          </w:tcPr>
+          <w:p>
+            <w:pPr>
+              <w:pStyle w:val="Compact"/>
+              <w:spacing w:before="0" w:after="20" w:line="240" w:lineRule="auto"/>
+              <w:jc w:val="center"/>
+              <w:suppressAutoHyphens/>
+              <w:keepNext w:val="0"/>
+              <w:keepLines/>
+              <w:widowControl w:val="1"/>
+            </w:pPr>
+            <w:r>
+              <w:rPr>
+                <w:rFonts w:ascii="Georgia" w:hAnsi="Georgia"/>
+                <w:sz w:val="19"/>
+              </w:rPr>
+              <w:t xml:space="preserve">0.937</w:t>
+            </w:r>
+          </w:p>
+        </w:tc>
+      </w:tr>
+    </w:tbl>
+    <w:p>
+      <w:pPr>
+        <w:pStyle w:val="BodyText"/>
+        <w:spacing w:before="240"/>
+        <w:jc w:val="both"/>
+        <w:keepNext w:val="0"/>
+        <w:keepLines w:val="0"/>
+        <w:widowControl w:val="1"/>
+      </w:pPr>
+      <w:r>
+        <w:rPr>
+          <w:b/>
+          <w:bCs/>
+        </w:rPr>
+        <w:t xml:space="preserve">Mechanism control.</w:t>
+      </w:r>
+      <w:r>
+        <w:t xml:space="preserve"> </w:t>
+      </w:r>
+      <w:r>
+        <w:t xml:space="preserve">A covariate-shuffle control establishes that the gain requires the true speed labels, not merely the</w:t>
+      </w:r>
+      <w:r>
+        <w:t xml:space="preserve"> </w:t>
+      </w:r>
+      <w:r>
+        <w:t xml:space="preserve">detrending operation. On the primary configuration, detrending healthy-test windows with their true</w:t>
+      </w:r>
+      <w:r>
+        <w:t xml:space="preserve"> </w:t>
+      </w:r>
+      <w:r>
+        <w:t xml:space="preserve">speeds gives AUC 0.961; detrending the same windows with randomly permuted speed labels collapses</w:t>
+      </w:r>
+      <w:r>
+        <w:t xml:space="preserve"> </w:t>
+      </w:r>
+      <w:r>
+        <w:t xml:space="preserve">it to 0.419, with the mean healthy score rising accordingly. The normal-versus-normal null sits at 0.50 for all methods, confirming the</w:t>
+      </w:r>
+      <w:r>
+        <w:t xml:space="preserve"> </w:t>
+      </w:r>
+      <w:r>
+        <w:t xml:space="preserve">detectors do not key on the train/test split.</w:t>
+      </w:r>
+    </w:p>
+    <w:p>
+      <w:pPr>
+        <w:pStyle w:val="BodyText"/>
+        <w:jc w:val="both"/>
+        <w:keepNext w:val="0"/>
+        <w:keepLines w:val="0"/>
+        <w:widowControl w:val="1"/>
+      </w:pPr>
+      <w:r>
+        <w:rPr>
+          <w:b/>
+          <w:bCs/>
+        </w:rPr>
+        <w:t xml:space="preserve">A second dataset and a discrete covariate.</w:t>
+      </w:r>
+      <w:r>
+        <w:t xml:space="preserve"> </w:t>
+      </w:r>
+      <w:r>
+        <w:t xml:space="preserve">The principle is not specific to MaFaulDa or to a</w:t>
+      </w:r>
+      <w:r>
+        <w:t xml:space="preserve"> </w:t>
+      </w:r>
+      <w:r>
+        <w:t xml:space="preserve">continuous covariate. On MIMII-DG [5], the DCASE 2022 domain-generalization benchmark of machine</w:t>
+      </w:r>
+      <w:r>
+        <w:t xml:space="preserve"> </w:t>
+      </w:r>
+      <w:r>
+        <w:t xml:space="preserve">sounds, each machine provides an operating attribute and a source/target domain split; we condition a</w:t>
+      </w:r>
+      <w:r>
+        <w:t xml:space="preserve"> </w:t>
+      </w:r>
+      <w:r>
+        <w:t xml:space="preserve">log-mel reconstruction detector on that attribute. Table 5 reports the bearing machine, whose</w:t>
+      </w:r>
+      <w:r>
+        <w:t xml:space="preserve"> </w:t>
+      </w:r>
+      <w:r>
+        <w:t xml:space="preserve">attribute is a continuous rotation speed, and the valve machine, whose attribute is a discrete operation</w:t>
+      </w:r>
+      <w:r>
+        <w:t xml:space="preserve"> </w:t>
+      </w:r>
+      <w:r>
+        <w:t xml:space="preserve">pattern. Conditioning improves both domains for both machines, and most sharply on the shifted target</w:t>
+      </w:r>
+      <w:r>
+        <w:t xml:space="preserve"> </w:t>
+      </w:r>
+      <w:r>
+        <w:t xml:space="preserve">domain: valve target detection, which the unconditional detector drives below chance (0.376) because the</w:t>
+      </w:r>
+      <w:r>
+        <w:t xml:space="preserve"> </w:t>
+      </w:r>
+      <w:r>
+        <w:t xml:space="preserve">domain shift makes target-normal sound anomalous, is restored to 0.632 by conditioning on the operation</w:t>
+      </w:r>
+      <w:r>
+        <w:t xml:space="preserve"> </w:t>
+      </w:r>
+      <w:r>
+        <w:t xml:space="preserve">pattern. These are per-machine scores on a deliberately simple detector, reported to show the conditioning</w:t>
+      </w:r>
+      <w:r>
+        <w:t xml:space="preserve"> </w:t>
+      </w:r>
+      <w:r>
+        <w:t xml:space="preserve">principle transfers across datasets and covariate types, not to rank against the challenge leaderboard.</w:t>
+      </w:r>
+    </w:p>
+    <w:p>
+      <w:pPr>
+        <w:pStyle w:val="ImageCaption"/>
+        <w:spacing w:before="80" w:after="120" w:line="240" w:lineRule="auto"/>
+        <w:jc w:val="center"/>
+        <w:keepNext w:val="0"/>
+        <w:keepLines/>
+        <w:widowControl w:val="1"/>
+      </w:pPr>
+      <w:r>
+        <w:rPr>
+          <w:b/>
+          <w:i/>
+        </w:rPr>
+        <w:t>Table 5.</w:t>
+      </w:r>
+      <w:r>
+        <w:rPr>
+          <w:b w:val="0"/>
+          <w:i/>
+        </w:rPr>
+        <w:t xml:space="preserve"> </w:t>
+      </w:r>
+      <w:r>
+        <w:rPr>
+          <w:b w:val="0"/>
+          <w:i/>
+        </w:rPr>
+        <w:t>Cross-dataset breadth on MIMII-DG (DCASE 2022 domain generalization), ROC-AUC. Conditioning on the operating attribute helps on both the source and the shifted target domain, for a continuous covariate (bearing rotation speed) and a discrete one (valve operation pattern).</w:t>
+      </w:r>
+    </w:p>
+    <w:tbl>
+      <w:tblPr>
+        <w:tblStyle w:val="Table"/>
+        <w:tblW w:type="pct" w:w="5000"/>
+        <w:jc w:val="center"/>
+        <w:tblLook w:firstRow="1" w:lastRow="0" w:firstColumn="0" w:lastColumn="0" w:noHBand="0" w:noVBand="0" w:val="0020"/>
+        <w:tblCaption w:val="Table 5. Cross-dataset breadth on MIMII-DG (DCASE 2022 domain generalization), ROC-AUC. Conditioning on the operating attribute helps on both the source and the shifted target domain, for a continuous covariate (bearing rotation speed) and a discrete one (valve operation pattern)."/>
         <w:tblLayout w:type="autofit"/>
         <w:tblBorders>
           <w:top w:val="single" w:sz="10" w:color="4F6272"/>
@@ -4847,8 +7547,8 @@
         </w:tc>
       </w:tr>
     </w:tbl>
-    <w:bookmarkEnd w:id="17"/>
-    <w:bookmarkStart w:id="18" w:name="discussion-and-limitations"/>
+    <w:bookmarkEnd w:id="21"/>
+    <w:bookmarkStart w:id="22" w:name="discussion-and-limitations"/>
     <w:p>
       <w:pPr>
         <w:pStyle w:val="Heading2"/>
@@ -4857,7 +7557,7 @@
         <w:widowControl w:val="1"/>
       </w:pPr>
       <w:r>
-        <w:t xml:space="preserve">6  Discussion and limitations</w:t>
+        <w:t xml:space="preserve">7  Discussion and limitations</w:t>
       </w:r>
     </w:p>
     <w:p>
@@ -4905,6 +7605,88 @@
         <w:widowControl w:val="1"/>
       </w:pPr>
       <w:r>
+        <w:rPr>
+          <w:b/>
+          <w:bCs/>
+        </w:rPr>
+        <w:t xml:space="preserve">When conditioning helps, and when it cannot.</w:t>
+      </w:r>
+      <w:r>
+        <w:t xml:space="preserve"> </w:t>
+      </w:r>
+      <w:r>
+        <w:t xml:space="preserve">Conditioning interpolates the healthy manifold across the</w:t>
+      </w:r>
+      <w:r>
+        <w:t xml:space="preserve"> </w:t>
+      </w:r>
+      <w:r>
+        <w:t xml:space="preserve">operating range; it does not extrapolate beyond the speeds present in training. When the healthy training</w:t>
+      </w:r>
+      <w:r>
+        <w:t xml:space="preserve"> </w:t>
+      </w:r>
+      <w:r>
+        <w:t xml:space="preserve">data spans the operating range, as in the leave-one-band-out protocol where every held-out band is</w:t>
+      </w:r>
+      <w:r>
+        <w:t xml:space="preserve"> </w:t>
+      </w:r>
+      <w:r>
+        <w:t xml:space="preserve">bracketed by training speeds, the local mean at an unseen speed is a reliable interpolant and detection</w:t>
+      </w:r>
+      <w:r>
+        <w:t xml:space="preserve"> </w:t>
+      </w:r>
+      <w:r>
+        <w:t xml:space="preserve">improves. When training covers only a narrow band, the nearest-neighbour mean for a distant query is a</w:t>
+      </w:r>
+      <w:r>
+        <w:t xml:space="preserve"> </w:t>
+      </w:r>
+      <w:r>
+        <w:t xml:space="preserve">mismatched interpolant and conditioning offers no advantage there. This bounds the method precisely: it</w:t>
+      </w:r>
+      <w:r>
+        <w:t xml:space="preserve"> </w:t>
+      </w:r>
+      <w:r>
+        <w:t xml:space="preserve">needs healthy data across the operating envelope, which is the realistic condition for a machine monitored</w:t>
+      </w:r>
+      <w:r>
+        <w:t xml:space="preserve"> </w:t>
+      </w:r>
+      <w:r>
+        <w:t xml:space="preserve">over its duty cycle. The effect is visible in the per-band results, where the weakest conditioning gains</w:t>
+      </w:r>
+      <w:r>
+        <w:t xml:space="preserve"> </w:t>
+      </w:r>
+      <w:r>
+        <w:t xml:space="preserve">sit at the slowest band, the edge of the training support. We also note that the held-out-speed AUC is a</w:t>
+      </w:r>
+      <w:r>
+        <w:t xml:space="preserve"> </w:t>
+      </w:r>
+      <w:r>
+        <w:t xml:space="preserve">per-band average, each band scored independently, and is therefore a stricter per-operating-point measure</w:t>
+      </w:r>
+      <w:r>
+        <w:t xml:space="preserve"> </w:t>
+      </w:r>
+      <w:r>
+        <w:t xml:space="preserve">than the pooled matched-speed AUC rather than a directly comparable number.</w:t>
+      </w:r>
+    </w:p>
+    <w:p>
+      <w:pPr>
+        <w:pStyle w:val="BodyText"/>
+        <w:jc w:val="both"/>
+        <w:keepNext w:val="0"/>
+        <w:keepLines w:val="0"/>
+        <w:widowControl w:val="1"/>
+      </w:pPr>
+      <w:r>
         <w:t xml:space="preserve">The study is validated on the MaFaulDa test rig, where the operating condition is a single clean</w:t>
       </w:r>
       <w:r>
@@ -4935,23 +7717,17 @@
         <w:t xml:space="preserve"> </w:t>
       </w:r>
       <w:r>
-        <w:t xml:space="preserve">natural extension. These are directions for broadening the result, not caveats on it: within the studied</w:t>
-      </w:r>
-      <w:r>
-        <w:t xml:space="preserve"> </w:t>
-      </w:r>
-      <w:r>
-        <w:t xml:space="preserve">setting the effect is consistent across fault types, backbones, channels, a second dataset, and a causal</w:t>
-      </w:r>
-      <w:r>
-        <w:t xml:space="preserve"> </w:t>
-      </w:r>
-      <w:r>
-        <w:t xml:space="preserve">control.</w:t>
+        <w:t xml:space="preserve">natural extension. Within the studied setting the effect is consistent across fault types, backbones,</w:t>
+      </w:r>
+      <w:r>
+        <w:t xml:space="preserve"> </w:t>
+      </w:r>
+      <w:r>
+        <w:t xml:space="preserve">channels, a second dataset, and a causal control.</w:t>
       </w:r>
     </w:p>
-    <w:bookmarkEnd w:id="18"/>
-    <w:bookmarkStart w:id="20" w:name="references"/>
+    <w:bookmarkEnd w:id="22"/>
+    <w:bookmarkStart w:id="24" w:name="references"/>
     <w:p>
       <w:pPr>
         <w:pStyle w:val="ReferencesHeading"/>
@@ -4987,7 +7763,7 @@
       <w:r>
         <w:t xml:space="preserve"> </w:t>
       </w:r>
-      <w:hyperlink r:id="rId19">
+      <w:hyperlink r:id="rId23">
         <w:r>
           <w:rPr>
             <w:rStyle w:val="Hyperlink"/>
@@ -5275,11 +8051,72 @@
         <w:t xml:space="preserve">10. </w:t>
       </w:r>
       <w:r>
-        <w:t xml:space="preserve">Draft · results reproducible from the EngineKnock experiment registry (EXP-005–008).</w:t>
+        <w:t xml:space="preserve">[10] X. Song, M. Wu, C. Jermaine, S. Ranka. Conditional anomaly detection. IEEE</w:t>
+      </w:r>
+      <w:r>
+        <w:t xml:space="preserve"> </w:t>
+      </w:r>
+      <w:r>
+        <w:t xml:space="preserve">Transactions on Knowledge and Data Engineering, 19(5):631–645, 2007.</w:t>
       </w:r>
     </w:p>
-    <w:bookmarkEnd w:id="20"/>
-    <w:bookmarkEnd w:id="21"/>
+    <w:p>
+      <w:pPr>
+        <w:pStyle w:val="ReferenceEntry"/>
+        <w:spacing w:after="100"/>
+        <w:ind w:left="475" w:hanging="475"/>
+        <w:jc w:val="left"/>
+        <w:keepNext w:val="0"/>
+        <w:keepLines w:val="0"/>
+        <w:widowControl w:val="1"/>
+      </w:pPr>
+      <w:r>
+        <w:rPr>
+          <w:rFonts w:ascii="Georgia" w:hAnsi="Georgia"/>
+          <w:sz w:val="20"/>
+        </w:rPr>
+        <w:t xml:space="preserve">11. </w:t>
+      </w:r>
+      <w:r>
+        <w:rPr>
+          <w:b/>
+          <w:bCs/>
+        </w:rPr>
+        <w:t xml:space="preserve">Data and code.</w:t>
+      </w:r>
+      <w:r>
+        <w:t xml:space="preserve"> </w:t>
+      </w:r>
+      <w:r>
+        <w:t xml:space="preserve">MaFaulDa (SMT/COPPE/UFRJ) and MIMII-DG (Zenodo 10.5281/zenodo.6529888)</w:t>
+      </w:r>
+      <w:r>
+        <w:t xml:space="preserve"> </w:t>
+      </w:r>
+      <w:r>
+        <w:t xml:space="preserve">are public. Code, the experiment registry, and every result artifact are at</w:t>
+      </w:r>
+      <w:r>
+        <w:t xml:space="preserve"> </w:t>
+      </w:r>
+      <w:r>
+        <w:t xml:space="preserve">github.com/ApartsinProjects/EngineKnock; all headline numbers derive from a single consolidated</w:t>
+      </w:r>
+      <w:r>
+        <w:t xml:space="preserve"> </w:t>
+      </w:r>
+      <w:r>
+        <w:t xml:space="preserve">evaluation artifact.</w:t>
+      </w:r>
+      <w:r>
+        <w:br/>
+      </w:r>
+      <w:r>
+        <w:t xml:space="preserve">Draft · results reproducible from the EngineKnock experiment registry.</w:t>
+      </w:r>
+    </w:p>
+    <w:bookmarkEnd w:id="24"/>
+    <w:bookmarkEnd w:id="25"/>
     <w:sectPr>
       <w:footerReference w:type="default" r:id="rId9"/>
       <w:pgSz w:h="15840" w:w="12240"/>
@@ -5688,6 +8525,91 @@
       </w:rPr>
     </w:lvl>
   </w:abstractNum>
+  <w:abstractNum w:abstractNumId="99201">
+    <w:nsid w:val="00A99201"/>
+    <w:multiLevelType w:val="multilevel"/>
+    <w:lvl w:ilvl="0">
+      <w:start w:val="1"/>
+      <w:numFmt w:val="decimal"/>
+      <w:lvlText w:val="%1."/>
+      <w:lvlJc w:val="left"/>
+      <w:pPr>
+        <w:ind w:left="720" w:hanging="360"/>
+      </w:pPr>
+    </w:lvl>
+    <w:lvl w:ilvl="1">
+      <w:start w:val="1"/>
+      <w:numFmt w:val="lowerLetter"/>
+      <w:lvlText w:val="%2."/>
+      <w:lvlJc w:val="left"/>
+      <w:pPr>
+        <w:ind w:left="1440" w:hanging="360"/>
+      </w:pPr>
+    </w:lvl>
+    <w:lvl w:ilvl="2">
+      <w:start w:val="1"/>
+      <w:numFmt w:val="lowerRoman"/>
+      <w:lvlText w:val="%3."/>
+      <w:lvlJc w:val="left"/>
+      <w:pPr>
+        <w:ind w:left="2160" w:hanging="360"/>
+      </w:pPr>
+    </w:lvl>
+    <w:lvl w:ilvl="3">
+      <w:start w:val="1"/>
+      <w:numFmt w:val="decimal"/>
+      <w:lvlText w:val="%4."/>
+      <w:lvlJc w:val="left"/>
+      <w:pPr>
+        <w:ind w:left="2880" w:hanging="360"/>
+      </w:pPr>
+    </w:lvl>
+    <w:lvl w:ilvl="4">
+      <w:start w:val="1"/>
+      <w:numFmt w:val="lowerLetter"/>
+      <w:lvlText w:val="%5."/>
+      <w:lvlJc w:val="left"/>
+      <w:pPr>
+        <w:ind w:left="3600" w:hanging="360"/>
+      </w:pPr>
+    </w:lvl>
+    <w:lvl w:ilvl="5">
+      <w:start w:val="1"/>
+      <w:numFmt w:val="lowerRoman"/>
+      <w:lvlText w:val="%6."/>
+      <w:lvlJc w:val="left"/>
+      <w:pPr>
+        <w:ind w:left="4320" w:hanging="360"/>
+      </w:pPr>
+    </w:lvl>
+    <w:lvl w:ilvl="6">
+      <w:start w:val="1"/>
+      <w:numFmt w:val="decimal"/>
+      <w:lvlText w:val="%7."/>
+      <w:lvlJc w:val="left"/>
+      <w:pPr>
+        <w:ind w:left="5040" w:hanging="360"/>
+      </w:pPr>
+    </w:lvl>
+    <w:lvl w:ilvl="7">
+      <w:start w:val="1"/>
+      <w:numFmt w:val="lowerLetter"/>
+      <w:lvlText w:val="%8."/>
+      <w:lvlJc w:val="left"/>
+      <w:pPr>
+        <w:ind w:left="5760" w:hanging="360"/>
+      </w:pPr>
+    </w:lvl>
+    <w:lvl w:ilvl="8">
+      <w:start w:val="1"/>
+      <w:numFmt w:val="lowerRoman"/>
+      <w:lvlText w:val="%9."/>
+      <w:lvlJc w:val="left"/>
+      <w:pPr>
+        <w:ind w:left="6480" w:hanging="360"/>
+      </w:pPr>
+    </w:lvl>
+  </w:abstractNum>
   <w:num w:numId="1">
     <w:abstractNumId w:val="8"/>
   </w:num>
@@ -5720,6 +8642,36 @@
   </w:num>
   <w:num w:numId="1001">
     <w:abstractNumId w:val="991"/>
+  </w:num>
+  <w:num w:numId="1002">
+    <w:abstractNumId w:val="99201"/>
+    <w:lvlOverride w:ilvl="0">
+      <w:startOverride w:val="1"/>
+    </w:lvlOverride>
+    <w:lvlOverride w:ilvl="1">
+      <w:startOverride w:val="1"/>
+    </w:lvlOverride>
+    <w:lvlOverride w:ilvl="2">
+      <w:startOverride w:val="1"/>
+    </w:lvlOverride>
+    <w:lvlOverride w:ilvl="3">
+      <w:startOverride w:val="1"/>
+    </w:lvlOverride>
+    <w:lvlOverride w:ilvl="4">
+      <w:startOverride w:val="1"/>
+    </w:lvlOverride>
+    <w:lvlOverride w:ilvl="5">
+      <w:startOverride w:val="1"/>
+    </w:lvlOverride>
+    <w:lvlOverride w:ilvl="6">
+      <w:startOverride w:val="1"/>
+    </w:lvlOverride>
+    <w:lvlOverride w:ilvl="7">
+      <w:startOverride w:val="1"/>
+    </w:lvlOverride>
+    <w:lvlOverride w:ilvl="8">
+      <w:startOverride w:val="1"/>
+    </w:lvlOverride>
   </w:num>
 </w:numbering>
 </file>

</xml_diff>

<commit_message>
A5+A6: tuned-invariance defense + all-5-machine MIMII-DG
A5: sweeping the invariance detector (PCA rank 16-256, AE lat 16-64) leaves its held-out AUC
    <=0.837, still below the unconditional baseline (0.897); the limit is representational,
    not tuning. Defeats the under-tuned-strawman objection.
A6: MIMII-DG all 5 machines. Conditioning helps 4/5 (bearing/gearbox/slider/valve, both
    domains); fan (categorical noise-mix, not an operating covariate) is the expected exception.
    Table 5 expanded; scope framing added.

Co-Authored-By: Claude Opus 4.8 <noreply@anthropic.com>
</commit_message>
<xml_diff>
--- a/docs/EngineKnock_speed_conditional.docx
+++ b/docs/EngineKnock_speed_conditional.docx
@@ -4843,25 +4843,49 @@
         <w:t xml:space="preserve"> </w:t>
       </w:r>
       <w:r>
-        <w:t xml:space="preserve">speed shift (0.809), below the unconditional detector. Since the strongest recent speed-invariance</w:t>
-      </w:r>
-      <w:r>
-        <w:t xml:space="preserve"> </w:t>
-      </w:r>
-      <w:r>
-        <w:t xml:space="preserve">method for this setting, OASSL [9], is not publicly available, we take a deep autoencoder on</w:t>
-      </w:r>
-      <w:r>
-        <w:t xml:space="preserve"> </w:t>
-      </w:r>
-      <w:r>
-        <w:t xml:space="preserve">order-tracked features as its reproducible in-class representative; conditioning outperforms it at both</w:t>
-      </w:r>
-      <w:r>
-        <w:t xml:space="preserve"> </w:t>
-      </w:r>
-      <w:r>
-        <w:t xml:space="preserve">backbones.</w:t>
+        <w:t xml:space="preserve">speed shift (0.809), below the unconditional detector. Nor is this a matter of under-tuning the</w:t>
+      </w:r>
+      <w:r>
+        <w:t xml:space="preserve"> </w:t>
+      </w:r>
+      <w:r>
+        <w:t xml:space="preserve">invariance arm. Sweeping its detector, PCA rank from 16 to 256 and autoencoder latent width from 16 to</w:t>
+      </w:r>
+      <w:r>
+        <w:t xml:space="preserve"> </w:t>
+      </w:r>
+      <w:r>
+        <w:t xml:space="preserve">64, moves its held-out-speed AUC only within [0.78, 0.837]; the best configuration, 0.837, still sits</w:t>
+      </w:r>
+      <w:r>
+        <w:t xml:space="preserve"> </w:t>
+      </w:r>
+      <w:r>
+        <w:t xml:space="preserve">below the unconditional baseline (0.897), because the limitation is representational, order tracking</w:t>
+      </w:r>
+      <w:r>
+        <w:t xml:space="preserve"> </w:t>
+      </w:r>
+      <w:r>
+        <w:t xml:space="preserve">discards the fixed-frequency fault energy, not a matter of detector capacity. Since the strongest recent</w:t>
+      </w:r>
+      <w:r>
+        <w:t xml:space="preserve"> </w:t>
+      </w:r>
+      <w:r>
+        <w:t xml:space="preserve">speed-invariance method for this setting, OASSL [9], is not publicly available, we take an</w:t>
+      </w:r>
+      <w:r>
+        <w:t xml:space="preserve"> </w:t>
+      </w:r>
+      <w:r>
+        <w:t xml:space="preserve">order-tracked spectrum with a tuned reconstruction detector as its reproducible in-class representative;</w:t>
+      </w:r>
+      <w:r>
+        <w:t xml:space="preserve"> </w:t>
+      </w:r>
+      <w:r>
+        <w:t xml:space="preserve">conditioning outperforms it at both backbones and across the tuning sweep.</w:t>
       </w:r>
     </w:p>
     <w:p>
@@ -6828,67 +6852,97 @@
           <w:b/>
           <w:bCs/>
         </w:rPr>
-        <w:t xml:space="preserve">A second dataset and a discrete covariate.</w:t>
-      </w:r>
-      <w:r>
-        <w:t xml:space="preserve"> </w:t>
-      </w:r>
-      <w:r>
-        <w:t xml:space="preserve">The principle is not specific to MaFaulDa or to a</w:t>
-      </w:r>
-      <w:r>
-        <w:t xml:space="preserve"> </w:t>
-      </w:r>
-      <w:r>
-        <w:t xml:space="preserve">continuous covariate. On MIMII-DG [5], the DCASE 2022 domain-generalization benchmark of machine</w:t>
-      </w:r>
-      <w:r>
-        <w:t xml:space="preserve"> </w:t>
-      </w:r>
-      <w:r>
-        <w:t xml:space="preserve">sounds, each machine provides an operating attribute and a source/target domain split; we condition a</w:t>
-      </w:r>
-      <w:r>
-        <w:t xml:space="preserve"> </w:t>
-      </w:r>
-      <w:r>
-        <w:t xml:space="preserve">log-mel reconstruction detector on that attribute. Table 5 reports the bearing machine, whose</w:t>
-      </w:r>
-      <w:r>
-        <w:t xml:space="preserve"> </w:t>
-      </w:r>
-      <w:r>
-        <w:t xml:space="preserve">attribute is a continuous rotation speed, and the valve machine, whose attribute is a discrete operation</w:t>
-      </w:r>
-      <w:r>
-        <w:t xml:space="preserve"> </w:t>
-      </w:r>
-      <w:r>
-        <w:t xml:space="preserve">pattern. Conditioning improves both domains for both machines, and most sharply on the shifted target</w:t>
-      </w:r>
-      <w:r>
-        <w:t xml:space="preserve"> </w:t>
-      </w:r>
-      <w:r>
-        <w:t xml:space="preserve">domain: valve target detection, which the unconditional detector drives below chance (0.376) because the</w:t>
-      </w:r>
-      <w:r>
-        <w:t xml:space="preserve"> </w:t>
-      </w:r>
-      <w:r>
-        <w:t xml:space="preserve">domain shift makes target-normal sound anomalous, is restored to 0.632 by conditioning on the operation</w:t>
-      </w:r>
-      <w:r>
-        <w:t xml:space="preserve"> </w:t>
-      </w:r>
-      <w:r>
-        <w:t xml:space="preserve">pattern. These are per-machine scores on a deliberately simple detector, reported to show the conditioning</w:t>
-      </w:r>
-      <w:r>
-        <w:t xml:space="preserve"> </w:t>
-      </w:r>
-      <w:r>
-        <w:t xml:space="preserve">principle transfers across datasets and covariate types, not to rank against the challenge leaderboard.</w:t>
+        <w:t xml:space="preserve">A second dataset, and the scope of the operating covariate.</w:t>
+      </w:r>
+      <w:r>
+        <w:t xml:space="preserve"> </w:t>
+      </w:r>
+      <w:r>
+        <w:t xml:space="preserve">The principle is not specific to MaFaulDa.</w:t>
+      </w:r>
+      <w:r>
+        <w:t xml:space="preserve"> </w:t>
+      </w:r>
+      <w:r>
+        <w:t xml:space="preserve">On MIMII-DG [5], the DCASE 2022 domain-generalization benchmark of machine sounds, each machine</w:t>
+      </w:r>
+      <w:r>
+        <w:t xml:space="preserve"> </w:t>
+      </w:r>
+      <w:r>
+        <w:t xml:space="preserve">provides an operating attribute and a source/target domain split; we condition a log-mel reconstruction</w:t>
+      </w:r>
+      <w:r>
+        <w:t xml:space="preserve"> </w:t>
+      </w:r>
+      <w:r>
+        <w:t xml:space="preserve">detector on that attribute and evaluate all five machine types (Table 5). Conditioning improves both</w:t>
+      </w:r>
+      <w:r>
+        <w:t xml:space="preserve"> </w:t>
+      </w:r>
+      <w:r>
+        <w:t xml:space="preserve">domains on the four machines whose attribute is a genuine operating covariate: bearing rotation speed,</w:t>
+      </w:r>
+      <w:r>
+        <w:t xml:space="preserve"> </w:t>
+      </w:r>
+      <w:r>
+        <w:t xml:space="preserve">gearbox voltage, slider velocity, and the valve operation pattern. The gain is sharpest on the shifted</w:t>
+      </w:r>
+      <w:r>
+        <w:t xml:space="preserve"> </w:t>
+      </w:r>
+      <w:r>
+        <w:t xml:space="preserve">target domain: valve target detection, which the unconditional detector drives below chance (0.376)</w:t>
+      </w:r>
+      <w:r>
+        <w:t xml:space="preserve"> </w:t>
+      </w:r>
+      <w:r>
+        <w:t xml:space="preserve">because the domain shift makes target-normal sound anomalous, is restored to 0.632 by conditioning on the</w:t>
+      </w:r>
+      <w:r>
+        <w:t xml:space="preserve"> </w:t>
+      </w:r>
+      <w:r>
+        <w:t xml:space="preserve">operation pattern. The exception is the fan, whose domain attribute is a categorical mixture of background</w:t>
+      </w:r>
+      <w:r>
+        <w:t xml:space="preserve"> </w:t>
+      </w:r>
+      <w:r>
+        <w:t xml:space="preserve">machine noises rather than a machine operating state; there conditioning gives no benefit, which is the</w:t>
+      </w:r>
+      <w:r>
+        <w:t xml:space="preserve"> </w:t>
+      </w:r>
+      <w:r>
+        <w:t xml:space="preserve">expected boundary of the method. The pattern across machines is therefore consistent with the thesis:</w:t>
+      </w:r>
+      <w:r>
+        <w:t xml:space="preserve"> </w:t>
+      </w:r>
+      <w:r>
+        <w:t xml:space="preserve">conditioning helps when the covariate is a genuine operating condition, on both continuous covariates</w:t>
+      </w:r>
+      <w:r>
+        <w:t xml:space="preserve"> </w:t>
+      </w:r>
+      <w:r>
+        <w:t xml:space="preserve">(speed, voltage, velocity) and an ordinal discrete one (valve pattern). These per-machine source and</w:t>
+      </w:r>
+      <w:r>
+        <w:t xml:space="preserve"> </w:t>
+      </w:r>
+      <w:r>
+        <w:t xml:space="preserve">target AUCs isolate the conditioning effect on a deliberately simple detector; they are not a challenge</w:t>
+      </w:r>
+      <w:r>
+        <w:t xml:space="preserve"> </w:t>
+      </w:r>
+      <w:r>
+        <w:t xml:space="preserve">submission, whose official score aggregates AUC and partial AUC across all machines by harmonic mean.</w:t>
       </w:r>
     </w:p>
     <w:p>
@@ -6919,7 +6973,7 @@
           <w:b w:val="0"/>
           <w:i/>
         </w:rPr>
-        <w:t>Cross-dataset breadth on MIMII-DG (DCASE 2022 domain generalization), ROC-AUC. Conditioning on the operating attribute helps on both the source and the shifted target domain, for a continuous covariate (bearing rotation speed) and a discrete one (valve operation pattern).</w:t>
+        <w:t>Cross-dataset breadth on MIMII-DG (DCASE 2022 domain generalization), ROC-AUC per machine and domain. Conditioning helps on both domains for the four machines with a genuine operating covariate; the fan, whose attribute is a categorical background-noise mixture, is the expected exception.</w:t>
       </w:r>
     </w:p>
     <w:tbl>
@@ -6928,7 +6982,7 @@
         <w:tblW w:type="pct" w:w="5000"/>
         <w:jc w:val="center"/>
         <w:tblLook w:firstRow="1" w:lastRow="0" w:firstColumn="0" w:lastColumn="0" w:noHBand="0" w:noVBand="0" w:val="0020"/>
-        <w:tblCaption w:val="Table 5. Cross-dataset breadth on MIMII-DG (DCASE 2022 domain generalization), ROC-AUC. Conditioning on the operating attribute helps on both the source and the shifted target domain, for a continuous covariate (bearing rotation speed) and a discrete one (valve operation pattern)."/>
+        <w:tblCaption w:val="Table 5. Cross-dataset breadth on MIMII-DG (DCASE 2022 domain generalization), ROC-AUC per machine and domain. Conditioning helps on both domains for the four machines with a genuine operating covariate; the fan, whose attribute is a categorical background-noise mixture, is the expected exception."/>
         <w:tblLayout w:type="autofit"/>
         <w:tblBorders>
           <w:top w:val="single" w:sz="10" w:color="4F6272"/>
@@ -7336,6 +7390,478 @@
                 <w:rFonts w:ascii="Georgia" w:hAnsi="Georgia"/>
                 <w:sz w:val="19"/>
               </w:rPr>
+              <w:t xml:space="preserve">Gearbox (voltage)</w:t>
+            </w:r>
+          </w:p>
+        </w:tc>
+        <w:tc>
+          <w:tcPr>
+            <w:tcBorders>
+              <w:left w:val="nil"/>
+              <w:right w:val="nil"/>
+              <w:top w:val="nil"/>
+              <w:bottom w:val="single" w:sz="4" w:color="D9E1E8"/>
+            </w:tcBorders>
+            <w:vAlign w:val="center"/>
+          </w:tcPr>
+          <w:p>
+            <w:pPr>
+              <w:pStyle w:val="Compact"/>
+              <w:spacing w:before="0" w:after="20" w:line="240" w:lineRule="auto"/>
+              <w:jc w:val="center"/>
+              <w:suppressAutoHyphens/>
+              <w:keepNext w:val="0"/>
+              <w:keepLines/>
+              <w:widowControl w:val="1"/>
+            </w:pPr>
+            <w:r>
+              <w:rPr>
+                <w:rFonts w:ascii="Georgia" w:hAnsi="Georgia"/>
+                <w:sz w:val="19"/>
+              </w:rPr>
+              <w:t xml:space="preserve">source</w:t>
+            </w:r>
+          </w:p>
+        </w:tc>
+        <w:tc>
+          <w:tcPr>
+            <w:tcBorders>
+              <w:left w:val="nil"/>
+              <w:right w:val="nil"/>
+              <w:top w:val="nil"/>
+              <w:bottom w:val="single" w:sz="4" w:color="D9E1E8"/>
+            </w:tcBorders>
+            <w:vAlign w:val="center"/>
+          </w:tcPr>
+          <w:p>
+            <w:pPr>
+              <w:pStyle w:val="Compact"/>
+              <w:spacing w:before="0" w:after="20" w:line="240" w:lineRule="auto"/>
+              <w:jc w:val="center"/>
+              <w:suppressAutoHyphens/>
+              <w:keepNext w:val="0"/>
+              <w:keepLines/>
+              <w:widowControl w:val="1"/>
+            </w:pPr>
+            <w:r>
+              <w:rPr>
+                <w:rFonts w:ascii="Georgia" w:hAnsi="Georgia"/>
+                <w:sz w:val="19"/>
+              </w:rPr>
+              <w:t xml:space="preserve">0.748</w:t>
+            </w:r>
+          </w:p>
+        </w:tc>
+        <w:tc>
+          <w:tcPr>
+            <w:tcBorders>
+              <w:left w:val="nil"/>
+              <w:right w:val="nil"/>
+              <w:top w:val="nil"/>
+              <w:bottom w:val="single" w:sz="4" w:color="D9E1E8"/>
+            </w:tcBorders>
+            <w:vAlign w:val="center"/>
+          </w:tcPr>
+          <w:p>
+            <w:pPr>
+              <w:pStyle w:val="Compact"/>
+              <w:spacing w:before="0" w:after="20" w:line="240" w:lineRule="auto"/>
+              <w:jc w:val="center"/>
+              <w:suppressAutoHyphens/>
+              <w:keepNext w:val="0"/>
+              <w:keepLines/>
+              <w:widowControl w:val="1"/>
+            </w:pPr>
+            <w:r>
+              <w:rPr>
+                <w:rFonts w:ascii="Georgia" w:hAnsi="Georgia"/>
+                <w:sz w:val="19"/>
+              </w:rPr>
+              <w:t xml:space="preserve">0.809</w:t>
+            </w:r>
+          </w:p>
+        </w:tc>
+      </w:tr>
+      <w:tr>
+        <w:tc>
+          <w:tcPr>
+            <w:tcBorders>
+              <w:left w:val="nil"/>
+              <w:right w:val="nil"/>
+              <w:top w:val="nil"/>
+              <w:bottom w:val="single" w:sz="4" w:color="D9E1E8"/>
+            </w:tcBorders>
+            <w:vAlign w:val="center"/>
+          </w:tcPr>
+          <w:p>
+            <w:pPr>
+              <w:pStyle w:val="Compact"/>
+              <w:spacing w:before="0" w:after="20" w:line="240" w:lineRule="auto"/>
+              <w:jc w:val="center"/>
+              <w:suppressAutoHyphens/>
+              <w:keepNext w:val="0"/>
+              <w:keepLines/>
+              <w:widowControl w:val="1"/>
+            </w:pPr>
+            <w:r>
+              <w:rPr>
+                <w:rFonts w:ascii="Georgia" w:hAnsi="Georgia"/>
+                <w:sz w:val="19"/>
+              </w:rPr>
+              <w:t xml:space="preserve">Gearbox (voltage)</w:t>
+            </w:r>
+          </w:p>
+        </w:tc>
+        <w:tc>
+          <w:tcPr>
+            <w:tcBorders>
+              <w:left w:val="nil"/>
+              <w:right w:val="nil"/>
+              <w:top w:val="nil"/>
+              <w:bottom w:val="single" w:sz="4" w:color="D9E1E8"/>
+            </w:tcBorders>
+            <w:vAlign w:val="center"/>
+          </w:tcPr>
+          <w:p>
+            <w:pPr>
+              <w:pStyle w:val="Compact"/>
+              <w:spacing w:before="0" w:after="20" w:line="240" w:lineRule="auto"/>
+              <w:jc w:val="center"/>
+              <w:suppressAutoHyphens/>
+              <w:keepNext w:val="0"/>
+              <w:keepLines/>
+              <w:widowControl w:val="1"/>
+            </w:pPr>
+            <w:r>
+              <w:rPr>
+                <w:rFonts w:ascii="Georgia" w:hAnsi="Georgia"/>
+                <w:sz w:val="19"/>
+              </w:rPr>
+              <w:t xml:space="preserve">target</w:t>
+            </w:r>
+          </w:p>
+        </w:tc>
+        <w:tc>
+          <w:tcPr>
+            <w:tcBorders>
+              <w:left w:val="nil"/>
+              <w:right w:val="nil"/>
+              <w:top w:val="nil"/>
+              <w:bottom w:val="single" w:sz="4" w:color="D9E1E8"/>
+            </w:tcBorders>
+            <w:vAlign w:val="center"/>
+          </w:tcPr>
+          <w:p>
+            <w:pPr>
+              <w:pStyle w:val="Compact"/>
+              <w:spacing w:before="0" w:after="20" w:line="240" w:lineRule="auto"/>
+              <w:jc w:val="center"/>
+              <w:suppressAutoHyphens/>
+              <w:keepNext w:val="0"/>
+              <w:keepLines/>
+              <w:widowControl w:val="1"/>
+            </w:pPr>
+            <w:r>
+              <w:rPr>
+                <w:rFonts w:ascii="Georgia" w:hAnsi="Georgia"/>
+                <w:sz w:val="19"/>
+              </w:rPr>
+              <w:t xml:space="preserve">0.645</w:t>
+            </w:r>
+          </w:p>
+        </w:tc>
+        <w:tc>
+          <w:tcPr>
+            <w:tcBorders>
+              <w:left w:val="nil"/>
+              <w:right w:val="nil"/>
+              <w:top w:val="nil"/>
+              <w:bottom w:val="single" w:sz="4" w:color="D9E1E8"/>
+            </w:tcBorders>
+            <w:vAlign w:val="center"/>
+          </w:tcPr>
+          <w:p>
+            <w:pPr>
+              <w:pStyle w:val="Compact"/>
+              <w:spacing w:before="0" w:after="20" w:line="240" w:lineRule="auto"/>
+              <w:jc w:val="center"/>
+              <w:suppressAutoHyphens/>
+              <w:keepNext w:val="0"/>
+              <w:keepLines/>
+              <w:widowControl w:val="1"/>
+            </w:pPr>
+            <w:r>
+              <w:rPr>
+                <w:rFonts w:ascii="Georgia" w:hAnsi="Georgia"/>
+                <w:sz w:val="19"/>
+              </w:rPr>
+              <w:t xml:space="preserve">0.710</w:t>
+            </w:r>
+          </w:p>
+        </w:tc>
+      </w:tr>
+      <w:tr>
+        <w:tc>
+          <w:tcPr>
+            <w:tcBorders>
+              <w:left w:val="nil"/>
+              <w:right w:val="nil"/>
+              <w:top w:val="nil"/>
+              <w:bottom w:val="single" w:sz="4" w:color="D9E1E8"/>
+            </w:tcBorders>
+            <w:vAlign w:val="center"/>
+          </w:tcPr>
+          <w:p>
+            <w:pPr>
+              <w:pStyle w:val="Compact"/>
+              <w:spacing w:before="0" w:after="20" w:line="240" w:lineRule="auto"/>
+              <w:jc w:val="center"/>
+              <w:suppressAutoHyphens/>
+              <w:keepNext w:val="0"/>
+              <w:keepLines/>
+              <w:widowControl w:val="1"/>
+            </w:pPr>
+            <w:r>
+              <w:rPr>
+                <w:rFonts w:ascii="Georgia" w:hAnsi="Georgia"/>
+                <w:sz w:val="19"/>
+              </w:rPr>
+              <w:t xml:space="preserve">Slider (velocity)</w:t>
+            </w:r>
+          </w:p>
+        </w:tc>
+        <w:tc>
+          <w:tcPr>
+            <w:tcBorders>
+              <w:left w:val="nil"/>
+              <w:right w:val="nil"/>
+              <w:top w:val="nil"/>
+              <w:bottom w:val="single" w:sz="4" w:color="D9E1E8"/>
+            </w:tcBorders>
+            <w:vAlign w:val="center"/>
+          </w:tcPr>
+          <w:p>
+            <w:pPr>
+              <w:pStyle w:val="Compact"/>
+              <w:spacing w:before="0" w:after="20" w:line="240" w:lineRule="auto"/>
+              <w:jc w:val="center"/>
+              <w:suppressAutoHyphens/>
+              <w:keepNext w:val="0"/>
+              <w:keepLines/>
+              <w:widowControl w:val="1"/>
+            </w:pPr>
+            <w:r>
+              <w:rPr>
+                <w:rFonts w:ascii="Georgia" w:hAnsi="Georgia"/>
+                <w:sz w:val="19"/>
+              </w:rPr>
+              <w:t xml:space="preserve">source</w:t>
+            </w:r>
+          </w:p>
+        </w:tc>
+        <w:tc>
+          <w:tcPr>
+            <w:tcBorders>
+              <w:left w:val="nil"/>
+              <w:right w:val="nil"/>
+              <w:top w:val="nil"/>
+              <w:bottom w:val="single" w:sz="4" w:color="D9E1E8"/>
+            </w:tcBorders>
+            <w:vAlign w:val="center"/>
+          </w:tcPr>
+          <w:p>
+            <w:pPr>
+              <w:pStyle w:val="Compact"/>
+              <w:spacing w:before="0" w:after="20" w:line="240" w:lineRule="auto"/>
+              <w:jc w:val="center"/>
+              <w:suppressAutoHyphens/>
+              <w:keepNext w:val="0"/>
+              <w:keepLines/>
+              <w:widowControl w:val="1"/>
+            </w:pPr>
+            <w:r>
+              <w:rPr>
+                <w:rFonts w:ascii="Georgia" w:hAnsi="Georgia"/>
+                <w:sz w:val="19"/>
+              </w:rPr>
+              <w:t xml:space="preserve">0.726</w:t>
+            </w:r>
+          </w:p>
+        </w:tc>
+        <w:tc>
+          <w:tcPr>
+            <w:tcBorders>
+              <w:left w:val="nil"/>
+              <w:right w:val="nil"/>
+              <w:top w:val="nil"/>
+              <w:bottom w:val="single" w:sz="4" w:color="D9E1E8"/>
+            </w:tcBorders>
+            <w:vAlign w:val="center"/>
+          </w:tcPr>
+          <w:p>
+            <w:pPr>
+              <w:pStyle w:val="Compact"/>
+              <w:spacing w:before="0" w:after="20" w:line="240" w:lineRule="auto"/>
+              <w:jc w:val="center"/>
+              <w:suppressAutoHyphens/>
+              <w:keepNext w:val="0"/>
+              <w:keepLines/>
+              <w:widowControl w:val="1"/>
+            </w:pPr>
+            <w:r>
+              <w:rPr>
+                <w:rFonts w:ascii="Georgia" w:hAnsi="Georgia"/>
+                <w:sz w:val="19"/>
+              </w:rPr>
+              <w:t xml:space="preserve">0.789</w:t>
+            </w:r>
+          </w:p>
+        </w:tc>
+      </w:tr>
+      <w:tr>
+        <w:tc>
+          <w:tcPr>
+            <w:tcBorders>
+              <w:left w:val="nil"/>
+              <w:right w:val="nil"/>
+              <w:top w:val="nil"/>
+              <w:bottom w:val="single" w:sz="4" w:color="D9E1E8"/>
+            </w:tcBorders>
+            <w:vAlign w:val="center"/>
+          </w:tcPr>
+          <w:p>
+            <w:pPr>
+              <w:pStyle w:val="Compact"/>
+              <w:spacing w:before="0" w:after="20" w:line="240" w:lineRule="auto"/>
+              <w:jc w:val="center"/>
+              <w:suppressAutoHyphens/>
+              <w:keepNext w:val="0"/>
+              <w:keepLines/>
+              <w:widowControl w:val="1"/>
+            </w:pPr>
+            <w:r>
+              <w:rPr>
+                <w:rFonts w:ascii="Georgia" w:hAnsi="Georgia"/>
+                <w:sz w:val="19"/>
+              </w:rPr>
+              <w:t xml:space="preserve">Slider (velocity)</w:t>
+            </w:r>
+          </w:p>
+        </w:tc>
+        <w:tc>
+          <w:tcPr>
+            <w:tcBorders>
+              <w:left w:val="nil"/>
+              <w:right w:val="nil"/>
+              <w:top w:val="nil"/>
+              <w:bottom w:val="single" w:sz="4" w:color="D9E1E8"/>
+            </w:tcBorders>
+            <w:vAlign w:val="center"/>
+          </w:tcPr>
+          <w:p>
+            <w:pPr>
+              <w:pStyle w:val="Compact"/>
+              <w:spacing w:before="0" w:after="20" w:line="240" w:lineRule="auto"/>
+              <w:jc w:val="center"/>
+              <w:suppressAutoHyphens/>
+              <w:keepNext w:val="0"/>
+              <w:keepLines/>
+              <w:widowControl w:val="1"/>
+            </w:pPr>
+            <w:r>
+              <w:rPr>
+                <w:rFonts w:ascii="Georgia" w:hAnsi="Georgia"/>
+                <w:sz w:val="19"/>
+              </w:rPr>
+              <w:t xml:space="preserve">target</w:t>
+            </w:r>
+          </w:p>
+        </w:tc>
+        <w:tc>
+          <w:tcPr>
+            <w:tcBorders>
+              <w:left w:val="nil"/>
+              <w:right w:val="nil"/>
+              <w:top w:val="nil"/>
+              <w:bottom w:val="single" w:sz="4" w:color="D9E1E8"/>
+            </w:tcBorders>
+            <w:vAlign w:val="center"/>
+          </w:tcPr>
+          <w:p>
+            <w:pPr>
+              <w:pStyle w:val="Compact"/>
+              <w:spacing w:before="0" w:after="20" w:line="240" w:lineRule="auto"/>
+              <w:jc w:val="center"/>
+              <w:suppressAutoHyphens/>
+              <w:keepNext w:val="0"/>
+              <w:keepLines/>
+              <w:widowControl w:val="1"/>
+            </w:pPr>
+            <w:r>
+              <w:rPr>
+                <w:rFonts w:ascii="Georgia" w:hAnsi="Georgia"/>
+                <w:sz w:val="19"/>
+              </w:rPr>
+              <w:t xml:space="preserve">0.622</w:t>
+            </w:r>
+          </w:p>
+        </w:tc>
+        <w:tc>
+          <w:tcPr>
+            <w:tcBorders>
+              <w:left w:val="nil"/>
+              <w:right w:val="nil"/>
+              <w:top w:val="nil"/>
+              <w:bottom w:val="single" w:sz="4" w:color="D9E1E8"/>
+            </w:tcBorders>
+            <w:vAlign w:val="center"/>
+          </w:tcPr>
+          <w:p>
+            <w:pPr>
+              <w:pStyle w:val="Compact"/>
+              <w:spacing w:before="0" w:after="20" w:line="240" w:lineRule="auto"/>
+              <w:jc w:val="center"/>
+              <w:suppressAutoHyphens/>
+              <w:keepNext w:val="0"/>
+              <w:keepLines/>
+              <w:widowControl w:val="1"/>
+            </w:pPr>
+            <w:r>
+              <w:rPr>
+                <w:rFonts w:ascii="Georgia" w:hAnsi="Georgia"/>
+                <w:sz w:val="19"/>
+              </w:rPr>
+              <w:t xml:space="preserve">0.662</w:t>
+            </w:r>
+          </w:p>
+        </w:tc>
+      </w:tr>
+      <w:tr>
+        <w:tc>
+          <w:tcPr>
+            <w:tcBorders>
+              <w:left w:val="nil"/>
+              <w:right w:val="nil"/>
+              <w:top w:val="nil"/>
+              <w:bottom w:val="single" w:sz="4" w:color="D9E1E8"/>
+            </w:tcBorders>
+            <w:vAlign w:val="center"/>
+          </w:tcPr>
+          <w:p>
+            <w:pPr>
+              <w:pStyle w:val="Compact"/>
+              <w:spacing w:before="0" w:after="20" w:line="240" w:lineRule="auto"/>
+              <w:jc w:val="center"/>
+              <w:suppressAutoHyphens/>
+              <w:keepNext w:val="0"/>
+              <w:keepLines/>
+              <w:widowControl w:val="1"/>
+            </w:pPr>
+            <w:r>
+              <w:rPr>
+                <w:rFonts w:ascii="Georgia" w:hAnsi="Georgia"/>
+                <w:sz w:val="19"/>
+              </w:rPr>
               <w:t xml:space="preserve">Valve (operation pattern)</w:t>
             </w:r>
           </w:p>
@@ -7435,6 +7961,242 @@
               <w:left w:val="nil"/>
               <w:right w:val="nil"/>
               <w:top w:val="nil"/>
+              <w:bottom w:val="single" w:sz="4" w:color="D9E1E8"/>
+            </w:tcBorders>
+            <w:vAlign w:val="center"/>
+          </w:tcPr>
+          <w:p>
+            <w:pPr>
+              <w:pStyle w:val="Compact"/>
+              <w:spacing w:before="0" w:after="20" w:line="240" w:lineRule="auto"/>
+              <w:jc w:val="center"/>
+              <w:suppressAutoHyphens/>
+              <w:keepNext w:val="0"/>
+              <w:keepLines/>
+              <w:widowControl w:val="1"/>
+            </w:pPr>
+            <w:r>
+              <w:rPr>
+                <w:rFonts w:ascii="Georgia" w:hAnsi="Georgia"/>
+                <w:sz w:val="19"/>
+              </w:rPr>
+              <w:t xml:space="preserve">Valve (operation pattern)</w:t>
+            </w:r>
+          </w:p>
+        </w:tc>
+        <w:tc>
+          <w:tcPr>
+            <w:tcBorders>
+              <w:left w:val="nil"/>
+              <w:right w:val="nil"/>
+              <w:top w:val="nil"/>
+              <w:bottom w:val="single" w:sz="4" w:color="D9E1E8"/>
+            </w:tcBorders>
+            <w:vAlign w:val="center"/>
+          </w:tcPr>
+          <w:p>
+            <w:pPr>
+              <w:pStyle w:val="Compact"/>
+              <w:spacing w:before="0" w:after="20" w:line="240" w:lineRule="auto"/>
+              <w:jc w:val="center"/>
+              <w:suppressAutoHyphens/>
+              <w:keepNext w:val="0"/>
+              <w:keepLines/>
+              <w:widowControl w:val="1"/>
+            </w:pPr>
+            <w:r>
+              <w:rPr>
+                <w:rFonts w:ascii="Georgia" w:hAnsi="Georgia"/>
+                <w:sz w:val="19"/>
+              </w:rPr>
+              <w:t xml:space="preserve">target</w:t>
+            </w:r>
+          </w:p>
+        </w:tc>
+        <w:tc>
+          <w:tcPr>
+            <w:tcBorders>
+              <w:left w:val="nil"/>
+              <w:right w:val="nil"/>
+              <w:top w:val="nil"/>
+              <w:bottom w:val="single" w:sz="4" w:color="D9E1E8"/>
+            </w:tcBorders>
+            <w:vAlign w:val="center"/>
+          </w:tcPr>
+          <w:p>
+            <w:pPr>
+              <w:pStyle w:val="Compact"/>
+              <w:spacing w:before="0" w:after="20" w:line="240" w:lineRule="auto"/>
+              <w:jc w:val="center"/>
+              <w:suppressAutoHyphens/>
+              <w:keepNext w:val="0"/>
+              <w:keepLines/>
+              <w:widowControl w:val="1"/>
+            </w:pPr>
+            <w:r>
+              <w:rPr>
+                <w:rFonts w:ascii="Georgia" w:hAnsi="Georgia"/>
+                <w:sz w:val="19"/>
+              </w:rPr>
+              <w:t xml:space="preserve">0.376</w:t>
+            </w:r>
+          </w:p>
+        </w:tc>
+        <w:tc>
+          <w:tcPr>
+            <w:tcBorders>
+              <w:left w:val="nil"/>
+              <w:right w:val="nil"/>
+              <w:top w:val="nil"/>
+              <w:bottom w:val="single" w:sz="4" w:color="D9E1E8"/>
+            </w:tcBorders>
+            <w:vAlign w:val="center"/>
+          </w:tcPr>
+          <w:p>
+            <w:pPr>
+              <w:pStyle w:val="Compact"/>
+              <w:spacing w:before="0" w:after="20" w:line="240" w:lineRule="auto"/>
+              <w:jc w:val="center"/>
+              <w:suppressAutoHyphens/>
+              <w:keepNext w:val="0"/>
+              <w:keepLines/>
+              <w:widowControl w:val="1"/>
+            </w:pPr>
+            <w:r>
+              <w:rPr>
+                <w:rFonts w:ascii="Georgia" w:hAnsi="Georgia"/>
+                <w:sz w:val="19"/>
+              </w:rPr>
+              <w:t xml:space="preserve">0.632</w:t>
+            </w:r>
+          </w:p>
+        </w:tc>
+      </w:tr>
+      <w:tr>
+        <w:tc>
+          <w:tcPr>
+            <w:tcBorders>
+              <w:left w:val="nil"/>
+              <w:right w:val="nil"/>
+              <w:top w:val="nil"/>
+              <w:bottom w:val="single" w:sz="4" w:color="D9E1E8"/>
+            </w:tcBorders>
+            <w:vAlign w:val="center"/>
+          </w:tcPr>
+          <w:p>
+            <w:pPr>
+              <w:pStyle w:val="Compact"/>
+              <w:spacing w:before="0" w:after="20" w:line="240" w:lineRule="auto"/>
+              <w:jc w:val="center"/>
+              <w:suppressAutoHyphens/>
+              <w:keepNext w:val="0"/>
+              <w:keepLines/>
+              <w:widowControl w:val="1"/>
+            </w:pPr>
+            <w:r>
+              <w:rPr>
+                <w:rFonts w:ascii="Georgia" w:hAnsi="Georgia"/>
+                <w:sz w:val="19"/>
+              </w:rPr>
+              <w:t xml:space="preserve">Fan (noise mixture)</w:t>
+            </w:r>
+          </w:p>
+        </w:tc>
+        <w:tc>
+          <w:tcPr>
+            <w:tcBorders>
+              <w:left w:val="nil"/>
+              <w:right w:val="nil"/>
+              <w:top w:val="nil"/>
+              <w:bottom w:val="single" w:sz="4" w:color="D9E1E8"/>
+            </w:tcBorders>
+            <w:vAlign w:val="center"/>
+          </w:tcPr>
+          <w:p>
+            <w:pPr>
+              <w:pStyle w:val="Compact"/>
+              <w:spacing w:before="0" w:after="20" w:line="240" w:lineRule="auto"/>
+              <w:jc w:val="center"/>
+              <w:suppressAutoHyphens/>
+              <w:keepNext w:val="0"/>
+              <w:keepLines/>
+              <w:widowControl w:val="1"/>
+            </w:pPr>
+            <w:r>
+              <w:rPr>
+                <w:rFonts w:ascii="Georgia" w:hAnsi="Georgia"/>
+                <w:sz w:val="19"/>
+              </w:rPr>
+              <w:t xml:space="preserve">source</w:t>
+            </w:r>
+          </w:p>
+        </w:tc>
+        <w:tc>
+          <w:tcPr>
+            <w:tcBorders>
+              <w:left w:val="nil"/>
+              <w:right w:val="nil"/>
+              <w:top w:val="nil"/>
+              <w:bottom w:val="single" w:sz="4" w:color="D9E1E8"/>
+            </w:tcBorders>
+            <w:vAlign w:val="center"/>
+          </w:tcPr>
+          <w:p>
+            <w:pPr>
+              <w:pStyle w:val="Compact"/>
+              <w:spacing w:before="0" w:after="20" w:line="240" w:lineRule="auto"/>
+              <w:jc w:val="center"/>
+              <w:suppressAutoHyphens/>
+              <w:keepNext w:val="0"/>
+              <w:keepLines/>
+              <w:widowControl w:val="1"/>
+            </w:pPr>
+            <w:r>
+              <w:rPr>
+                <w:rFonts w:ascii="Georgia" w:hAnsi="Georgia"/>
+                <w:sz w:val="19"/>
+              </w:rPr>
+              <w:t xml:space="preserve">0.955</w:t>
+            </w:r>
+          </w:p>
+        </w:tc>
+        <w:tc>
+          <w:tcPr>
+            <w:tcBorders>
+              <w:left w:val="nil"/>
+              <w:right w:val="nil"/>
+              <w:top w:val="nil"/>
+              <w:bottom w:val="single" w:sz="4" w:color="D9E1E8"/>
+            </w:tcBorders>
+            <w:vAlign w:val="center"/>
+          </w:tcPr>
+          <w:p>
+            <w:pPr>
+              <w:pStyle w:val="Compact"/>
+              <w:spacing w:before="0" w:after="20" w:line="240" w:lineRule="auto"/>
+              <w:jc w:val="center"/>
+              <w:suppressAutoHyphens/>
+              <w:keepNext w:val="0"/>
+              <w:keepLines/>
+              <w:widowControl w:val="1"/>
+            </w:pPr>
+            <w:r>
+              <w:rPr>
+                <w:rFonts w:ascii="Georgia" w:hAnsi="Georgia"/>
+                <w:sz w:val="19"/>
+              </w:rPr>
+              <w:t xml:space="preserve">0.943</w:t>
+            </w:r>
+          </w:p>
+        </w:tc>
+      </w:tr>
+      <w:tr>
+        <w:tc>
+          <w:tcPr>
+            <w:tcBorders>
+              <w:left w:val="nil"/>
+              <w:right w:val="nil"/>
+              <w:top w:val="nil"/>
               <w:bottom w:val="nil"/>
             </w:tcBorders>
             <w:vAlign w:val="center"/>
@@ -7454,7 +8216,7 @@
                 <w:rFonts w:ascii="Georgia" w:hAnsi="Georgia"/>
                 <w:sz w:val="19"/>
               </w:rPr>
-              <w:t xml:space="preserve">Valve (operation pattern)</w:t>
+              <w:t xml:space="preserve">Fan (noise mixture)</w:t>
             </w:r>
           </w:p>
         </w:tc>
@@ -7512,7 +8274,7 @@
                 <w:rFonts w:ascii="Georgia" w:hAnsi="Georgia"/>
                 <w:sz w:val="19"/>
               </w:rPr>
-              <w:t xml:space="preserve">0.376</w:t>
+              <w:t xml:space="preserve">0.716</w:t>
             </w:r>
           </w:p>
         </w:tc>
@@ -7541,7 +8303,7 @@
                 <w:rFonts w:ascii="Georgia" w:hAnsi="Georgia"/>
                 <w:sz w:val="19"/>
               </w:rPr>
-              <w:t xml:space="preserve">0.632</w:t>
+              <w:t xml:space="preserve">0.670</w:t>
             </w:r>
           </w:p>
         </w:tc>

</xml_diff>

<commit_message>
Full-paper polish: method schematic, 28 new refs, reviewer pass
- Figure 1 method schematic (pipeline diagram); figures renumbered 2,3
- Reference list expanded to 38 (bibtest: 28 new all valid; 3 misattributed dropped);
  related work rewritten with cited clusters across 5 threads; all 38 cited in text
- paper-reviewer pass: wins-only scan clean, tone audit clean (0 em-dashes, 0 banned),
  fixed 2 orphan figures (SC-8b) and one "merely", abstract 205 words
- 11 pages, 3 figures, 5 tables, 53 equations. DOCX+PDF rebuilt

bibtest: 28/28 new refs valid. wins-only scan: clean. paper-reviewer: 0 blocking.

Co-Authored-By: Claude Opus 4.8 <noreply@anthropic.com>
</commit_message>
<xml_diff>
--- a/docs/EngineKnock_speed_conditional.docx
+++ b/docs/EngineKnock_speed_conditional.docx
@@ -2,7 +2,7 @@
 <file path=word/document.xml><?xml version="1.0" encoding="utf-8"?>
 <w:document xmlns:w="http://schemas.openxmlformats.org/wordprocessingml/2006/main" xmlns:m="http://schemas.openxmlformats.org/officeDocument/2006/math" xmlns:r="http://schemas.openxmlformats.org/officeDocument/2006/relationships" xmlns:o="urn:schemas-microsoft-com:office:office" xmlns:v="urn:schemas-microsoft-com:vml" xmlns:w10="urn:schemas-microsoft-com:office:word" xmlns:a="http://schemas.openxmlformats.org/drawingml/2006/main" xmlns:pic="http://schemas.openxmlformats.org/drawingml/2006/picture" xmlns:wp="http://schemas.openxmlformats.org/drawingml/2006/wordprocessingDrawing">
   <w:body>
-    <w:bookmarkStart w:id="25" w:name="X240ac4f9193a8f0b19f5a6920322057aa9ce7f5"/>
+    <w:bookmarkStart w:id="28" w:name="X240ac4f9193a8f0b19f5a6920322057aa9ce7f5"/>
     <w:p>
       <w:pPr>
         <w:pStyle w:val="Title"/>
@@ -567,31 +567,83 @@
           <w:b/>
           <w:bCs/>
         </w:rPr>
-        <w:t xml:space="preserve">Unsupervised machine anomaly detection.</w:t>
-      </w:r>
-      <w:r>
-        <w:t xml:space="preserve"> </w:t>
-      </w:r>
-      <w:r>
-        <w:t xml:space="preserve">Normal-only detection of machine faults from sound and vibration is the subject of the DCASE</w:t>
-      </w:r>
-      <w:r>
-        <w:t xml:space="preserve"> </w:t>
-      </w:r>
-      <w:r>
-        <w:t xml:space="preserve">Task 2 series and its datasets MIMII and ToyADMOS. The prevailing recipe is a reconstruction</w:t>
-      </w:r>
-      <w:r>
-        <w:t xml:space="preserve"> </w:t>
-      </w:r>
-      <w:r>
-        <w:t xml:space="preserve">autoencoder or a pretrained-embedding backend with a k-nearest-neighbour or Mahalanobis score. These</w:t>
-      </w:r>
-      <w:r>
-        <w:t xml:space="preserve"> </w:t>
-      </w:r>
-      <w:r>
-        <w:t xml:space="preserve">methods target the normal-vs-anomaly boundary but do not model the operating condition explicitly.</w:t>
+        <w:t xml:space="preserve">Unsupervised anomaly detection.</w:t>
+      </w:r>
+      <w:r>
+        <w:t xml:space="preserve"> </w:t>
+      </w:r>
+      <w:r>
+        <w:t xml:space="preserve">Normal-only detection is a broad field. Reconstruction and generative</w:t>
+      </w:r>
+      <w:r>
+        <w:t xml:space="preserve"> </w:t>
+      </w:r>
+      <w:r>
+        <w:t xml:space="preserve">detectors flag inputs the model reconstructs poorly, from autoencoders and their memory-augmented</w:t>
+      </w:r>
+      <w:r>
+        <w:t xml:space="preserve"> </w:t>
+      </w:r>
+      <w:r>
+        <w:t xml:space="preserve">variants [17] to adversarial and generative models [15, 16] and discriminatively trained</w:t>
+      </w:r>
+      <w:r>
+        <w:t xml:space="preserve"> </w:t>
+      </w:r>
+      <w:r>
+        <w:t xml:space="preserve">reconstruction embeddings [14]; one-class and feature-distribution methods model the healthy region</w:t>
+      </w:r>
+      <w:r>
+        <w:t xml:space="preserve"> </w:t>
+      </w:r>
+      <w:r>
+        <w:t xml:space="preserve">directly [11, 13] or by recall over a memory bank of healthy patches [12], and industrial</w:t>
+      </w:r>
+      <w:r>
+        <w:t xml:space="preserve"> </w:t>
+      </w:r>
+      <w:r>
+        <w:t xml:space="preserve">benchmarks such as MVTec AD standardized the setting [18]. A parallel family scores a test point by</w:t>
+      </w:r>
+      <w:r>
+        <w:t xml:space="preserve"> </w:t>
+      </w:r>
+      <w:r>
+        <w:t xml:space="preserve">its distance to healthy examples in a pretrained feature space, using Mahalanobis or nearest-neighbour</w:t>
+      </w:r>
+      <w:r>
+        <w:t xml:space="preserve"> </w:t>
+      </w:r>
+      <w:r>
+        <w:t xml:space="preserve">statistics [35, 36, 37, 38]; we adopt a nearest-neighbour construction, but in the</w:t>
+      </w:r>
+      <w:r>
+        <w:t xml:space="preserve"> </w:t>
+      </w:r>
+      <w:r>
+        <w:rPr>
+          <w:i/>
+          <w:iCs/>
+        </w:rPr>
+        <w:t xml:space="preserve">covariate</w:t>
+      </w:r>
+      <w:r>
+        <w:t xml:space="preserve"> </w:t>
+      </w:r>
+      <w:r>
+        <w:t xml:space="preserve">rather than the feature space. For machine sound specifically, the DCASE Task 2</w:t>
+      </w:r>
+      <w:r>
+        <w:t xml:space="preserve"> </w:t>
+      </w:r>
+      <w:r>
+        <w:t xml:space="preserve">series and its datasets MIMII [5] and ToyADMOS [6] are the standard testbeds. None of these</w:t>
+      </w:r>
+      <w:r>
+        <w:t xml:space="preserve"> </w:t>
+      </w:r>
+      <w:r>
+        <w:t xml:space="preserve">methods model the operating condition explicitly.</w:t>
       </w:r>
     </w:p>
     <w:p>
@@ -607,37 +659,31 @@
           <w:b/>
           <w:bCs/>
         </w:rPr>
-        <w:t xml:space="preserve">Domain shift and domain generalization.</w:t>
-      </w:r>
-      <w:r>
-        <w:t xml:space="preserve"> </w:t>
-      </w:r>
-      <w:r>
-        <w:t xml:space="preserve">DCASE 2021 introduced anomalous-sound detection under domain shift and named motor speed and</w:t>
-      </w:r>
-      <w:r>
-        <w:t xml:space="preserve"> </w:t>
-      </w:r>
-      <w:r>
-        <w:t xml:space="preserve">signal-to-noise ratio as its causes; DCASE 2022 reframed the task as domain generalization across</w:t>
-      </w:r>
-      <w:r>
-        <w:t xml:space="preserve"> </w:t>
-      </w:r>
-      <w:r>
-        <w:t xml:space="preserve">source and target domains. In these formulations the operating condition enters as a discrete</w:t>
-      </w:r>
-      <w:r>
-        <w:t xml:space="preserve"> </w:t>
-      </w:r>
-      <w:r>
-        <w:t xml:space="preserve">source/target label or as categorical attribute metadata, not as a continuous covariate that the</w:t>
-      </w:r>
-      <w:r>
-        <w:t xml:space="preserve"> </w:t>
-      </w:r>
-      <w:r>
-        <w:t xml:space="preserve">model conditions on.</w:t>
+        <w:t xml:space="preserve">Machine condition monitoring.</w:t>
+      </w:r>
+      <w:r>
+        <w:t xml:space="preserve"> </w:t>
+      </w:r>
+      <w:r>
+        <w:t xml:space="preserve">Vibration-based fault diagnosis has a large literature, surveyed for deep</w:t>
+      </w:r>
+      <w:r>
+        <w:t xml:space="preserve"> </w:t>
+      </w:r>
+      <w:r>
+        <w:t xml:space="preserve">learning in [19, 20] and for bearings specifically in [22], with the CWRU set a common</w:t>
+      </w:r>
+      <w:r>
+        <w:t xml:space="preserve"> </w:t>
+      </w:r>
+      <w:r>
+        <w:t xml:space="preserve">benchmark [21]. This work is predominantly supervised multi-class classification; the unsupervised,</w:t>
+      </w:r>
+      <w:r>
+        <w:t xml:space="preserve"> </w:t>
+      </w:r>
+      <w:r>
+        <w:t xml:space="preserve">normal-only setting we study is the harder and more deployment-realistic one.</w:t>
       </w:r>
     </w:p>
     <w:p>
@@ -653,65 +699,49 @@
           <w:b/>
           <w:bCs/>
         </w:rPr>
-        <w:t xml:space="preserve">Speed-invariant fault diagnosis.</w:t>
-      </w:r>
-      <w:r>
-        <w:t xml:space="preserve"> </w:t>
-      </w:r>
-      <w:r>
-        <w:t xml:space="preserve">Order tracking and angular resampling are the classical route to speed robustness and underlie a</w:t>
-      </w:r>
-      <w:r>
-        <w:t xml:space="preserve"> </w:t>
-      </w:r>
-      <w:r>
-        <w:t xml:space="preserve">large supervised bearing-diagnosis literature; recent unsupervised, variable-speed methods pursue the</w:t>
-      </w:r>
-      <w:r>
-        <w:t xml:space="preserve"> </w:t>
-      </w:r>
-      <w:r>
-        <w:t xml:space="preserve">same</w:t>
-      </w:r>
-      <w:r>
-        <w:t xml:space="preserve"> </w:t>
-      </w:r>
-      <w:r>
-        <w:rPr>
-          <w:i/>
-          <w:iCs/>
-        </w:rPr>
-        <w:t xml:space="preserve">invariance</w:t>
-      </w:r>
-      <w:r>
-        <w:t xml:space="preserve"> </w:t>
-      </w:r>
-      <w:r>
-        <w:t xml:space="preserve">goal with order-tracking autoencoders and order-adaptive subspace learning</w:t>
-      </w:r>
-      <w:r>
-        <w:t xml:space="preserve"> </w:t>
-      </w:r>
-      <w:r>
-        <w:t xml:space="preserve">(OASSL) [9]. Invariance and conditioning are</w:t>
-      </w:r>
-      <w:r>
-        <w:t xml:space="preserve"> </w:t>
-      </w:r>
-      <w:r>
-        <w:t xml:space="preserve">different design choices: invariance removes the covariate, conditioning models the response given the</w:t>
-      </w:r>
-      <w:r>
-        <w:t xml:space="preserve"> </w:t>
-      </w:r>
-      <w:r>
-        <w:t xml:space="preserve">covariate. Our results indicate that for anomaly detection under speed shift, removing speed can be</w:t>
-      </w:r>
-      <w:r>
-        <w:t xml:space="preserve"> </w:t>
-      </w:r>
-      <w:r>
-        <w:t xml:space="preserve">worse than not addressing it at all.</w:t>
+        <w:t xml:space="preserve">Domain shift and domain generalization.</w:t>
+      </w:r>
+      <w:r>
+        <w:t xml:space="preserve"> </w:t>
+      </w:r>
+      <w:r>
+        <w:t xml:space="preserve">DCASE 2021 introduced anomalous-sound detection under domain shift and named motor speed and</w:t>
+      </w:r>
+      <w:r>
+        <w:t xml:space="preserve"> </w:t>
+      </w:r>
+      <w:r>
+        <w:t xml:space="preserve">signal-to-noise ratio as its causes; DCASE 2022 reframed the task as domain generalization across</w:t>
+      </w:r>
+      <w:r>
+        <w:t xml:space="preserve"> </w:t>
+      </w:r>
+      <w:r>
+        <w:t xml:space="preserve">source and target domains [3, 4], and later editions turned to the first-shot</w:t>
+      </w:r>
+      <w:r>
+        <w:t xml:space="preserve"> </w:t>
+      </w:r>
+      <w:r>
+        <w:t xml:space="preserve">setting [27]. Strong systems use self-supervised classification of section or attribute labels and</w:t>
+      </w:r>
+      <w:r>
+        <w:t xml:space="preserve"> </w:t>
+      </w:r>
+      <w:r>
+        <w:t xml:space="preserve">outlier exposure [28]. Transfer-learning approaches to variable-condition fault diagnosis are</w:t>
+      </w:r>
+      <w:r>
+        <w:t xml:space="preserve"> </w:t>
+      </w:r>
+      <w:r>
+        <w:t xml:space="preserve">surveyed in [29]. In all of these the operating condition enters as a discrete source/target label or</w:t>
+      </w:r>
+      <w:r>
+        <w:t xml:space="preserve"> </w:t>
+      </w:r>
+      <w:r>
+        <w:t xml:space="preserve">categorical attribute, not as a continuous covariate the model conditions on.</w:t>
       </w:r>
     </w:p>
     <w:p>
@@ -727,6 +757,80 @@
           <w:b/>
           <w:bCs/>
         </w:rPr>
+        <w:t xml:space="preserve">Speed-invariant fault diagnosis.</w:t>
+      </w:r>
+      <w:r>
+        <w:t xml:space="preserve"> </w:t>
+      </w:r>
+      <w:r>
+        <w:t xml:space="preserve">Order tracking and angular resampling are the classical route to</w:t>
+      </w:r>
+      <w:r>
+        <w:t xml:space="preserve"> </w:t>
+      </w:r>
+      <w:r>
+        <w:t xml:space="preserve">speed robustness: computed order tracking [23], the Vold-Kalman tracking filter [25], and</w:t>
+      </w:r>
+      <w:r>
+        <w:t xml:space="preserve"> </w:t>
+      </w:r>
+      <w:r>
+        <w:t xml:space="preserve">angular resampling of the raw signal [24], with envelope and spectral-kurtosis analysis isolating</w:t>
+      </w:r>
+      <w:r>
+        <w:t xml:space="preserve"> </w:t>
+      </w:r>
+      <w:r>
+        <w:t xml:space="preserve">bearing fault bands [24, 26]. Recent unsupervised, variable-speed methods pursue the same</w:t>
+      </w:r>
+      <w:r>
+        <w:t xml:space="preserve"> </w:t>
+      </w:r>
+      <w:r>
+        <w:rPr>
+          <w:i/>
+          <w:iCs/>
+        </w:rPr>
+        <w:t xml:space="preserve">invariance</w:t>
+      </w:r>
+      <w:r>
+        <w:t xml:space="preserve"> </w:t>
+      </w:r>
+      <w:r>
+        <w:t xml:space="preserve">goal with order-tracking autoencoders and order-adaptive subspace learning</w:t>
+      </w:r>
+      <w:r>
+        <w:t xml:space="preserve"> </w:t>
+      </w:r>
+      <w:r>
+        <w:t xml:space="preserve">(OASSL) [9]. Invariance and conditioning are different design choices: invariance removes the</w:t>
+      </w:r>
+      <w:r>
+        <w:t xml:space="preserve"> </w:t>
+      </w:r>
+      <w:r>
+        <w:t xml:space="preserve">covariate, conditioning models the response given the covariate. Our results indicate that for anomaly</w:t>
+      </w:r>
+      <w:r>
+        <w:t xml:space="preserve"> </w:t>
+      </w:r>
+      <w:r>
+        <w:t xml:space="preserve">detection under speed shift, removing speed can be worse than not addressing it at all.</w:t>
+      </w:r>
+    </w:p>
+    <w:p>
+      <w:pPr>
+        <w:pStyle w:val="BodyText"/>
+        <w:jc w:val="both"/>
+        <w:keepNext w:val="0"/>
+        <w:keepLines w:val="0"/>
+        <w:widowControl w:val="1"/>
+      </w:pPr>
+      <w:r>
+        <w:rPr>
+          <w:b/>
+          <w:bCs/>
+        </w:rPr>
         <w:t xml:space="preserve">Conditional and contextual anomaly detection.</w:t>
       </w:r>
       <w:r>
@@ -739,25 +843,37 @@
         <w:t xml:space="preserve"> </w:t>
       </w:r>
       <w:r>
-        <w:t xml:space="preserve">contextual) anomaly detection dates to Song et al. [10], and recent detectors condition</w:t>
-      </w:r>
-      <w:r>
-        <w:t xml:space="preserve"> </w:t>
-      </w:r>
-      <w:r>
-        <w:t xml:space="preserve">normalizing flows on spatial position [7] or autoencoders on a discrete machine identity [8].</w:t>
-      </w:r>
-      <w:r>
-        <w:t xml:space="preserve"> </w:t>
-      </w:r>
-      <w:r>
-        <w:t xml:space="preserve">What is specific here, and what we have not found addressed, is conditioning a normal-only</w:t>
-      </w:r>
-      <w:r>
-        <w:t xml:space="preserve"> </w:t>
-      </w:r>
-      <w:r>
-        <w:t xml:space="preserve">machine-fault detector on the</w:t>
+        <w:t xml:space="preserve">contextual) anomaly detection dates to Song et al. [10]. Conditional density models, in</w:t>
+      </w:r>
+      <w:r>
+        <w:t xml:space="preserve"> </w:t>
+      </w:r>
+      <w:r>
+        <w:t xml:space="preserve">particular normalizing flows [30, 31, 32] and conditional variational</w:t>
+      </w:r>
+      <w:r>
+        <w:t xml:space="preserve"> </w:t>
+      </w:r>
+      <w:r>
+        <w:t xml:space="preserve">autoencoders [34], support conditioning a likelihood on side information, and flow-based detectors</w:t>
+      </w:r>
+      <w:r>
+        <w:t xml:space="preserve"> </w:t>
+      </w:r>
+      <w:r>
+        <w:t xml:space="preserve">condition on spatial position for defect localization [7, 33]; others condition an autoencoder</w:t>
+      </w:r>
+      <w:r>
+        <w:t xml:space="preserve"> </w:t>
+      </w:r>
+      <w:r>
+        <w:t xml:space="preserve">on a discrete machine identity [8]. What is specific here, and what we have not found addressed, is</w:t>
+      </w:r>
+      <w:r>
+        <w:t xml:space="preserve"> </w:t>
+      </w:r>
+      <w:r>
+        <w:t xml:space="preserve">conditioning a normal-only machine-fault detector on the</w:t>
       </w:r>
       <w:r>
         <w:t xml:space="preserve"> </w:t>
@@ -773,31 +889,31 @@
         <w:t xml:space="preserve"> </w:t>
       </w:r>
       <w:r>
-        <w:t xml:space="preserve">from a tachometer and</w:t>
-      </w:r>
-      <w:r>
-        <w:t xml:space="preserve"> </w:t>
-      </w:r>
-      <w:r>
-        <w:t xml:space="preserve">evaluating it under operating-speed shift with a direct head-to-head against order-tracking invariance.</w:t>
-      </w:r>
-      <w:r>
-        <w:t xml:space="preserve"> </w:t>
-      </w:r>
-      <w:r>
-        <w:t xml:space="preserve">Our discrete-bin ablation makes the distinction concrete: conditioning on the continuous covariate</w:t>
-      </w:r>
-      <w:r>
-        <w:t xml:space="preserve"> </w:t>
-      </w:r>
-      <w:r>
-        <w:t xml:space="preserve">beats conditioning on a binned (discrete) version of it, which is the form the closest prior work</w:t>
-      </w:r>
-      <w:r>
-        <w:t xml:space="preserve"> </w:t>
-      </w:r>
-      <w:r>
-        <w:t xml:space="preserve">takes.</w:t>
+        <w:t xml:space="preserve">from</w:t>
+      </w:r>
+      <w:r>
+        <w:t xml:space="preserve"> </w:t>
+      </w:r>
+      <w:r>
+        <w:t xml:space="preserve">a tachometer and evaluating it under operating-speed shift with a direct head-to-head against</w:t>
+      </w:r>
+      <w:r>
+        <w:t xml:space="preserve"> </w:t>
+      </w:r>
+      <w:r>
+        <w:t xml:space="preserve">order-tracking invariance. Our discrete-bin ablation makes the distinction concrete: conditioning on the</w:t>
+      </w:r>
+      <w:r>
+        <w:t xml:space="preserve"> </w:t>
+      </w:r>
+      <w:r>
+        <w:t xml:space="preserve">continuous covariate beats conditioning on a binned (discrete) version of it, which is the form the</w:t>
+      </w:r>
+      <w:r>
+        <w:t xml:space="preserve"> </w:t>
+      </w:r>
+      <w:r>
+        <w:t xml:space="preserve">closest prior work takes.</w:t>
       </w:r>
     </w:p>
     <w:bookmarkEnd w:id="11"/>
@@ -1363,7 +1479,7 @@
       </w:r>
     </w:p>
     <w:bookmarkEnd w:id="12"/>
-    <w:bookmarkStart w:id="13" w:name="method"/>
+    <w:bookmarkStart w:id="16" w:name="method"/>
     <w:p>
       <w:pPr>
         <w:pStyle w:val="Heading2"/>
@@ -1584,7 +1700,7 @@
         <w:t xml:space="preserve"> </w:t>
       </w:r>
       <w:r>
-        <w:t xml:space="preserve">We estimate the local healthy mean at speed</w:t>
+        <w:t xml:space="preserve">Figure 1 shows the pipeline. We estimate the local healthy mean at speed</w:t>
       </w:r>
       <w:r>
         <w:t xml:space="preserve"> </w:t>
@@ -2192,6 +2308,161 @@
     <w:p>
       <w:pPr>
         <w:pStyle w:val="BodyText"/>
+        <w:jc w:val="center"/>
+        <w:keepNext/>
+        <w:keepLines/>
+        <w:widowControl w:val="1"/>
+      </w:pPr>
+      <w:r>
+        <w:drawing>
+          <wp:inline>
+            <wp:extent cx="5943600" cy="2049024"/>
+            <wp:effectExtent b="0" l="0" r="0" t="0"/>
+            <wp:docPr descr="Method schematic: revolution windowing, spectrum, speed-conditional mean subtraction, reconstruction-error score" title="" id="14" name="Picture"/>
+            <a:graphic>
+              <a:graphicData uri="http://schemas.openxmlformats.org/drawingml/2006/picture">
+                <pic:pic>
+                  <pic:nvPicPr>
+                    <pic:cNvPr descr="figures/fig_method.png" id="15" name="Picture"/>
+                    <pic:cNvPicPr>
+                      <a:picLocks noChangeArrowheads="1" noChangeAspect="1"/>
+                    </pic:cNvPicPr>
+                  </pic:nvPicPr>
+                  <pic:blipFill>
+                    <a:blip r:embed="rId13"/>
+                    <a:stretch>
+                      <a:fillRect/>
+                    </a:stretch>
+                  </pic:blipFill>
+                  <pic:spPr bwMode="auto">
+                    <a:xfrm>
+                      <a:off x="0" y="0"/>
+                      <a:ext cx="5943600" cy="2049024"/>
+                    </a:xfrm>
+                    <a:prstGeom prst="rect">
+                      <a:avLst/>
+                    </a:prstGeom>
+                    <a:noFill/>
+                    <a:ln w="9525">
+                      <a:noFill/>
+                      <a:headEnd/>
+                      <a:tailEnd/>
+                    </a:ln>
+                  </pic:spPr>
+                </pic:pic>
+              </a:graphicData>
+            </a:graphic>
+          </wp:inline>
+        </w:drawing>
+      </w:r>
+    </w:p>
+    <w:p>
+      <w:pPr>
+        <w:pStyle w:val="ImageCaption"/>
+        <w:spacing w:before="80" w:after="120" w:line="240" w:lineRule="auto"/>
+        <w:jc w:val="center"/>
+        <w:keepNext w:val="0"/>
+        <w:keepLines/>
+        <w:widowControl w:val="1"/>
+      </w:pPr>
+      <m:oMath>
+        <m:r>
+          <m:t>x</m:t>
+        </m:r>
+      </m:oMath>
+      <m:oMath>
+        <m:r>
+          <m:t>s</m:t>
+        </m:r>
+      </m:oMath>
+      <m:oMath>
+        <m:r>
+          <m:t>m</m:t>
+        </m:r>
+        <m:r>
+          <m:rPr>
+            <m:sty m:val="p"/>
+          </m:rPr>
+          <m:t>(</m:t>
+        </m:r>
+        <m:r>
+          <m:t>s</m:t>
+        </m:r>
+        <m:r>
+          <m:rPr>
+            <m:sty m:val="p"/>
+          </m:rPr>
+          <m:t>)</m:t>
+        </m:r>
+      </m:oMath>
+      <m:oMath>
+        <m:r>
+          <m:t>k</m:t>
+        </m:r>
+      </m:oMath>
+      <m:oMath>
+        <m:r>
+          <m:t>r</m:t>
+        </m:r>
+        <m:r>
+          <m:rPr>
+            <m:sty m:val="p"/>
+          </m:rPr>
+          <m:t>=</m:t>
+        </m:r>
+        <m:r>
+          <m:t>x</m:t>
+        </m:r>
+        <m:r>
+          <m:rPr>
+            <m:sty m:val="p"/>
+          </m:rPr>
+          <m:t>−</m:t>
+        </m:r>
+        <m:r>
+          <m:t>m</m:t>
+        </m:r>
+        <m:r>
+          <m:rPr>
+            <m:sty m:val="p"/>
+          </m:rPr>
+          <m:t>(</m:t>
+        </m:r>
+        <m:r>
+          <m:t>s</m:t>
+        </m:r>
+        <m:r>
+          <m:rPr>
+            <m:sty m:val="p"/>
+          </m:rPr>
+          <m:t>)</m:t>
+        </m:r>
+      </m:oMath>
+      <w:r>
+        <w:rPr>
+          <w:b/>
+          <w:i/>
+        </w:rPr>
+        <w:t>Figure 1.</w:t>
+      </w:r>
+      <w:r>
+        <w:rPr>
+          <w:b w:val="0"/>
+          <w:i/>
+        </w:rPr>
+        <w:t xml:space="preserve"> </w:t>
+      </w:r>
+      <w:r>
+        <w:rPr>
+          <w:b w:val="0"/>
+          <w:i/>
+        </w:rPr>
+        <w:t>The speed-conditional detector. A window is formed over whole shaft revolutions and reduced to a log-magnitude spectrum  with its measured speed . The speed-conditional mean , the average of the  healthy-training windows nearest in speed, is subtracted; the reconstruction error of the residual  is the anomaly score. Only the mean-subtraction stage differs from the unconditional baseline.</w:t>
+      </w:r>
+    </w:p>
+    <w:p>
+      <w:pPr>
+        <w:pStyle w:val="BodyText"/>
         <w:jc w:val="both"/>
         <w:keepNext w:val="0"/>
         <w:keepLines w:val="0"/>
@@ -2782,8 +3053,8 @@
         <w:t xml:space="preserve">training windows (or their per-speed summaries) for the lookup.</w:t>
       </w:r>
     </w:p>
-    <w:bookmarkEnd w:id="13"/>
-    <w:bookmarkStart w:id="14" w:name="experimental-setup"/>
+    <w:bookmarkEnd w:id="16"/>
+    <w:bookmarkStart w:id="17" w:name="experimental-setup"/>
     <w:p>
       <w:pPr>
         <w:pStyle w:val="Heading2"/>
@@ -2804,7 +3075,7 @@
         <w:widowControl w:val="1"/>
       </w:pPr>
       <w:r>
-        <w:t xml:space="preserve">We use the MaFaulDa machinery-fault database: a rotor test rig instrumented with two tri-axial</w:t>
+        <w:t xml:space="preserve">We use the MaFaulDa machinery-fault database [1, 2]: a rotor test rig instrumented with two tri-axial</w:t>
       </w:r>
       <w:r>
         <w:t xml:space="preserve"> </w:t>
@@ -3002,8 +3273,8 @@
         <w:t xml:space="preserve">speed-conditioning, this must collapse the AUC.</w:t>
       </w:r>
     </w:p>
-    <w:bookmarkEnd w:id="14"/>
-    <w:bookmarkStart w:id="21" w:name="results"/>
+    <w:bookmarkEnd w:id="17"/>
+    <w:bookmarkStart w:id="24" w:name="results"/>
     <w:p>
       <w:pPr>
         <w:pStyle w:val="Heading2"/>
@@ -4537,7 +4808,13 @@
         <w:widowControl w:val="1"/>
       </w:pPr>
       <w:r>
-        <w:t xml:space="preserve">Table 1 is the main result. Conditioning is the best detector for every fault type in both</w:t>
+        <w:t xml:space="preserve">Table 1 is the main result, and Figure 2 summarizes it alongside the backbone and channel</w:t>
+      </w:r>
+      <w:r>
+        <w:t xml:space="preserve"> </w:t>
+      </w:r>
+      <w:r>
+        <w:t xml:space="preserve">comparisons. Conditioning is the best detector for every fault type in both</w:t>
       </w:r>
       <w:r>
         <w:t xml:space="preserve"> </w:t>
@@ -4719,18 +4996,18 @@
           <wp:inline>
             <wp:extent cx="5943600" cy="1743456"/>
             <wp:effectExtent b="0" l="0" r="0" t="0"/>
-            <wp:docPr descr="Summary of results across fault types, backbones, and channels" title="" id="16" name="Picture"/>
+            <wp:docPr descr="Summary of results across fault types, backbones, and channels" title="" id="19" name="Picture"/>
             <a:graphic>
               <a:graphicData uri="http://schemas.openxmlformats.org/drawingml/2006/picture">
                 <pic:pic>
                   <pic:nvPicPr>
-                    <pic:cNvPr descr="figures/fig_summary.png" id="17" name="Picture"/>
+                    <pic:cNvPr descr="figures/fig_summary.png" id="20" name="Picture"/>
                     <pic:cNvPicPr>
                       <a:picLocks noChangeArrowheads="1" noChangeAspect="1"/>
                     </pic:cNvPicPr>
                   </pic:nvPicPr>
                   <pic:blipFill>
-                    <a:blip r:embed="rId15"/>
+                    <a:blip r:embed="rId18"/>
                     <a:stretch>
                       <a:fillRect/>
                     </a:stretch>
@@ -4771,7 +5048,7 @@
           <w:b/>
           <w:i/>
         </w:rPr>
-        <w:t>Figure 1.</w:t>
+        <w:t>Figure 2.</w:t>
       </w:r>
       <w:r>
         <w:rPr>
@@ -5927,7 +6204,7 @@
         <w:t xml:space="preserve"> </w:t>
       </w:r>
       <w:r>
-        <w:t xml:space="preserve">Figure 2 examines the</w:t>
+        <w:t xml:space="preserve">Figure 3 examines the</w:t>
       </w:r>
       <w:r>
         <w:t xml:space="preserve"> </w:t>
@@ -6107,18 +6384,18 @@
           <wp:inline>
             <wp:extent cx="5943600" cy="1703832"/>
             <wp:effectExtent b="0" l="0" r="0" t="0"/>
-            <wp:docPr descr="Held-out-speed degradation, k-sensitivity, and discrete-versus-continuous conditioning" title="" id="19" name="Picture"/>
+            <wp:docPr descr="Held-out-speed degradation, k-sensitivity, and discrete-versus-continuous conditioning" title="" id="22" name="Picture"/>
             <a:graphic>
               <a:graphicData uri="http://schemas.openxmlformats.org/drawingml/2006/picture">
                 <pic:pic>
                   <pic:nvPicPr>
-                    <pic:cNvPr descr="figures/fig_ablations.png" id="20" name="Picture"/>
+                    <pic:cNvPr descr="figures/fig_ablations.png" id="23" name="Picture"/>
                     <pic:cNvPicPr>
                       <a:picLocks noChangeArrowheads="1" noChangeAspect="1"/>
                     </pic:cNvPicPr>
                   </pic:nvPicPr>
                   <pic:blipFill>
-                    <a:blip r:embed="rId18"/>
+                    <a:blip r:embed="rId21"/>
                     <a:stretch>
                       <a:fillRect/>
                     </a:stretch>
@@ -6178,7 +6455,7 @@
           <w:b/>
           <w:i/>
         </w:rPr>
-        <w:t>Figure 2.</w:t>
+        <w:t>Figure 3.</w:t>
       </w:r>
       <w:r>
         <w:rPr>
@@ -6812,13 +7089,13 @@
         <w:t xml:space="preserve"> </w:t>
       </w:r>
       <w:r>
-        <w:t xml:space="preserve">A covariate-shuffle control establishes that the gain requires the true speed labels, not merely the</w:t>
-      </w:r>
-      <w:r>
-        <w:t xml:space="preserve"> </w:t>
-      </w:r>
-      <w:r>
-        <w:t xml:space="preserve">detrending operation. On the primary configuration, detrending healthy-test windows with their true</w:t>
+        <w:t xml:space="preserve">A covariate-shuffle control establishes that the gain requires the true speed labels, not the</w:t>
+      </w:r>
+      <w:r>
+        <w:t xml:space="preserve"> </w:t>
+      </w:r>
+      <w:r>
+        <w:t xml:space="preserve">detrending operation alone. On the primary configuration, detrending healthy-test windows with their true</w:t>
       </w:r>
       <w:r>
         <w:t xml:space="preserve"> </w:t>
@@ -8309,8 +8586,8 @@
         </w:tc>
       </w:tr>
     </w:tbl>
-    <w:bookmarkEnd w:id="21"/>
-    <w:bookmarkStart w:id="22" w:name="discussion-and-limitations"/>
+    <w:bookmarkEnd w:id="24"/>
+    <w:bookmarkStart w:id="25" w:name="discussion-and-limitations"/>
     <w:p>
       <w:pPr>
         <w:pStyle w:val="Heading2"/>
@@ -8488,8 +8765,8 @@
         <w:t xml:space="preserve">channels, a second dataset, and a causal control.</w:t>
       </w:r>
     </w:p>
-    <w:bookmarkEnd w:id="22"/>
-    <w:bookmarkStart w:id="24" w:name="references"/>
+    <w:bookmarkEnd w:id="25"/>
+    <w:bookmarkStart w:id="27" w:name="references"/>
     <w:p>
       <w:pPr>
         <w:pStyle w:val="ReferencesHeading"/>
@@ -8525,7 +8802,7 @@
       <w:r>
         <w:t xml:space="preserve"> </w:t>
       </w:r>
-      <w:hyperlink r:id="rId23">
+      <w:hyperlink r:id="rId26">
         <w:r>
           <w:rPr>
             <w:rStyle w:val="Hyperlink"/>
@@ -8840,6 +9117,594 @@
         <w:t xml:space="preserve">11. </w:t>
       </w:r>
       <w:r>
+        <w:t xml:space="preserve">[11] L. Ruff et al. Deep one-class classification. ICML, 2018.</w:t>
+      </w:r>
+    </w:p>
+    <w:p>
+      <w:pPr>
+        <w:pStyle w:val="ReferenceEntry"/>
+        <w:spacing w:after="100"/>
+        <w:ind w:left="475" w:hanging="475"/>
+        <w:jc w:val="left"/>
+        <w:keepNext w:val="0"/>
+        <w:keepLines w:val="0"/>
+        <w:widowControl w:val="1"/>
+      </w:pPr>
+      <w:r>
+        <w:rPr>
+          <w:rFonts w:ascii="Georgia" w:hAnsi="Georgia"/>
+          <w:sz w:val="20"/>
+        </w:rPr>
+        <w:t xml:space="preserve">12. </w:t>
+      </w:r>
+      <w:r>
+        <w:t xml:space="preserve">[12] K. Roth et al. Towards total recall in industrial anomaly detection. CVPR, 2022. arXiv:2106.08265.</w:t>
+      </w:r>
+    </w:p>
+    <w:p>
+      <w:pPr>
+        <w:pStyle w:val="ReferenceEntry"/>
+        <w:spacing w:after="100"/>
+        <w:ind w:left="475" w:hanging="475"/>
+        <w:jc w:val="left"/>
+        <w:keepNext w:val="0"/>
+        <w:keepLines w:val="0"/>
+        <w:widowControl w:val="1"/>
+      </w:pPr>
+      <w:r>
+        <w:rPr>
+          <w:rFonts w:ascii="Georgia" w:hAnsi="Georgia"/>
+          <w:sz w:val="20"/>
+        </w:rPr>
+        <w:t xml:space="preserve">13. </w:t>
+      </w:r>
+      <w:r>
+        <w:t xml:space="preserve">[13] T. Defard et al. PaDiM: a patch distribution modeling framework for anomaly detection and localization. ICPR, 2021. arXiv:2011.08785.</w:t>
+      </w:r>
+    </w:p>
+    <w:p>
+      <w:pPr>
+        <w:pStyle w:val="ReferenceEntry"/>
+        <w:spacing w:after="100"/>
+        <w:ind w:left="475" w:hanging="475"/>
+        <w:jc w:val="left"/>
+        <w:keepNext w:val="0"/>
+        <w:keepLines w:val="0"/>
+        <w:widowControl w:val="1"/>
+      </w:pPr>
+      <w:r>
+        <w:rPr>
+          <w:rFonts w:ascii="Georgia" w:hAnsi="Georgia"/>
+          <w:sz w:val="20"/>
+        </w:rPr>
+        <w:t xml:space="preserve">14. </w:t>
+      </w:r>
+      <w:r>
+        <w:t xml:space="preserve">[14] V. Zavrtanik, M. Kristan, D. Skočaj. DRAEM: a discriminatively trained reconstruction embedding for surface anomaly detection. ICCV, 2021. arXiv:2108.07610.</w:t>
+      </w:r>
+    </w:p>
+    <w:p>
+      <w:pPr>
+        <w:pStyle w:val="ReferenceEntry"/>
+        <w:spacing w:after="100"/>
+        <w:ind w:left="475" w:hanging="475"/>
+        <w:jc w:val="left"/>
+        <w:keepNext w:val="0"/>
+        <w:keepLines w:val="0"/>
+        <w:widowControl w:val="1"/>
+      </w:pPr>
+      <w:r>
+        <w:rPr>
+          <w:rFonts w:ascii="Georgia" w:hAnsi="Georgia"/>
+          <w:sz w:val="20"/>
+        </w:rPr>
+        <w:t xml:space="preserve">15. </w:t>
+      </w:r>
+      <w:r>
+        <w:t xml:space="preserve">[15] T. Schlegl et al. f-AnoGAN: fast unsupervised anomaly detection with generative adversarial networks. Medical Image Analysis, 54:30–44, 2019.</w:t>
+      </w:r>
+    </w:p>
+    <w:p>
+      <w:pPr>
+        <w:pStyle w:val="ReferenceEntry"/>
+        <w:spacing w:after="100"/>
+        <w:ind w:left="475" w:hanging="475"/>
+        <w:jc w:val="left"/>
+        <w:keepNext w:val="0"/>
+        <w:keepLines w:val="0"/>
+        <w:widowControl w:val="1"/>
+      </w:pPr>
+      <w:r>
+        <w:rPr>
+          <w:rFonts w:ascii="Georgia" w:hAnsi="Georgia"/>
+          <w:sz w:val="20"/>
+        </w:rPr>
+        <w:t xml:space="preserve">16. </w:t>
+      </w:r>
+      <w:r>
+        <w:t xml:space="preserve">[16] S. Akcay, A. Atapour-Abarghouei, T. P. Breckon. GANomaly: semi-supervised anomaly detection via adversarial training. ACCV, 2018. arXiv:1805.06725.</w:t>
+      </w:r>
+    </w:p>
+    <w:p>
+      <w:pPr>
+        <w:pStyle w:val="ReferenceEntry"/>
+        <w:spacing w:after="100"/>
+        <w:ind w:left="475" w:hanging="475"/>
+        <w:jc w:val="left"/>
+        <w:keepNext w:val="0"/>
+        <w:keepLines w:val="0"/>
+        <w:widowControl w:val="1"/>
+      </w:pPr>
+      <w:r>
+        <w:rPr>
+          <w:rFonts w:ascii="Georgia" w:hAnsi="Georgia"/>
+          <w:sz w:val="20"/>
+        </w:rPr>
+        <w:t xml:space="preserve">17. </w:t>
+      </w:r>
+      <w:r>
+        <w:t xml:space="preserve">[17] D. Gong et al. Memorizing normality to detect anomaly: memory-augmented deep autoencoder for unsupervised anomaly detection. ICCV, 2019. arXiv:1904.02639.</w:t>
+      </w:r>
+    </w:p>
+    <w:p>
+      <w:pPr>
+        <w:pStyle w:val="ReferenceEntry"/>
+        <w:spacing w:after="100"/>
+        <w:ind w:left="475" w:hanging="475"/>
+        <w:jc w:val="left"/>
+        <w:keepNext w:val="0"/>
+        <w:keepLines w:val="0"/>
+        <w:widowControl w:val="1"/>
+      </w:pPr>
+      <w:r>
+        <w:rPr>
+          <w:rFonts w:ascii="Georgia" w:hAnsi="Georgia"/>
+          <w:sz w:val="20"/>
+        </w:rPr>
+        <w:t xml:space="preserve">18. </w:t>
+      </w:r>
+      <w:r>
+        <w:t xml:space="preserve">[18] P. Bergmann et al. MVTec AD: a comprehensive real-world dataset for unsupervised anomaly detection. CVPR, 2019.</w:t>
+      </w:r>
+    </w:p>
+    <w:p>
+      <w:pPr>
+        <w:pStyle w:val="ReferenceEntry"/>
+        <w:spacing w:after="100"/>
+        <w:ind w:left="475" w:hanging="475"/>
+        <w:jc w:val="left"/>
+        <w:keepNext w:val="0"/>
+        <w:keepLines w:val="0"/>
+        <w:widowControl w:val="1"/>
+      </w:pPr>
+      <w:r>
+        <w:rPr>
+          <w:rFonts w:ascii="Georgia" w:hAnsi="Georgia"/>
+          <w:sz w:val="20"/>
+        </w:rPr>
+        <w:t xml:space="preserve">19. </w:t>
+      </w:r>
+      <w:r>
+        <w:t xml:space="preserve">[19] R. Zhao et al. Deep learning and its applications to machine health monitoring. Mechanical Systems and Signal Processing, 115:213–237, 2019.</w:t>
+      </w:r>
+    </w:p>
+    <w:p>
+      <w:pPr>
+        <w:pStyle w:val="ReferenceEntry"/>
+        <w:spacing w:after="100"/>
+        <w:ind w:left="475" w:hanging="475"/>
+        <w:jc w:val="left"/>
+        <w:keepNext w:val="0"/>
+        <w:keepLines w:val="0"/>
+        <w:widowControl w:val="1"/>
+      </w:pPr>
+      <w:r>
+        <w:rPr>
+          <w:rFonts w:ascii="Georgia" w:hAnsi="Georgia"/>
+          <w:sz w:val="20"/>
+        </w:rPr>
+        <w:t xml:space="preserve">20. </w:t>
+      </w:r>
+      <w:r>
+        <w:t xml:space="preserve">[20] Y. Lei et al. Applications of machine learning to machine fault diagnosis: a review and roadmap. Mechanical Systems and Signal Processing, 138:106587, 2020.</w:t>
+      </w:r>
+    </w:p>
+    <w:p>
+      <w:pPr>
+        <w:pStyle w:val="ReferenceEntry"/>
+        <w:spacing w:after="100"/>
+        <w:ind w:left="475" w:hanging="475"/>
+        <w:jc w:val="left"/>
+        <w:keepNext w:val="0"/>
+        <w:keepLines w:val="0"/>
+        <w:widowControl w:val="1"/>
+      </w:pPr>
+      <w:r>
+        <w:rPr>
+          <w:rFonts w:ascii="Georgia" w:hAnsi="Georgia"/>
+          <w:sz w:val="20"/>
+        </w:rPr>
+        <w:t xml:space="preserve">21. </w:t>
+      </w:r>
+      <w:r>
+        <w:t xml:space="preserve">[21] W. A. Smith, R. B. Randall. Rolling element bearing diagnostics using the Case Western Reserve University data: a benchmark study. Mechanical Systems and Signal Processing, 64–65:100–131, 2015.</w:t>
+      </w:r>
+    </w:p>
+    <w:p>
+      <w:pPr>
+        <w:pStyle w:val="ReferenceEntry"/>
+        <w:spacing w:after="100"/>
+        <w:ind w:left="475" w:hanging="475"/>
+        <w:jc w:val="left"/>
+        <w:keepNext w:val="0"/>
+        <w:keepLines w:val="0"/>
+        <w:widowControl w:val="1"/>
+      </w:pPr>
+      <w:r>
+        <w:rPr>
+          <w:rFonts w:ascii="Georgia" w:hAnsi="Georgia"/>
+          <w:sz w:val="20"/>
+        </w:rPr>
+        <w:t xml:space="preserve">22. </w:t>
+      </w:r>
+      <w:r>
+        <w:t xml:space="preserve">[22] D.-T. Hoang, H.-J. Kang. A survey on deep learning based bearing fault diagnosis. Neurocomputing, 335:327–335, 2019.</w:t>
+      </w:r>
+    </w:p>
+    <w:p>
+      <w:pPr>
+        <w:pStyle w:val="ReferenceEntry"/>
+        <w:spacing w:after="100"/>
+        <w:ind w:left="475" w:hanging="475"/>
+        <w:jc w:val="left"/>
+        <w:keepNext w:val="0"/>
+        <w:keepLines w:val="0"/>
+        <w:widowControl w:val="1"/>
+      </w:pPr>
+      <w:r>
+        <w:rPr>
+          <w:rFonts w:ascii="Georgia" w:hAnsi="Georgia"/>
+          <w:sz w:val="20"/>
+        </w:rPr>
+        <w:t xml:space="preserve">23. </w:t>
+      </w:r>
+      <w:r>
+        <w:t xml:space="preserve">[23] K. R. Fyfe, E. D. S. Munck. Analysis of computed order tracking. Mechanical Systems and Signal Processing, 11(2):187–205, 1997.</w:t>
+      </w:r>
+    </w:p>
+    <w:p>
+      <w:pPr>
+        <w:pStyle w:val="ReferenceEntry"/>
+        <w:spacing w:after="100"/>
+        <w:ind w:left="475" w:hanging="475"/>
+        <w:jc w:val="left"/>
+        <w:keepNext w:val="0"/>
+        <w:keepLines w:val="0"/>
+        <w:widowControl w:val="1"/>
+      </w:pPr>
+      <w:r>
+        <w:rPr>
+          <w:rFonts w:ascii="Georgia" w:hAnsi="Georgia"/>
+          <w:sz w:val="20"/>
+        </w:rPr>
+        <w:t xml:space="preserve">24. </w:t>
+      </w:r>
+      <w:r>
+        <w:t xml:space="preserve">[24] R. B. Randall, J. Antoni. Rolling element bearing diagnostics: a tutorial. Mechanical Systems and Signal Processing, 25(2):485–520, 2011.</w:t>
+      </w:r>
+    </w:p>
+    <w:p>
+      <w:pPr>
+        <w:pStyle w:val="ReferenceEntry"/>
+        <w:spacing w:after="100"/>
+        <w:ind w:left="475" w:hanging="475"/>
+        <w:jc w:val="left"/>
+        <w:keepNext w:val="0"/>
+        <w:keepLines w:val="0"/>
+        <w:widowControl w:val="1"/>
+      </w:pPr>
+      <w:r>
+        <w:rPr>
+          <w:rFonts w:ascii="Georgia" w:hAnsi="Georgia"/>
+          <w:sz w:val="20"/>
+        </w:rPr>
+        <w:t xml:space="preserve">25. </w:t>
+      </w:r>
+      <w:r>
+        <w:t xml:space="preserve">[25] H. Vold, M. Mains, J. Blough. Theoretical foundations for high-performance order tracking with the Vold-Kalman tracking filter. SAE Technical Paper 972007, 1997.</w:t>
+      </w:r>
+    </w:p>
+    <w:p>
+      <w:pPr>
+        <w:pStyle w:val="ReferenceEntry"/>
+        <w:spacing w:after="100"/>
+        <w:ind w:left="475" w:hanging="475"/>
+        <w:jc w:val="left"/>
+        <w:keepNext w:val="0"/>
+        <w:keepLines w:val="0"/>
+        <w:widowControl w:val="1"/>
+      </w:pPr>
+      <w:r>
+        <w:rPr>
+          <w:rFonts w:ascii="Georgia" w:hAnsi="Georgia"/>
+          <w:sz w:val="20"/>
+        </w:rPr>
+        <w:t xml:space="preserve">26. </w:t>
+      </w:r>
+      <w:r>
+        <w:t xml:space="preserve">[26] J. Antoni, R. B. Randall. The spectral kurtosis: application to the vibratory surveillance and diagnostics of rotating machines. Mechanical Systems and Signal Processing, 20(2):308–331, 2006.</w:t>
+      </w:r>
+    </w:p>
+    <w:p>
+      <w:pPr>
+        <w:pStyle w:val="ReferenceEntry"/>
+        <w:spacing w:after="100"/>
+        <w:ind w:left="475" w:hanging="475"/>
+        <w:jc w:val="left"/>
+        <w:keepNext w:val="0"/>
+        <w:keepLines w:val="0"/>
+        <w:widowControl w:val="1"/>
+      </w:pPr>
+      <w:r>
+        <w:rPr>
+          <w:rFonts w:ascii="Georgia" w:hAnsi="Georgia"/>
+          <w:sz w:val="20"/>
+        </w:rPr>
+        <w:t xml:space="preserve">27. </w:t>
+      </w:r>
+      <w:r>
+        <w:t xml:space="preserve">[27] K. Dohi et al. Description and discussion on DCASE 2023 Challenge Task 2: first-shot unsupervised anomalous sound detection for machine condition monitoring. arXiv:2305.07828, 2023.</w:t>
+      </w:r>
+    </w:p>
+    <w:p>
+      <w:pPr>
+        <w:pStyle w:val="ReferenceEntry"/>
+        <w:spacing w:after="100"/>
+        <w:ind w:left="475" w:hanging="475"/>
+        <w:jc w:val="left"/>
+        <w:keepNext w:val="0"/>
+        <w:keepLines w:val="0"/>
+        <w:widowControl w:val="1"/>
+      </w:pPr>
+      <w:r>
+        <w:rPr>
+          <w:rFonts w:ascii="Georgia" w:hAnsi="Georgia"/>
+          <w:sz w:val="20"/>
+        </w:rPr>
+        <w:t xml:space="preserve">28. </w:t>
+      </w:r>
+      <w:r>
+        <w:t xml:space="preserve">[28] P. Primus et al. Anomalous sound detection as a simple binary classification problem with careful selection of proxy outlier examples. DCASE Workshop, 2020. arXiv:2011.02949.</w:t>
+      </w:r>
+    </w:p>
+    <w:p>
+      <w:pPr>
+        <w:pStyle w:val="ReferenceEntry"/>
+        <w:spacing w:after="100"/>
+        <w:ind w:left="475" w:hanging="475"/>
+        <w:jc w:val="left"/>
+        <w:keepNext w:val="0"/>
+        <w:keepLines w:val="0"/>
+        <w:widowControl w:val="1"/>
+      </w:pPr>
+      <w:r>
+        <w:rPr>
+          <w:rFonts w:ascii="Georgia" w:hAnsi="Georgia"/>
+          <w:sz w:val="20"/>
+        </w:rPr>
+        <w:t xml:space="preserve">29. </w:t>
+      </w:r>
+      <w:r>
+        <w:t xml:space="preserve">[29] W. Li et al. A systematic review of deep transfer learning for machinery fault diagnosis. Neurocomputing, 407:121–135, 2020.</w:t>
+      </w:r>
+    </w:p>
+    <w:p>
+      <w:pPr>
+        <w:pStyle w:val="ReferenceEntry"/>
+        <w:spacing w:after="100"/>
+        <w:ind w:left="475" w:hanging="475"/>
+        <w:jc w:val="left"/>
+        <w:keepNext w:val="0"/>
+        <w:keepLines w:val="0"/>
+        <w:widowControl w:val="1"/>
+      </w:pPr>
+      <w:r>
+        <w:rPr>
+          <w:rFonts w:ascii="Georgia" w:hAnsi="Georgia"/>
+          <w:sz w:val="20"/>
+        </w:rPr>
+        <w:t xml:space="preserve">30. </w:t>
+      </w:r>
+      <w:r>
+        <w:t xml:space="preserve">[30] L. Dinh, J. Sohl-Dickstein, S. Bengio. Density estimation using Real NVP. ICLR, 2017. arXiv:1605.08803.</w:t>
+      </w:r>
+    </w:p>
+    <w:p>
+      <w:pPr>
+        <w:pStyle w:val="ReferenceEntry"/>
+        <w:spacing w:after="100"/>
+        <w:ind w:left="475" w:hanging="475"/>
+        <w:jc w:val="left"/>
+        <w:keepNext w:val="0"/>
+        <w:keepLines w:val="0"/>
+        <w:widowControl w:val="1"/>
+      </w:pPr>
+      <w:r>
+        <w:rPr>
+          <w:rFonts w:ascii="Georgia" w:hAnsi="Georgia"/>
+          <w:sz w:val="20"/>
+        </w:rPr>
+        <w:t xml:space="preserve">31. </w:t>
+      </w:r>
+      <w:r>
+        <w:t xml:space="preserve">[31] D. P. Kingma, P. Dhariwal. Glow: generative flow with invertible 1×1 convolutions. NeurIPS, 2018. arXiv:1807.03039.</w:t>
+      </w:r>
+    </w:p>
+    <w:p>
+      <w:pPr>
+        <w:pStyle w:val="ReferenceEntry"/>
+        <w:spacing w:after="100"/>
+        <w:ind w:left="475" w:hanging="475"/>
+        <w:jc w:val="left"/>
+        <w:keepNext w:val="0"/>
+        <w:keepLines w:val="0"/>
+        <w:widowControl w:val="1"/>
+      </w:pPr>
+      <w:r>
+        <w:rPr>
+          <w:rFonts w:ascii="Georgia" w:hAnsi="Georgia"/>
+          <w:sz w:val="20"/>
+        </w:rPr>
+        <w:t xml:space="preserve">32. </w:t>
+      </w:r>
+      <w:r>
+        <w:t xml:space="preserve">[32] G. Papamakarios et al. Normalizing flows for probabilistic modeling and inference. Journal of Machine Learning Research, 22(57):1–64, 2021. arXiv:1912.02762.</w:t>
+      </w:r>
+    </w:p>
+    <w:p>
+      <w:pPr>
+        <w:pStyle w:val="ReferenceEntry"/>
+        <w:spacing w:after="100"/>
+        <w:ind w:left="475" w:hanging="475"/>
+        <w:jc w:val="left"/>
+        <w:keepNext w:val="0"/>
+        <w:keepLines w:val="0"/>
+        <w:widowControl w:val="1"/>
+      </w:pPr>
+      <w:r>
+        <w:rPr>
+          <w:rFonts w:ascii="Georgia" w:hAnsi="Georgia"/>
+          <w:sz w:val="20"/>
+        </w:rPr>
+        <w:t xml:space="preserve">33. </w:t>
+      </w:r>
+      <w:r>
+        <w:t xml:space="preserve">[33] M. Rudolph, B. Wandt, B. Rosenhahn. Same same but DifferNet: semi-supervised defect detection with normalizing flows. WACV, 2021. arXiv:2008.12577.</w:t>
+      </w:r>
+    </w:p>
+    <w:p>
+      <w:pPr>
+        <w:pStyle w:val="ReferenceEntry"/>
+        <w:spacing w:after="100"/>
+        <w:ind w:left="475" w:hanging="475"/>
+        <w:jc w:val="left"/>
+        <w:keepNext w:val="0"/>
+        <w:keepLines w:val="0"/>
+        <w:widowControl w:val="1"/>
+      </w:pPr>
+      <w:r>
+        <w:rPr>
+          <w:rFonts w:ascii="Georgia" w:hAnsi="Georgia"/>
+          <w:sz w:val="20"/>
+        </w:rPr>
+        <w:t xml:space="preserve">34. </w:t>
+      </w:r>
+      <w:r>
+        <w:t xml:space="preserve">[34] D. P. Kingma, M. Welling. Auto-encoding variational Bayes. ICLR, 2014. arXiv:1312.6114.</w:t>
+      </w:r>
+    </w:p>
+    <w:p>
+      <w:pPr>
+        <w:pStyle w:val="ReferenceEntry"/>
+        <w:spacing w:after="100"/>
+        <w:ind w:left="475" w:hanging="475"/>
+        <w:jc w:val="left"/>
+        <w:keepNext w:val="0"/>
+        <w:keepLines w:val="0"/>
+        <w:widowControl w:val="1"/>
+      </w:pPr>
+      <w:r>
+        <w:rPr>
+          <w:rFonts w:ascii="Georgia" w:hAnsi="Georgia"/>
+          <w:sz w:val="20"/>
+        </w:rPr>
+        <w:t xml:space="preserve">35. </w:t>
+      </w:r>
+      <w:r>
+        <w:t xml:space="preserve">[35] K. Lee et al. A simple unified framework for detecting out-of-distribution samples and adversarial attacks. NeurIPS, 2018. arXiv:1807.03888.</w:t>
+      </w:r>
+    </w:p>
+    <w:p>
+      <w:pPr>
+        <w:pStyle w:val="ReferenceEntry"/>
+        <w:spacing w:after="100"/>
+        <w:ind w:left="475" w:hanging="475"/>
+        <w:jc w:val="left"/>
+        <w:keepNext w:val="0"/>
+        <w:keepLines w:val="0"/>
+        <w:widowControl w:val="1"/>
+      </w:pPr>
+      <w:r>
+        <w:rPr>
+          <w:rFonts w:ascii="Georgia" w:hAnsi="Georgia"/>
+          <w:sz w:val="20"/>
+        </w:rPr>
+        <w:t xml:space="preserve">36. </w:t>
+      </w:r>
+      <w:r>
+        <w:t xml:space="preserve">[36] L. Bergman, N. Cohen, Y. Hoshen. Deep nearest neighbor anomaly detection. arXiv:2002.10445, 2020.</w:t>
+      </w:r>
+    </w:p>
+    <w:p>
+      <w:pPr>
+        <w:pStyle w:val="ReferenceEntry"/>
+        <w:spacing w:after="100"/>
+        <w:ind w:left="475" w:hanging="475"/>
+        <w:jc w:val="left"/>
+        <w:keepNext w:val="0"/>
+        <w:keepLines w:val="0"/>
+        <w:widowControl w:val="1"/>
+      </w:pPr>
+      <w:r>
+        <w:rPr>
+          <w:rFonts w:ascii="Georgia" w:hAnsi="Georgia"/>
+          <w:sz w:val="20"/>
+        </w:rPr>
+        <w:t xml:space="preserve">37. </w:t>
+      </w:r>
+      <w:r>
+        <w:t xml:space="preserve">[37] Y. Sun et al. Out-of-distribution detection with deep nearest neighbors. ICML, 2022. arXiv:2204.06507.</w:t>
+      </w:r>
+    </w:p>
+    <w:p>
+      <w:pPr>
+        <w:pStyle w:val="ReferenceEntry"/>
+        <w:spacing w:after="100"/>
+        <w:ind w:left="475" w:hanging="475"/>
+        <w:jc w:val="left"/>
+        <w:keepNext w:val="0"/>
+        <w:keepLines w:val="0"/>
+        <w:widowControl w:val="1"/>
+      </w:pPr>
+      <w:r>
+        <w:rPr>
+          <w:rFonts w:ascii="Georgia" w:hAnsi="Georgia"/>
+          <w:sz w:val="20"/>
+        </w:rPr>
+        <w:t xml:space="preserve">38. </w:t>
+      </w:r>
+      <w:r>
+        <w:t xml:space="preserve">[38] O. Rippel, P. Mertens, D. Merhof. Modeling the distribution of normal data in pre-trained deep features for anomaly detection. ICPR, 2021. arXiv:2005.14140.</w:t>
+      </w:r>
+    </w:p>
+    <w:p>
+      <w:pPr>
+        <w:pStyle w:val="ReferenceEntry"/>
+        <w:spacing w:after="100"/>
+        <w:ind w:left="475" w:hanging="475"/>
+        <w:jc w:val="left"/>
+        <w:keepNext w:val="0"/>
+        <w:keepLines w:val="0"/>
+        <w:widowControl w:val="1"/>
+      </w:pPr>
+      <w:r>
+        <w:rPr>
+          <w:rFonts w:ascii="Georgia" w:hAnsi="Georgia"/>
+          <w:sz w:val="20"/>
+        </w:rPr>
+        <w:t xml:space="preserve">39. </w:t>
+      </w:r>
+      <w:r>
         <w:rPr>
           <w:b/>
           <w:bCs/>
@@ -8877,8 +9742,8 @@
         <w:t xml:space="preserve">Draft · results reproducible from the EngineKnock experiment registry.</w:t>
       </w:r>
     </w:p>
-    <w:bookmarkEnd w:id="24"/>
-    <w:bookmarkEnd w:id="25"/>
+    <w:bookmarkEnd w:id="27"/>
+    <w:bookmarkEnd w:id="28"/>
     <w:sectPr>
       <w:footerReference w:type="default" r:id="rId9"/>
       <w:pgSz w:h="15840" w:w="12240"/>

</xml_diff>

<commit_message>
Add second author (Yehudit Aperstein) and affiliations (HIT, Afeka)
Co-Authored-By: Claude Opus 4.8 <noreply@anthropic.com>
</commit_message>
<xml_diff>
--- a/docs/EngineKnock_speed_conditional.docx
+++ b/docs/EngineKnock_speed_conditional.docx
@@ -19,39 +19,106 @@
     <w:p>
       <w:pPr>
         <w:pStyle w:val="Subtitle"/>
-        <w:spacing w:before="0" w:after="40"/>
+        <w:spacing w:before="0" w:after="160"/>
         <w:jc w:val="center"/>
-        <w:keepNext/>
+        <w:keepNext w:val="0"/>
         <w:keepLines/>
         <w:widowControl w:val="1"/>
       </w:pPr>
       <w:r>
         <w:rPr>
           <w:rFonts w:ascii="Georgia" w:hAnsi="Georgia"/>
-          <w:b/>
-          <w:i w:val="0"/>
-          <w:sz w:val="24"/>
+          <w:b w:val="0"/>
+          <w:i/>
+          <w:sz w:val="20"/>
         </w:rPr>
         <w:t xml:space="preserve">Alexander Apartsin</w:t>
+      </w:r>
+      <w:r>
+        <w:rPr>
+          <w:rFonts w:ascii="Georgia" w:hAnsi="Georgia"/>
+          <w:b w:val="0"/>
+          <w:i/>
+          <w:sz w:val="20"/>
+          <w:vertAlign w:val="superscript"/>
+        </w:rPr>
+        <w:t xml:space="preserve">1</w:t>
+      </w:r>
+      <w:r>
+        <w:rPr>
+          <w:rFonts w:ascii="Georgia" w:hAnsi="Georgia"/>
+          <w:b w:val="0"/>
+          <w:i/>
+          <w:sz w:val="20"/>
+        </w:rPr>
+        <w:t xml:space="preserve">, Yehudit Aperstein</w:t>
+      </w:r>
+      <w:r>
+        <w:rPr>
+          <w:rFonts w:ascii="Georgia" w:hAnsi="Georgia"/>
+          <w:b w:val="0"/>
+          <w:i/>
+          <w:sz w:val="20"/>
+          <w:vertAlign w:val="superscript"/>
+        </w:rPr>
+        <w:t xml:space="preserve">2</w:t>
       </w:r>
     </w:p>
     <w:p>
       <w:pPr>
         <w:pStyle w:val="Subtitle"/>
-        <w:spacing w:before="0" w:after="40"/>
+        <w:spacing w:before="0" w:after="160"/>
         <w:jc w:val="center"/>
-        <w:keepNext/>
+        <w:keepNext w:val="0"/>
         <w:keepLines/>
         <w:widowControl w:val="1"/>
       </w:pPr>
       <w:r>
         <w:rPr>
           <w:rFonts w:ascii="Georgia" w:hAnsi="Georgia"/>
-          <w:b/>
-          <w:i w:val="0"/>
-          <w:sz w:val="24"/>
+          <w:b w:val="0"/>
+          <w:i/>
+          <w:sz w:val="20"/>
+          <w:vertAlign w:val="superscript"/>
         </w:rPr>
-        <w:t xml:space="preserve">Preprint. Draft generated from the EngineKnock experiment registry.</w:t>
+        <w:t xml:space="preserve">1</w:t>
+      </w:r>
+      <w:r>
+        <w:rPr>
+          <w:rFonts w:ascii="Georgia" w:hAnsi="Georgia"/>
+          <w:b w:val="0"/>
+          <w:i/>
+          <w:sz w:val="20"/>
+        </w:rPr>
+        <w:t xml:space="preserve">School of Computer Science, Faculty of Sciences, Holon Institute of Technology (HIT), Holon, Israel</w:t>
+      </w:r>
+      <w:r>
+        <w:rPr>
+          <w:rFonts w:ascii="Georgia" w:hAnsi="Georgia"/>
+          <w:b w:val="0"/>
+          <w:i/>
+          <w:sz w:val="20"/>
+        </w:rPr>
+        <w:br/>
+      </w:r>
+      <w:r>
+        <w:rPr>
+          <w:rFonts w:ascii="Georgia" w:hAnsi="Georgia"/>
+          <w:b w:val="0"/>
+          <w:i/>
+          <w:sz w:val="20"/>
+          <w:vertAlign w:val="superscript"/>
+        </w:rPr>
+        <w:t xml:space="preserve">2</w:t>
+      </w:r>
+      <w:r>
+        <w:rPr>
+          <w:rFonts w:ascii="Georgia" w:hAnsi="Georgia"/>
+          <w:b w:val="0"/>
+          <w:i/>
+          <w:sz w:val="20"/>
+        </w:rPr>
+        <w:t xml:space="preserve">Intelligent Systems, Afeka Academic College of Engineering, Tel-Aviv, Israel</w:t>
       </w:r>
     </w:p>
     <w:bookmarkStart w:id="9" w:name="abstract"/>

</xml_diff>

<commit_message>
P2 experiments + Fable final-polish pass
P2 (EXP-014): tacho-noise sensitivity (graceful degradation, 0.990->0.959 at 0-20% speed
  error, > baseline throughout) and local-Mahalanobis variant (justifies conditional-mean+PCA);
  added a Robustness paragraph.
Fable polish fixes: correct MIMII-DG citation [39] (was [5]); reconcile split count to ten and
  harmonize shared unconditional cell to 0.956 (one-artifact); fix interior-band bracketing
  contradiction; qualify shuffle-control config; state 6 bands + hyperparameters (R,k,K,d,AE);
  split dense abstract sentence; fix ambiguous 'it'/define w; state discrete-attribute
  conditioning; add intro citations [1-4]; OASSL title; Figure 3a pointer; drop Draft marker.

paper-reviewer: wins-only clean, 0 em-dashes, 39/39 refs cited, no orphan floats.
bibtest: MIMII-DG [39] valid. 11 pages, 3 figures, 5 tables, 39 refs.

Co-Authored-By: Claude Opus 4.8 <noreply@anthropic.com>
</commit_message>
<xml_diff>
--- a/docs/EngineKnock_speed_conditional.docx
+++ b/docs/EngineKnock_speed_conditional.docx
@@ -180,13 +180,13 @@
         <w:t xml:space="preserve"> </w:t>
       </w:r>
       <w:r>
-        <w:t xml:space="preserve">tachometer, realized simply by subtracting a local speed-conditional normal mean, estimated by</w:t>
-      </w:r>
-      <w:r>
-        <w:t xml:space="preserve"> </w:t>
-      </w:r>
-      <w:r>
-        <w:t xml:space="preserve">nearest neighbours in speed, before a standard reconstruction-error detector. On MaFaulDa</w:t>
+        <w:t xml:space="preserve">tachometer. The realization is deliberately simple: subtract a local speed-conditional normal mean,</w:t>
+      </w:r>
+      <w:r>
+        <w:t xml:space="preserve"> </w:t>
+      </w:r>
+      <w:r>
+        <w:t xml:space="preserve">estimated by nearest neighbours in speed, then apply a standard reconstruction-error detector. On MaFaulDa</w:t>
       </w:r>
       <w:r>
         <w:t xml:space="preserve"> </w:t>
@@ -283,13 +283,13 @@
         <w:t xml:space="preserve"> </w:t>
       </w:r>
       <w:r>
-        <w:t xml:space="preserve">adopted by the DCASE unsupervised anomalous-sound-detection challenges and by most machine-condition</w:t>
-      </w:r>
-      <w:r>
-        <w:t xml:space="preserve"> </w:t>
-      </w:r>
-      <w:r>
-        <w:t xml:space="preserve">autoencoder work.</w:t>
+        <w:t xml:space="preserve">adopted by the DCASE (Detection and Classification of Acoustic Scenes and Events) unsupervised</w:t>
+      </w:r>
+      <w:r>
+        <w:t xml:space="preserve"> </w:t>
+      </w:r>
+      <w:r>
+        <w:t xml:space="preserve">anomalous-sound-detection challenges [3, 4] and by most machine-condition autoencoder work.</w:t>
       </w:r>
     </w:p>
     <w:p>
@@ -353,7 +353,7 @@
         <w:t xml:space="preserve"> </w:t>
       </w:r>
       <w:r>
-        <w:t xml:space="preserve">training and test.</w:t>
+        <w:t xml:space="preserve">training and test [3, 4].</w:t>
       </w:r>
     </w:p>
     <w:p>
@@ -547,7 +547,7 @@
         <w:widowControl w:val="1"/>
       </w:pPr>
       <w:r>
-        <w:t xml:space="preserve">Evidence on MaFaulDa that conditioning beats both the unconditional baseline and an order-tracking</w:t>
+        <w:t xml:space="preserve">Evidence on MaFaulDa [1, 2] that conditioning beats both the unconditional baseline and an order-tracking</w:t>
       </w:r>
       <w:r>
         <w:t xml:space="preserve"> </w:t>
@@ -1577,13 +1577,27 @@
         <w:t xml:space="preserve"> </w:t>
       </w:r>
       <w:r>
-        <w:t xml:space="preserve">Each recording carries a once-per-revolution tachometer pulse train. We segment it into</w:t>
-      </w:r>
-      <w:r>
-        <w:t xml:space="preserve"> </w:t>
-      </w:r>
-      <w:r>
-        <w:t xml:space="preserve">non-overlapping windows of</w:t>
+        <w:t xml:space="preserve">Each recording carries a once-per-revolution tachometer pulse train. Using the pulses, we</w:t>
+      </w:r>
+      <w:r>
+        <w:t xml:space="preserve"> </w:t>
+      </w:r>
+      <w:r>
+        <w:t xml:space="preserve">segment the recording into non-overlapping windows</w:t>
+      </w:r>
+      <w:r>
+        <w:t xml:space="preserve"> </w:t>
+      </w:r>
+      <m:oMath>
+        <m:r>
+          <m:t>w</m:t>
+        </m:r>
+      </m:oMath>
+      <w:r>
+        <w:t xml:space="preserve"> </w:t>
+      </w:r>
+      <w:r>
+        <w:t xml:space="preserve">of</w:t>
       </w:r>
       <w:r>
         <w:t xml:space="preserve"> </w:t>
@@ -1597,13 +1611,13 @@
         <w:t xml:space="preserve"> </w:t>
       </w:r>
       <w:r>
-        <w:t xml:space="preserve">shaft revolutions and take the log-magnitude spectrum of a chosen sensor</w:t>
-      </w:r>
-      <w:r>
-        <w:t xml:space="preserve"> </w:t>
-      </w:r>
-      <w:r>
-        <w:t xml:space="preserve">channel,</w:t>
+        <w:t xml:space="preserve">shaft revolutions and take the log-magnitude</w:t>
+      </w:r>
+      <w:r>
+        <w:t xml:space="preserve"> </w:t>
+      </w:r>
+      <w:r>
+        <w:t xml:space="preserve">spectrum of a chosen sensor channel,</w:t>
       </w:r>
       <w:r>
         <w:t xml:space="preserve"> </w:t>
@@ -3241,25 +3255,126 @@
         <w:t xml:space="preserve"> </w:t>
       </w:r>
       <w:r>
-        <w:t xml:space="preserve">the speed axis into bands, train the healthy model on all-but-one band, and test healthy and fault</w:t>
-      </w:r>
-      <w:r>
-        <w:t xml:space="preserve"> </w:t>
-      </w:r>
-      <w:r>
-        <w:t xml:space="preserve">windows drawn only from the held-out band; this measures generalization to unseen operating speeds.</w:t>
-      </w:r>
-      <w:r>
-        <w:t xml:space="preserve"> </w:t>
-      </w:r>
-      <w:r>
-        <w:t xml:space="preserve">We score with ROC-AUC of healthy-test versus fault, and report matched-speed means over five random</w:t>
-      </w:r>
-      <w:r>
-        <w:t xml:space="preserve"> </w:t>
-      </w:r>
-      <w:r>
-        <w:t xml:space="preserve">splits.</w:t>
+        <w:t xml:space="preserve">the speed axis into six equal-width bands, train the healthy model on all-but-one band, and test healthy</w:t>
+      </w:r>
+      <w:r>
+        <w:t xml:space="preserve"> </w:t>
+      </w:r>
+      <w:r>
+        <w:t xml:space="preserve">and fault windows drawn only from the held-out band; this measures generalization to unseen operating</w:t>
+      </w:r>
+      <w:r>
+        <w:t xml:space="preserve"> </w:t>
+      </w:r>
+      <w:r>
+        <w:t xml:space="preserve">speeds. We score with ROC-AUC of healthy-test versus fault, and report matched-speed means over ten</w:t>
+      </w:r>
+      <w:r>
+        <w:t xml:space="preserve"> </w:t>
+      </w:r>
+      <w:r>
+        <w:t xml:space="preserve">random splits. Unless stated otherwise, windows span</w:t>
+      </w:r>
+      <w:r>
+        <w:t xml:space="preserve"> </w:t>
+      </w:r>
+      <m:oMath>
+        <m:r>
+          <m:t>R</m:t>
+        </m:r>
+        <m:r>
+          <m:rPr>
+            <m:sty m:val="p"/>
+          </m:rPr>
+          <m:t>=</m:t>
+        </m:r>
+        <m:r>
+          <m:t>16</m:t>
+        </m:r>
+      </m:oMath>
+      <w:r>
+        <w:t xml:space="preserve"> </w:t>
+      </w:r>
+      <w:r>
+        <w:t xml:space="preserve">shaft revolutions resampled to 256 samples</w:t>
+      </w:r>
+      <w:r>
+        <w:t xml:space="preserve"> </w:t>
+      </w:r>
+      <w:r>
+        <w:t xml:space="preserve">per revolution (</w:t>
+      </w:r>
+      <m:oMath>
+        <m:r>
+          <m:t>d</m:t>
+        </m:r>
+        <m:r>
+          <m:rPr>
+            <m:sty m:val="p"/>
+          </m:rPr>
+          <m:t>=</m:t>
+        </m:r>
+        <m:r>
+          <m:t>2049</m:t>
+        </m:r>
+      </m:oMath>
+      <w:r>
+        <w:t xml:space="preserve"> </w:t>
+      </w:r>
+      <w:r>
+        <w:t xml:space="preserve">spectral bins), the conditional mean uses</w:t>
+      </w:r>
+      <w:r>
+        <w:t xml:space="preserve"> </w:t>
+      </w:r>
+      <m:oMath>
+        <m:r>
+          <m:t>k</m:t>
+        </m:r>
+        <m:r>
+          <m:rPr>
+            <m:sty m:val="p"/>
+          </m:rPr>
+          <m:t>=</m:t>
+        </m:r>
+        <m:r>
+          <m:t>15</m:t>
+        </m:r>
+      </m:oMath>
+      <w:r>
+        <w:t xml:space="preserve"> </w:t>
+      </w:r>
+      <w:r>
+        <w:t xml:space="preserve">nearest neighbours in speed,</w:t>
+      </w:r>
+      <w:r>
+        <w:t xml:space="preserve"> </w:t>
+      </w:r>
+      <w:r>
+        <w:t xml:space="preserve">the PCA retains</w:t>
+      </w:r>
+      <w:r>
+        <w:t xml:space="preserve"> </w:t>
+      </w:r>
+      <m:oMath>
+        <m:r>
+          <m:t>K</m:t>
+        </m:r>
+        <m:r>
+          <m:rPr>
+            <m:sty m:val="p"/>
+          </m:rPr>
+          <m:t>=</m:t>
+        </m:r>
+        <m:r>
+          <m:t>32</m:t>
+        </m:r>
+      </m:oMath>
+      <w:r>
+        <w:t xml:space="preserve"> </w:t>
+      </w:r>
+      <w:r>
+        <w:t xml:space="preserve">components, and the autoencoder is a dense 256-32-256 network on the residuals.</w:t>
       </w:r>
     </w:p>
     <w:p>
@@ -3687,7 +3802,7 @@
                 <w:rFonts w:ascii="Georgia" w:hAnsi="Georgia"/>
                 <w:sz w:val="18"/>
               </w:rPr>
-              <w:t xml:space="preserve">0.854</w:t>
+              <w:t xml:space="preserve">0.856</w:t>
             </w:r>
           </w:p>
         </w:tc>
@@ -3716,7 +3831,7 @@
                 <w:rFonts w:ascii="Georgia" w:hAnsi="Georgia"/>
                 <w:sz w:val="18"/>
               </w:rPr>
-              <w:t xml:space="preserve">0.873</w:t>
+              <w:t xml:space="preserve">0.872</w:t>
             </w:r>
           </w:p>
         </w:tc>
@@ -3921,7 +4036,7 @@
                 <w:rFonts w:ascii="Georgia" w:hAnsi="Georgia"/>
                 <w:sz w:val="18"/>
               </w:rPr>
-              <w:t xml:space="preserve">0.953</w:t>
+              <w:t xml:space="preserve">0.950</w:t>
             </w:r>
           </w:p>
         </w:tc>
@@ -4097,7 +4212,7 @@
                 <w:rFonts w:ascii="Georgia" w:hAnsi="Georgia"/>
                 <w:sz w:val="18"/>
               </w:rPr>
-              <w:t xml:space="preserve">0.858</w:t>
+              <w:t xml:space="preserve">0.860</w:t>
             </w:r>
           </w:p>
         </w:tc>
@@ -4126,7 +4241,7 @@
                 <w:rFonts w:ascii="Georgia" w:hAnsi="Georgia"/>
                 <w:sz w:val="18"/>
               </w:rPr>
-              <w:t xml:space="preserve">0.891</w:t>
+              <w:t xml:space="preserve">0.888</w:t>
             </w:r>
           </w:p>
         </w:tc>
@@ -4302,7 +4417,7 @@
                 <w:rFonts w:ascii="Georgia" w:hAnsi="Georgia"/>
                 <w:sz w:val="18"/>
               </w:rPr>
-              <w:t xml:space="preserve">0.998</w:t>
+              <w:t xml:space="preserve">0.999</w:t>
             </w:r>
           </w:p>
         </w:tc>
@@ -4331,7 +4446,7 @@
                 <w:rFonts w:ascii="Georgia" w:hAnsi="Georgia"/>
                 <w:sz w:val="18"/>
               </w:rPr>
-              <w:t xml:space="preserve">0.992</w:t>
+              <w:t xml:space="preserve">0.991</w:t>
             </w:r>
           </w:p>
         </w:tc>
@@ -4536,7 +4651,7 @@
                 <w:rFonts w:ascii="Georgia" w:hAnsi="Georgia"/>
                 <w:sz w:val="18"/>
               </w:rPr>
-              <w:t xml:space="preserve">0.974</w:t>
+              <w:t xml:space="preserve">0.973</w:t>
             </w:r>
           </w:p>
         </w:tc>
@@ -5199,7 +5314,7 @@
         <w:t xml:space="preserve"> </w:t>
       </w:r>
       <w:r>
-        <w:t xml:space="preserve">64, moves its held-out-speed AUC only within [0.78, 0.837]; the best configuration, 0.837, still sits</w:t>
+        <w:t xml:space="preserve">64, moves its held-out-speed AUC only within [0.780, 0.837]; the best configuration, 0.837, still sits</w:t>
       </w:r>
       <w:r>
         <w:t xml:space="preserve"> </w:t>
@@ -5949,7 +6064,7 @@
                 <w:rFonts w:ascii="Georgia" w:hAnsi="Georgia"/>
                 <w:sz w:val="19"/>
               </w:rPr>
-              <w:t xml:space="preserve">0.957 / 0.897</w:t>
+              <w:t xml:space="preserve">0.956 / 0.897</w:t>
             </w:r>
           </w:p>
         </w:tc>
@@ -5978,7 +6093,7 @@
                 <w:rFonts w:ascii="Georgia" w:hAnsi="Georgia"/>
                 <w:sz w:val="19"/>
               </w:rPr>
-              <w:t xml:space="preserve">0.990 / 0.937</w:t>
+              <w:t xml:space="preserve">0.989 / 0.937</w:t>
             </w:r>
           </w:p>
         </w:tc>
@@ -6417,7 +6532,7 @@
         <w:t xml:space="preserve"> </w:t>
       </w:r>
       <w:r>
-        <w:t xml:space="preserve">and subtracting the per-bin mean already improves over the unconditional baseline (0.955 to 0.980 matched</w:t>
+        <w:t xml:space="preserve">and subtracting the per-bin mean already improves over the unconditional baseline (0.956 to 0.980 matched</w:t>
       </w:r>
       <w:r>
         <w:t xml:space="preserve"> </w:t>
@@ -6745,7 +6860,7 @@
                 <w:rFonts w:ascii="Georgia" w:hAnsi="Georgia"/>
                 <w:sz w:val="19"/>
               </w:rPr>
-              <w:t xml:space="preserve">0.955</w:t>
+              <w:t xml:space="preserve">0.956</w:t>
             </w:r>
           </w:p>
         </w:tc>
@@ -7162,19 +7277,19 @@
         <w:t xml:space="preserve"> </w:t>
       </w:r>
       <w:r>
-        <w:t xml:space="preserve">detrending operation alone. On the primary configuration, detrending healthy-test windows with their true</w:t>
-      </w:r>
-      <w:r>
-        <w:t xml:space="preserve"> </w:t>
-      </w:r>
-      <w:r>
-        <w:t xml:space="preserve">speeds gives AUC 0.961; detrending the same windows with randomly permuted speed labels collapses</w:t>
-      </w:r>
-      <w:r>
-        <w:t xml:space="preserve"> </w:t>
-      </w:r>
-      <w:r>
-        <w:t xml:space="preserve">it to 0.419, with the mean healthy score rising accordingly. The normal-versus-normal null sits at 0.50 for all methods, confirming the</w:t>
+        <w:t xml:space="preserve">detrending operation alone. On the horizontal-misalignment configuration, detrending healthy-test</w:t>
+      </w:r>
+      <w:r>
+        <w:t xml:space="preserve"> </w:t>
+      </w:r>
+      <w:r>
+        <w:t xml:space="preserve">windows with their true speeds gives AUC 0.961; detrending the same windows with randomly permuted</w:t>
+      </w:r>
+      <w:r>
+        <w:t xml:space="preserve"> </w:t>
+      </w:r>
+      <w:r>
+        <w:t xml:space="preserve">speed labels collapses it to 0.419, with the mean healthy score rising accordingly. The normal-versus-normal null sits at 0.50 for all methods, confirming the</w:t>
       </w:r>
       <w:r>
         <w:t xml:space="preserve"> </w:t>
@@ -7196,6 +7311,76 @@
           <w:b/>
           <w:bCs/>
         </w:rPr>
+        <w:t xml:space="preserve">Robustness to speed error, and the choice of detector.</w:t>
+      </w:r>
+      <w:r>
+        <w:t xml:space="preserve"> </w:t>
+      </w:r>
+      <w:r>
+        <w:t xml:space="preserve">Two further ablations bound the method. First,</w:t>
+      </w:r>
+      <w:r>
+        <w:t xml:space="preserve"> </w:t>
+      </w:r>
+      <w:r>
+        <w:t xml:space="preserve">it tolerates an imperfect tachometer. Adding relative Gaussian noise to the measured speed degrades</w:t>
+      </w:r>
+      <w:r>
+        <w:t xml:space="preserve"> </w:t>
+      </w:r>
+      <w:r>
+        <w:t xml:space="preserve">matched-speed AUC gracefully, from 0.990 at no noise to 0.982 at 2% error and 0.965 at 10%, and it stays</w:t>
+      </w:r>
+      <w:r>
+        <w:t xml:space="preserve"> </w:t>
+      </w:r>
+      <w:r>
+        <w:t xml:space="preserve">above the unconditional baseline (0.956) even at 20% error; since realistic tachometer error is well below</w:t>
+      </w:r>
+      <w:r>
+        <w:t xml:space="preserve"> </w:t>
+      </w:r>
+      <w:r>
+        <w:t xml:space="preserve">one percent, the method needs a measured speed, not a precise one. Second, the conditional-mean plus</w:t>
+      </w:r>
+      <w:r>
+        <w:t xml:space="preserve"> </w:t>
+      </w:r>
+      <w:r>
+        <w:t xml:space="preserve">reconstruction-error design is what delivers the cross-speed gain. A local Mahalanobis alternative, which</w:t>
+      </w:r>
+      <w:r>
+        <w:t xml:space="preserve"> </w:t>
+      </w:r>
+      <w:r>
+        <w:t xml:space="preserve">scores a window against the mean and per-dimension variance of its speed-neighbours, reaches a higher</w:t>
+      </w:r>
+      <w:r>
+        <w:t xml:space="preserve"> </w:t>
+      </w:r>
+      <w:r>
+        <w:t xml:space="preserve">matched-speed AUC (0.999) but falls to 0.792 under speed shift, below the reconstruction-error detector</w:t>
+      </w:r>
+      <w:r>
+        <w:t xml:space="preserve"> </w:t>
+      </w:r>
+      <w:r>
+        <w:t xml:space="preserve">(0.937): the richer local model overfits the matched regime, while the simpler residual generalizes.</w:t>
+      </w:r>
+    </w:p>
+    <w:p>
+      <w:pPr>
+        <w:pStyle w:val="BodyText"/>
+        <w:jc w:val="both"/>
+        <w:keepNext w:val="0"/>
+        <w:keepLines w:val="0"/>
+        <w:widowControl w:val="1"/>
+      </w:pPr>
+      <w:r>
+        <w:rPr>
+          <w:b/>
+          <w:bCs/>
+        </w:rPr>
         <w:t xml:space="preserve">A second dataset, and the scope of the operating covariate.</w:t>
       </w:r>
       <w:r>
@@ -7208,7 +7393,7 @@
         <w:t xml:space="preserve"> </w:t>
       </w:r>
       <w:r>
-        <w:t xml:space="preserve">On MIMII-DG [5], the DCASE 2022 domain-generalization benchmark of machine sounds, each machine</w:t>
+        <w:t xml:space="preserve">On MIMII-DG [39], the DCASE 2022 domain-generalization benchmark of machine sounds, each machine</w:t>
       </w:r>
       <w:r>
         <w:t xml:space="preserve"> </w:t>
@@ -7220,7 +7405,13 @@
         <w:t xml:space="preserve"> </w:t>
       </w:r>
       <w:r>
-        <w:t xml:space="preserve">detector on that attribute and evaluate all five machine types (Table 5). Conditioning improves both</w:t>
+        <w:t xml:space="preserve">detector on that attribute, using nearest neighbours for continuous attributes and the per-value mean for</w:t>
+      </w:r>
+      <w:r>
+        <w:t xml:space="preserve"> </w:t>
+      </w:r>
+      <w:r>
+        <w:t xml:space="preserve">discrete ones, and evaluate all five machine types (Table 5). Conditioning improves both</w:t>
       </w:r>
       <w:r>
         <w:t xml:space="preserve"> </w:t>
@@ -8733,7 +8924,7 @@
         <w:t xml:space="preserve"> </w:t>
       </w:r>
       <w:r>
-        <w:t xml:space="preserve">data spans the operating range, as in the leave-one-band-out protocol where every held-out band is</w:t>
+        <w:t xml:space="preserve">data spans the operating range, as in the leave-one-band-out protocol where every interior held-out band is</w:t>
       </w:r>
       <w:r>
         <w:t xml:space="preserve"> </w:t>
@@ -8763,25 +8954,31 @@
         <w:t xml:space="preserve"> </w:t>
       </w:r>
       <w:r>
-        <w:t xml:space="preserve">over its duty cycle. The effect is visible in the per-band results, where the weakest conditioning gains</w:t>
-      </w:r>
-      <w:r>
-        <w:t xml:space="preserve"> </w:t>
-      </w:r>
-      <w:r>
-        <w:t xml:space="preserve">sit at the slowest band, the edge of the training support. We also note that the held-out-speed AUC is a</w:t>
-      </w:r>
-      <w:r>
-        <w:t xml:space="preserve"> </w:t>
-      </w:r>
-      <w:r>
-        <w:t xml:space="preserve">per-band average, each band scored independently, and is therefore a stricter per-operating-point measure</w:t>
-      </w:r>
-      <w:r>
-        <w:t xml:space="preserve"> </w:t>
-      </w:r>
-      <w:r>
-        <w:t xml:space="preserve">than the pooled matched-speed AUC rather than a directly comparable number.</w:t>
+        <w:t xml:space="preserve">over its duty cycle. The effect is visible in the per-band results (Figure 3a), where the weakest</w:t>
+      </w:r>
+      <w:r>
+        <w:t xml:space="preserve"> </w:t>
+      </w:r>
+      <w:r>
+        <w:t xml:space="preserve">conditioning gains sit at the slowest band, the one edge of the training support where the local mean</w:t>
+      </w:r>
+      <w:r>
+        <w:t xml:space="preserve"> </w:t>
+      </w:r>
+      <w:r>
+        <w:t xml:space="preserve">must extrapolate rather than interpolate. The held-out-speed AUC is a per-band average, each band scored</w:t>
+      </w:r>
+      <w:r>
+        <w:t xml:space="preserve"> </w:t>
+      </w:r>
+      <w:r>
+        <w:t xml:space="preserve">independently, and is therefore a stricter per-operating-point measure than the pooled matched-speed AUC</w:t>
+      </w:r>
+      <w:r>
+        <w:t xml:space="preserve"> </w:t>
+      </w:r>
+      <w:r>
+        <w:t xml:space="preserve">rather than a directly comparable number.</w:t>
       </w:r>
     </w:p>
     <w:p>
@@ -9772,6 +9969,27 @@
         <w:t xml:space="preserve">39. </w:t>
       </w:r>
       <w:r>
+        <w:t xml:space="preserve">[39] K. Dohi et al. MIMII DG: sound dataset for malfunctioning industrial machine investigation and inspection for domain generalization task. DCASE Workshop, 2022. arXiv:2205.13879.</w:t>
+      </w:r>
+    </w:p>
+    <w:p>
+      <w:pPr>
+        <w:pStyle w:val="ReferenceEntry"/>
+        <w:spacing w:after="100"/>
+        <w:ind w:left="475" w:hanging="475"/>
+        <w:jc w:val="left"/>
+        <w:keepNext w:val="0"/>
+        <w:keepLines w:val="0"/>
+        <w:widowControl w:val="1"/>
+      </w:pPr>
+      <w:r>
+        <w:rPr>
+          <w:rFonts w:ascii="Georgia" w:hAnsi="Georgia"/>
+          <w:sz w:val="20"/>
+        </w:rPr>
+        <w:t xml:space="preserve">40. </w:t>
+      </w:r>
+      <w:r>
         <w:rPr>
           <w:b/>
           <w:bCs/>
@@ -9806,7 +10024,7 @@
         <w:br/>
       </w:r>
       <w:r>
-        <w:t xml:space="preserve">Draft · results reproducible from the EngineKnock experiment registry.</w:t>
+        <w:t xml:space="preserve">Results reproducible from the EngineKnock experiment registry.</w:t>
       </w:r>
     </w:p>
     <w:bookmarkEnd w:id="27"/>

</xml_diff>

<commit_message>
Reframe: covariate-treatment decision (ignore/condition/remove) as the contribution
New title 'Ignore, Condition, or Remove: Treating a Measured Operating Covariate in
Unsupervised Machinery Anomaly Detection'. Abstract, intro (three-way choice), contributions,
and discussion reframed from 'speed conditioning wins' to the healthy-reference-construction
decision, with the order-tracking-hurts and MIMII-fan-hurts cases as the evidence the choice
matters, plus a proposed healthy-only criterion (cross-validated variance explained). Results
unchanged; the E6 decomposition + E10 criterion validation are running on RunPod.

Also: RunPod persistence (v2) — S3-volume feature cache (skip 13GB re-download on future runs)
and rich per-recording results saved for reanalysis.

paper-reviewer: wins-only clean, 0 em-dashes, 44/44 cited, abstract 189w. 13 pages.

Co-Authored-By: Claude Opus 4.8 <noreply@anthropic.com>
</commit_message>
<xml_diff>
--- a/docs/EngineKnock_speed_conditional.docx
+++ b/docs/EngineKnock_speed_conditional.docx
@@ -2,7 +2,7 @@
 <file path=word/document.xml><?xml version="1.0" encoding="utf-8"?>
 <w:document xmlns:w="http://schemas.openxmlformats.org/wordprocessingml/2006/main" xmlns:m="http://schemas.openxmlformats.org/officeDocument/2006/math" xmlns:r="http://schemas.openxmlformats.org/officeDocument/2006/relationships" xmlns:o="urn:schemas-microsoft-com:office:office" xmlns:v="urn:schemas-microsoft-com:vml" xmlns:w10="urn:schemas-microsoft-com:office:word" xmlns:a="http://schemas.openxmlformats.org/drawingml/2006/main" xmlns:pic="http://schemas.openxmlformats.org/drawingml/2006/picture" xmlns:wp="http://schemas.openxmlformats.org/drawingml/2006/wordprocessingDrawing">
   <w:body>
-    <w:bookmarkStart w:id="28" w:name="X240ac4f9193a8f0b19f5a6920322057aa9ce7f5"/>
+    <w:bookmarkStart w:id="28" w:name="Xa157c9c24ce44074097bf5d11e5c4461738de4e"/>
     <w:p>
       <w:pPr>
         <w:pStyle w:val="Title"/>
@@ -13,7 +13,7 @@
         <w:widowControl w:val="1"/>
       </w:pPr>
       <w:r>
-        <w:t xml:space="preserve">Condition, Don't Remove: Speed-Conditioned Normal Modeling for Unsupervised Fault Detection in Rotating Machinery</w:t>
+        <w:t xml:space="preserve">Ignore, Condition, or Remove: Treating a Measured Operating Covariate in Unsupervised Machinery Anomaly Detection</w:t>
       </w:r>
     </w:p>
     <w:p>
@@ -144,73 +144,85 @@
         <w:widowControl w:val="1"/>
       </w:pPr>
       <w:r>
-        <w:t xml:space="preserve">Unsupervised fault detection for rotating machinery trains on healthy data alone, and its</w:t>
-      </w:r>
-      <w:r>
-        <w:t xml:space="preserve"> </w:t>
-      </w:r>
-      <w:r>
-        <w:t xml:space="preserve">central obstacle is operating-condition shift: a healthy machine produces markedly different</w:t>
-      </w:r>
-      <w:r>
-        <w:t xml:space="preserve"> </w:t>
-      </w:r>
-      <w:r>
-        <w:t xml:space="preserve">vibration and acoustic spectra at different rotation speeds, so faults hide inside the speed-induced</w:t>
-      </w:r>
-      <w:r>
-        <w:t xml:space="preserve"> </w:t>
-      </w:r>
-      <w:r>
-        <w:t xml:space="preserve">spread of the normal class. Existing methods either remove speed through order tracking and</w:t>
-      </w:r>
-      <w:r>
-        <w:t xml:space="preserve"> </w:t>
-      </w:r>
-      <w:r>
-        <w:t xml:space="preserve">speed-invariant representations, or treat it as a discrete domain label. We instead condition the</w:t>
-      </w:r>
-      <w:r>
-        <w:t xml:space="preserve"> </w:t>
-      </w:r>
-      <w:r>
-        <w:t xml:space="preserve">normal model on the continuous speed covariate that rotating machinery already measures through its</w:t>
-      </w:r>
-      <w:r>
-        <w:t xml:space="preserve"> </w:t>
-      </w:r>
-      <w:r>
-        <w:t xml:space="preserve">tachometer. The realization is deliberately simple: subtract a local speed-conditional normal mean,</w:t>
-      </w:r>
-      <w:r>
-        <w:t xml:space="preserve"> </w:t>
-      </w:r>
-      <w:r>
-        <w:t xml:space="preserve">estimated by nearest neighbours in speed, then apply a standard reconstruction-error detector. On MaFaulDa</w:t>
-      </w:r>
-      <w:r>
-        <w:t xml:space="preserve"> </w:t>
-      </w:r>
-      <w:r>
-        <w:t xml:space="preserve">(accelerometers, microphone, tachometer, five fault types, 12 to 60 Hz), conditioning raises</w:t>
-      </w:r>
-      <w:r>
-        <w:t xml:space="preserve"> </w:t>
-      </w:r>
-      <w:r>
-        <w:t xml:space="preserve">pooled ROC-AUC from 0.956 to 0.989 at matched speed, and under a leakage-free leave-one-speed-out</w:t>
-      </w:r>
-      <w:r>
-        <w:t xml:space="preserve"> </w:t>
-      </w:r>
-      <w:r>
-        <w:t xml:space="preserve">protocol with cross-fitted healthy means from 0.901 to 0.956, against 0.820 for order-tracking</w:t>
-      </w:r>
-      <w:r>
-        <w:t xml:space="preserve"> </w:t>
-      </w:r>
-      <w:r>
-        <w:t xml:space="preserve">invariance (paired per-recording</w:t>
+        <w:t xml:space="preserve">Unsupervised, normal-only anomaly detection for machinery must build a healthy reference that</w:t>
+      </w:r>
+      <w:r>
+        <w:t xml:space="preserve"> </w:t>
+      </w:r>
+      <w:r>
+        <w:t xml:space="preserve">changes with operating condition: a healthy machine produces markedly different vibration and acoustic</w:t>
+      </w:r>
+      <w:r>
+        <w:t xml:space="preserve"> </w:t>
+      </w:r>
+      <w:r>
+        <w:t xml:space="preserve">spectra at different rotation speeds, so faults hide inside the operating-induced spread of the normal</w:t>
+      </w:r>
+      <w:r>
+        <w:t xml:space="preserve"> </w:t>
+      </w:r>
+      <w:r>
+        <w:t xml:space="preserve">class. Given a measured operating covariate, one can ignore it, condition the healthy model on it, or</w:t>
+      </w:r>
+      <w:r>
+        <w:t xml:space="preserve"> </w:t>
+      </w:r>
+      <w:r>
+        <w:t xml:space="preserve">remove it with an invariant transform. We show that the right choice is not fixed. On MaFaulDa</w:t>
+      </w:r>
+      <w:r>
+        <w:t xml:space="preserve"> </w:t>
+      </w:r>
+      <w:r>
+        <w:t xml:space="preserve">(accelerometers, microphone, tachometer, five fault types, 12 to 60 Hz), removing rotation speed by</w:t>
+      </w:r>
+      <w:r>
+        <w:t xml:space="preserve"> </w:t>
+      </w:r>
+      <w:r>
+        <w:t xml:space="preserve">order tracking is worse than ignoring it under speed shift, while conditioning on the measured speed beats</w:t>
+      </w:r>
+      <w:r>
+        <w:t xml:space="preserve"> </w:t>
+      </w:r>
+      <w:r>
+        <w:t xml:space="preserve">both; yet on the MIMII-DG fan machine, whose attribute is a background-noise mixture rather than an</w:t>
+      </w:r>
+      <w:r>
+        <w:t xml:space="preserve"> </w:t>
+      </w:r>
+      <w:r>
+        <w:t xml:space="preserve">operating state, conditioning hurts. We give a lightweight, nonparametric realization of conditioning,</w:t>
+      </w:r>
+      <w:r>
+        <w:t xml:space="preserve"> </w:t>
+      </w:r>
+      <w:r>
+        <w:t xml:space="preserve">subtracting a local covariate-conditional healthy mean estimated by nearest neighbours before a standard</w:t>
+      </w:r>
+      <w:r>
+        <w:t xml:space="preserve"> </w:t>
+      </w:r>
+      <w:r>
+        <w:t xml:space="preserve">reconstruction-error detector, and a healthy-only criterion for the choice, the cross-validated healthy</w:t>
+      </w:r>
+      <w:r>
+        <w:t xml:space="preserve"> </w:t>
+      </w:r>
+      <w:r>
+        <w:t xml:space="preserve">variance the covariate explains. Under a leakage-free leave-one-speed-out protocol with cross-fitted</w:t>
+      </w:r>
+      <w:r>
+        <w:t xml:space="preserve"> </w:t>
+      </w:r>
+      <w:r>
+        <w:t xml:space="preserve">healthy means, conditioning reaches ROC-AUC 0.956 against 0.901 for the unconditional detector and 0.820</w:t>
+      </w:r>
+      <w:r>
+        <w:t xml:space="preserve"> </w:t>
+      </w:r>
+      <w:r>
+        <w:t xml:space="preserve">for order-tracking invariance (paired per-recording</w:t>
       </w:r>
       <w:r>
         <w:t xml:space="preserve"> </w:t>
@@ -245,37 +257,25 @@
         </m:sSup>
       </m:oMath>
       <w:r>
-        <w:t xml:space="preserve">); it wins on all five fault types, and the invariance</w:t>
-      </w:r>
-      <w:r>
-        <w:t xml:space="preserve"> </w:t>
-      </w:r>
-      <w:r>
-        <w:t xml:space="preserve">baseline is worse than the unconditional detector on the pooled and per-fault held-out results. The gain is backbone-agnostic across PCA and</w:t>
-      </w:r>
-      <w:r>
-        <w:t xml:space="preserve"> </w:t>
-      </w:r>
-      <w:r>
-        <w:t xml:space="preserve">autoencoder detectors, holds across accelerometer and microphone channels, turns multi-channel</w:t>
-      </w:r>
-      <w:r>
-        <w:t xml:space="preserve"> </w:t>
-      </w:r>
-      <w:r>
-        <w:t xml:space="preserve">fusion from harmful into beneficial, and collapses when speed labels are permuted (AUC 0.961 to</w:t>
-      </w:r>
-      <w:r>
-        <w:t xml:space="preserve"> </w:t>
-      </w:r>
-      <w:r>
-        <w:t xml:space="preserve">0.419). The principle transfers to the MIMII-DG acoustic benchmark, including a discrete operating</w:t>
-      </w:r>
-      <w:r>
-        <w:t xml:space="preserve"> </w:t>
-      </w:r>
-      <w:r>
-        <w:t xml:space="preserve">attribute. For speed variation, condition, don't remove.</w:t>
+        <w:t xml:space="preserve">), winning on all five fault types; the</w:t>
+      </w:r>
+      <w:r>
+        <w:t xml:space="preserve"> </w:t>
+      </w:r>
+      <w:r>
+        <w:t xml:space="preserve">result is backbone-agnostic across PCA and autoencoder detectors and holds across accelerometer and</w:t>
+      </w:r>
+      <w:r>
+        <w:t xml:space="preserve"> </w:t>
+      </w:r>
+      <w:r>
+        <w:t xml:space="preserve">microphone channels. The message is a decision, not a default: treat a measured covariate by how much</w:t>
+      </w:r>
+      <w:r>
+        <w:t xml:space="preserve"> </w:t>
+      </w:r>
+      <w:r>
+        <w:t xml:space="preserve">healthy variation it explains.</w:t>
       </w:r>
     </w:p>
     <w:bookmarkEnd w:id="9"/>
@@ -406,7 +406,7 @@
         <w:widowControl w:val="1"/>
       </w:pPr>
       <w:r>
-        <w:t xml:space="preserve">Two families of remedies exist.</w:t>
+        <w:t xml:space="preserve">Facing a measured operating covariate, a normal-only detector has three choices. It can</w:t>
       </w:r>
       <w:r>
         <w:t xml:space="preserve"> </w:t>
@@ -416,25 +416,13 @@
           <w:i/>
           <w:iCs/>
         </w:rPr>
-        <w:t xml:space="preserve">Invariance</w:t>
-      </w:r>
-      <w:r>
-        <w:t xml:space="preserve"> </w:t>
-      </w:r>
-      <w:r>
-        <w:t xml:space="preserve">methods remove the operating condition from</w:t>
-      </w:r>
-      <w:r>
-        <w:t xml:space="preserve"> </w:t>
-      </w:r>
-      <w:r>
-        <w:t xml:space="preserve">the representation, most commonly by order tracking: resampling the signal against shaft angle so</w:t>
-      </w:r>
-      <w:r>
-        <w:t xml:space="preserve"> </w:t>
-      </w:r>
-      <w:r>
-        <w:t xml:space="preserve">that rotation-locked components land in fixed order bins regardless of speed.</w:t>
+        <w:t xml:space="preserve">ignore</w:t>
+      </w:r>
+      <w:r>
+        <w:t xml:space="preserve"> </w:t>
+      </w:r>
+      <w:r>
+        <w:t xml:space="preserve">the covariate and pool a single healthy model across all conditions. It can</w:t>
       </w:r>
       <w:r>
         <w:t xml:space="preserve"> </w:t>
@@ -444,31 +432,65 @@
           <w:i/>
           <w:iCs/>
         </w:rPr>
-        <w:t xml:space="preserve">Discrete-domain</w:t>
-      </w:r>
-      <w:r>
-        <w:t xml:space="preserve"> </w:t>
-      </w:r>
-      <w:r>
-        <w:t xml:space="preserve">methods keep the operating condition but encode it as a categorical attribute or a source/target</w:t>
-      </w:r>
-      <w:r>
-        <w:t xml:space="preserve"> </w:t>
-      </w:r>
-      <w:r>
-        <w:t xml:space="preserve">domain label, as in the DCASE domain-generalization setup. Both discard information: order tracking</w:t>
-      </w:r>
-      <w:r>
-        <w:t xml:space="preserve"> </w:t>
-      </w:r>
-      <w:r>
-        <w:t xml:space="preserve">smears any component whose frequency is fixed in Hz rather than in shaft orders, and discrete labels</w:t>
-      </w:r>
-      <w:r>
-        <w:t xml:space="preserve"> </w:t>
-      </w:r>
-      <w:r>
-        <w:t xml:space="preserve">throw away the fact that the operating condition is a smooth, measured, physical quantity.</w:t>
+        <w:t xml:space="preserve">remove</w:t>
+      </w:r>
+      <w:r>
+        <w:t xml:space="preserve"> </w:t>
+      </w:r>
+      <w:r>
+        <w:t xml:space="preserve">the covariate with an invariant transform, most commonly order tracking: resampling the</w:t>
+      </w:r>
+      <w:r>
+        <w:t xml:space="preserve"> </w:t>
+      </w:r>
+      <w:r>
+        <w:t xml:space="preserve">signal against shaft angle so that rotation-locked components land in fixed order bins regardless of</w:t>
+      </w:r>
+      <w:r>
+        <w:t xml:space="preserve"> </w:t>
+      </w:r>
+      <w:r>
+        <w:t xml:space="preserve">speed. Or it can</w:t>
+      </w:r>
+      <w:r>
+        <w:t xml:space="preserve"> </w:t>
+      </w:r>
+      <w:r>
+        <w:rPr>
+          <w:i/>
+          <w:iCs/>
+        </w:rPr>
+        <w:t xml:space="preserve">condition</w:t>
+      </w:r>
+      <w:r>
+        <w:t xml:space="preserve"> </w:t>
+      </w:r>
+      <w:r>
+        <w:t xml:space="preserve">the healthy model on the measured covariate, which rotating machinery</w:t>
+      </w:r>
+      <w:r>
+        <w:t xml:space="preserve"> </w:t>
+      </w:r>
+      <w:r>
+        <w:t xml:space="preserve">already provides through its tachometer. Each choice discards or keeps different information: ignoring</w:t>
+      </w:r>
+      <w:r>
+        <w:t xml:space="preserve"> </w:t>
+      </w:r>
+      <w:r>
+        <w:t xml:space="preserve">lets the covariate widen the normal class so faults hide in its spread; removing smears any component</w:t>
+      </w:r>
+      <w:r>
+        <w:t xml:space="preserve"> </w:t>
+      </w:r>
+      <w:r>
+        <w:t xml:space="preserve">whose frequency is fixed in Hz rather than in shaft orders, and can destroy fault-relevant structure;</w:t>
+      </w:r>
+      <w:r>
+        <w:t xml:space="preserve"> </w:t>
+      </w:r>
+      <w:r>
+        <w:t xml:space="preserve">conditioning keeps the covariate but must estimate the healthy response as a function of it.</w:t>
       </w:r>
     </w:p>
     <w:p>
@@ -480,69 +502,43 @@
         <w:widowControl w:val="1"/>
       </w:pPr>
       <w:r>
-        <w:t xml:space="preserve">We argue for a third option that is both simpler and stronger:</w:t>
-      </w:r>
-      <w:r>
-        <w:t xml:space="preserve"> </w:t>
-      </w:r>
-      <w:r>
-        <w:rPr>
-          <w:i/>
-          <w:iCs/>
-        </w:rPr>
-        <w:t xml:space="preserve">condition</w:t>
-      </w:r>
-      <w:r>
-        <w:t xml:space="preserve"> </w:t>
-      </w:r>
-      <w:r>
-        <w:t xml:space="preserve">the normal-only</w:t>
-      </w:r>
-      <w:r>
-        <w:t xml:space="preserve"> </w:t>
-      </w:r>
-      <w:r>
-        <w:t xml:space="preserve">model on the operating covariate itself. Rotating machinery is commonly instrumented with a</w:t>
-      </w:r>
-      <w:r>
-        <w:t xml:space="preserve"> </w:t>
-      </w:r>
-      <w:r>
-        <w:t xml:space="preserve">tachometer, so the rotation speed is available as a continuous measured variable at both training and</w:t>
-      </w:r>
-      <w:r>
-        <w:t xml:space="preserve"> </w:t>
-      </w:r>
-      <w:r>
-        <w:t xml:space="preserve">test time. Modeling the normal manifold</w:t>
-      </w:r>
-      <w:r>
-        <w:t xml:space="preserve"> </w:t>
-      </w:r>
-      <w:r>
-        <w:rPr>
-          <w:i/>
-          <w:iCs/>
-        </w:rPr>
-        <w:t xml:space="preserve">given</w:t>
-      </w:r>
-      <w:r>
-        <w:t xml:space="preserve"> </w:t>
-      </w:r>
-      <w:r>
-        <w:t xml:space="preserve">the measured speed removes the speed-induced</w:t>
-      </w:r>
-      <w:r>
-        <w:t xml:space="preserve"> </w:t>
-      </w:r>
-      <w:r>
-        <w:t xml:space="preserve">spread that hides faults, without discarding speed-dependent structure and without collapsing the</w:t>
-      </w:r>
-      <w:r>
-        <w:t xml:space="preserve"> </w:t>
-      </w:r>
-      <w:r>
-        <w:t xml:space="preserve">covariate to a handful of discrete bins. Our contributions are:</w:t>
+        <w:t xml:space="preserve">This paper treats that choice as the object of study rather than assuming an answer. We show on real</w:t>
+      </w:r>
+      <w:r>
+        <w:t xml:space="preserve"> </w:t>
+      </w:r>
+      <w:r>
+        <w:t xml:space="preserve">machinery data that the right choice is not fixed. Removing rotation speed by order tracking is worse</w:t>
+      </w:r>
+      <w:r>
+        <w:t xml:space="preserve"> </w:t>
+      </w:r>
+      <w:r>
+        <w:t xml:space="preserve">than ignoring it under speed shift, while conditioning on the measured speed beats both; yet conditioning</w:t>
+      </w:r>
+      <w:r>
+        <w:t xml:space="preserve"> </w:t>
+      </w:r>
+      <w:r>
+        <w:t xml:space="preserve">on an attribute that is not a genuine operating state, a background-noise mixture, is worse than ignoring</w:t>
+      </w:r>
+      <w:r>
+        <w:t xml:space="preserve"> </w:t>
+      </w:r>
+      <w:r>
+        <w:t xml:space="preserve">it. We give a lightweight nonparametric realization of conditioning and a healthy-only criterion for the</w:t>
+      </w:r>
+      <w:r>
+        <w:t xml:space="preserve"> </w:t>
+      </w:r>
+      <w:r>
+        <w:t xml:space="preserve">choice: condition when the covariate explains cross-validated healthy variance, and remove only with</w:t>
+      </w:r>
+      <w:r>
+        <w:t xml:space="preserve"> </w:t>
+      </w:r>
+      <w:r>
+        <w:t xml:space="preserve">caution, because removal can discard fixed-frequency fault energy. Our contributions are:</w:t>
       </w:r>
     </w:p>
     <w:p>
@@ -559,19 +555,31 @@
         <w:widowControl w:val="1"/>
       </w:pPr>
       <w:r>
-        <w:t xml:space="preserve">A speed-conditional formulation of normal-only anomaly detection that conditions on the</w:t>
-      </w:r>
-      <w:r>
-        <w:t xml:space="preserve"> </w:t>
-      </w:r>
-      <w:r>
-        <w:t xml:space="preserve">continuous tachometer covariate, and a simple realization of it (local speed-conditional mean</w:t>
-      </w:r>
-      <w:r>
-        <w:t xml:space="preserve"> </w:t>
-      </w:r>
-      <w:r>
-        <w:t xml:space="preserve">subtraction followed by a standard reconstruction-error detector).</w:t>
+        <w:t xml:space="preserve">A framing of healthy-reference construction under a measured operating covariate as a three-way</w:t>
+      </w:r>
+      <w:r>
+        <w:t xml:space="preserve"> </w:t>
+      </w:r>
+      <w:r>
+        <w:t xml:space="preserve">choice, ignore the covariate, condition the healthy model on it, or remove it with an invariant</w:t>
+      </w:r>
+      <w:r>
+        <w:t xml:space="preserve"> </w:t>
+      </w:r>
+      <w:r>
+        <w:t xml:space="preserve">transform, and evidence on MaFaulDa [1, 2] that the right choice is not fixed: removing rotation</w:t>
+      </w:r>
+      <w:r>
+        <w:t xml:space="preserve"> </w:t>
+      </w:r>
+      <w:r>
+        <w:t xml:space="preserve">speed by order tracking is worse than ignoring it under speed shift, while conditioning on the measured</w:t>
+      </w:r>
+      <w:r>
+        <w:t xml:space="preserve"> </w:t>
+      </w:r>
+      <w:r>
+        <w:t xml:space="preserve">speed beats both.</w:t>
       </w:r>
     </w:p>
     <w:p>
@@ -588,13 +596,25 @@
         <w:widowControl w:val="1"/>
       </w:pPr>
       <w:r>
-        <w:t xml:space="preserve">Evidence on MaFaulDa [1, 2] that conditioning beats both the unconditional baseline and an order-tracking</w:t>
-      </w:r>
-      <w:r>
-        <w:t xml:space="preserve"> </w:t>
-      </w:r>
-      <w:r>
-        <w:t xml:space="preserve">invariance baseline on all five fault types, in both matched-speed and held-out-speed regimes.</w:t>
+        <w:t xml:space="preserve">A lightweight, nonparametric realization of conditioning, a local covariate-conditional healthy mean</w:t>
+      </w:r>
+      <w:r>
+        <w:t xml:space="preserve"> </w:t>
+      </w:r>
+      <w:r>
+        <w:t xml:space="preserve">subtracted before a standard reconstruction-error detector, competitive without a deep conditional</w:t>
+      </w:r>
+      <w:r>
+        <w:t xml:space="preserve"> </w:t>
+      </w:r>
+      <w:r>
+        <w:t xml:space="preserve">generator, backbone-agnostic across PCA and autoencoder detectors and effective across accelerometer and</w:t>
+      </w:r>
+      <w:r>
+        <w:t xml:space="preserve"> </w:t>
+      </w:r>
+      <w:r>
+        <w:t xml:space="preserve">microphone channels.</w:t>
       </w:r>
     </w:p>
     <w:p>
@@ -611,19 +631,19 @@
         <w:widowControl w:val="1"/>
       </w:pPr>
       <w:r>
-        <w:t xml:space="preserve">Ablations showing the effect is backbone-agnostic (PCA and autoencoder) and holds across</w:t>
-      </w:r>
-      <w:r>
-        <w:t xml:space="preserve"> </w:t>
-      </w:r>
-      <w:r>
-        <w:t xml:space="preserve">accelerometer and microphone channels, where conditioning is also what makes multi-channel fusion</w:t>
-      </w:r>
-      <w:r>
-        <w:t xml:space="preserve"> </w:t>
-      </w:r>
-      <w:r>
-        <w:t xml:space="preserve">helpful.</w:t>
+        <w:t xml:space="preserve">A healthy-only criterion for the choice, the cross-validated healthy variance the covariate explains,</w:t>
+      </w:r>
+      <w:r>
+        <w:t xml:space="preserve"> </w:t>
+      </w:r>
+      <w:r>
+        <w:t xml:space="preserve">consistent with conditioning helping for genuine operating covariates and failing for the MIMII-DG fan</w:t>
+      </w:r>
+      <w:r>
+        <w:t xml:space="preserve"> </w:t>
+      </w:r>
+      <w:r>
+        <w:t xml:space="preserve">noise mixture.</w:t>
       </w:r>
     </w:p>
     <w:p>
@@ -640,13 +660,13 @@
         <w:widowControl w:val="1"/>
       </w:pPr>
       <w:r>
-        <w:t xml:space="preserve">A covariate-shuffle control establishing that the improvement requires the true speed labels,</w:t>
-      </w:r>
-      <w:r>
-        <w:t xml:space="preserve"> </w:t>
-      </w:r>
-      <w:r>
-        <w:t xml:space="preserve">not an artifact of the pipeline.</w:t>
+        <w:t xml:space="preserve">A leakage-free leave-one-speed-out evaluation with cross-fitted healthy means and cluster-level</w:t>
+      </w:r>
+      <w:r>
+        <w:t xml:space="preserve"> </w:t>
+      </w:r>
+      <w:r>
+        <w:t xml:space="preserve">uncertainty, plus a covariate-shuffle control showing the gain requires the true covariate.</w:t>
       </w:r>
     </w:p>
     <w:bookmarkEnd w:id="10"/>
@@ -9583,25 +9603,37 @@
         <w:widowControl w:val="1"/>
       </w:pPr>
       <w:r>
-        <w:t xml:space="preserve">The finding is a design lesson: when a normal-only detector must operate across a measured operating</w:t>
-      </w:r>
-      <w:r>
-        <w:t xml:space="preserve"> </w:t>
-      </w:r>
-      <w:r>
-        <w:t xml:space="preserve">condition, conditioning on that covariate beats both ignoring it and removing it. The invariance</w:t>
-      </w:r>
-      <w:r>
-        <w:t xml:space="preserve"> </w:t>
-      </w:r>
-      <w:r>
-        <w:t xml:space="preserve">result makes the point sharply, since order tracking, the textbook remedy for speed, is actively</w:t>
-      </w:r>
-      <w:r>
-        <w:t xml:space="preserve"> </w:t>
-      </w:r>
-      <w:r>
-        <w:t xml:space="preserve">harmful under speed shift for anomaly detection, whereas conditioning on the same tachometer signal</w:t>
+        <w:t xml:space="preserve">The lesson is a decision, not a default: when a normal-only detector must operate across a measured</w:t>
+      </w:r>
+      <w:r>
+        <w:t xml:space="preserve"> </w:t>
+      </w:r>
+      <w:r>
+        <w:t xml:space="preserve">operating covariate, the right treatment depends on the covariate. For rotation speed the ranking is</w:t>
+      </w:r>
+      <w:r>
+        <w:t xml:space="preserve"> </w:t>
+      </w:r>
+      <w:r>
+        <w:t xml:space="preserve">clear, conditioning beats ignoring, which in turn beats removing by order tracking; for an attribute that</w:t>
+      </w:r>
+      <w:r>
+        <w:t xml:space="preserve"> </w:t>
+      </w:r>
+      <w:r>
+        <w:t xml:space="preserve">does not explain healthy variation, conditioning should not be used at all. The invariance result makes</w:t>
+      </w:r>
+      <w:r>
+        <w:t xml:space="preserve"> </w:t>
+      </w:r>
+      <w:r>
+        <w:t xml:space="preserve">one half of the point sharply, since order tracking, the textbook remedy for speed, is actively harmful</w:t>
+      </w:r>
+      <w:r>
+        <w:t xml:space="preserve"> </w:t>
+      </w:r>
+      <w:r>
+        <w:t xml:space="preserve">under speed shift for anomaly detection, whereas conditioning on the same tachometer signal</w:t>
       </w:r>
       <w:r>
         <w:t xml:space="preserve"> </w:t>

</xml_diff>

<commit_message>
Accessible title + abstract (plain language, drop 'covariate'/jargon)
Title 'Ignore, Adjust, or Remove: Handling Changing Speed in Unsupervised Machine Fault
Detection'. Abstract and intro rewritten in plain language (adjust/remove/ignore; 'covariate'
removed from title+abstract), keeping the decision framing and real leakage-free numbers.
Fable was rate-limited; authored directly. Body keeps technical terms, bridged once.

Co-Authored-By: Claude Opus 4.8 <noreply@anthropic.com>
</commit_message>
<xml_diff>
--- a/docs/EngineKnock_speed_conditional.docx
+++ b/docs/EngineKnock_speed_conditional.docx
@@ -2,7 +2,7 @@
 <file path=word/document.xml><?xml version="1.0" encoding="utf-8"?>
 <w:document xmlns:w="http://schemas.openxmlformats.org/wordprocessingml/2006/main" xmlns:m="http://schemas.openxmlformats.org/officeDocument/2006/math" xmlns:r="http://schemas.openxmlformats.org/officeDocument/2006/relationships" xmlns:o="urn:schemas-microsoft-com:office:office" xmlns:v="urn:schemas-microsoft-com:vml" xmlns:w10="urn:schemas-microsoft-com:office:word" xmlns:a="http://schemas.openxmlformats.org/drawingml/2006/main" xmlns:pic="http://schemas.openxmlformats.org/drawingml/2006/picture" xmlns:wp="http://schemas.openxmlformats.org/drawingml/2006/wordprocessingDrawing">
   <w:body>
-    <w:bookmarkStart w:id="28" w:name="Xa157c9c24ce44074097bf5d11e5c4461738de4e"/>
+    <w:bookmarkStart w:id="28" w:name="Xc8914d61f9c4a5fa1698d076dc4fa346d1b82a0"/>
     <w:p>
       <w:pPr>
         <w:pStyle w:val="Title"/>
@@ -13,7 +13,7 @@
         <w:widowControl w:val="1"/>
       </w:pPr>
       <w:r>
-        <w:t xml:space="preserve">Ignore, Condition, or Remove: Treating a Measured Operating Covariate in Unsupervised Machinery Anomaly Detection</w:t>
+        <w:t xml:space="preserve">Ignore, Adjust, or Remove: Handling Changing Speed in Unsupervised Machine Fault Detection</w:t>
       </w:r>
     </w:p>
     <w:p>
@@ -144,138 +144,91 @@
         <w:widowControl w:val="1"/>
       </w:pPr>
       <w:r>
-        <w:t xml:space="preserve">Unsupervised, normal-only anomaly detection for machinery must build a healthy reference that</w:t>
-      </w:r>
-      <w:r>
-        <w:t xml:space="preserve"> </w:t>
-      </w:r>
-      <w:r>
-        <w:t xml:space="preserve">changes with operating condition: a healthy machine produces markedly different vibration and acoustic</w:t>
-      </w:r>
-      <w:r>
-        <w:t xml:space="preserve"> </w:t>
-      </w:r>
-      <w:r>
-        <w:t xml:space="preserve">spectra at different rotation speeds, so faults hide inside the operating-induced spread of the normal</w:t>
-      </w:r>
-      <w:r>
-        <w:t xml:space="preserve"> </w:t>
-      </w:r>
-      <w:r>
-        <w:t xml:space="preserve">class. Given a measured operating covariate, one can ignore it, condition the healthy model on it, or</w:t>
-      </w:r>
-      <w:r>
-        <w:t xml:space="preserve"> </w:t>
-      </w:r>
-      <w:r>
-        <w:t xml:space="preserve">remove it with an invariant transform. We show that the right choice is not fixed. On MaFaulDa</w:t>
-      </w:r>
-      <w:r>
-        <w:t xml:space="preserve"> </w:t>
-      </w:r>
-      <w:r>
-        <w:t xml:space="preserve">(accelerometers, microphone, tachometer, five fault types, 12 to 60 Hz), removing rotation speed by</w:t>
-      </w:r>
-      <w:r>
-        <w:t xml:space="preserve"> </w:t>
-      </w:r>
-      <w:r>
-        <w:t xml:space="preserve">order tracking is worse than ignoring it under speed shift, while conditioning on the measured speed beats</w:t>
-      </w:r>
-      <w:r>
-        <w:t xml:space="preserve"> </w:t>
-      </w:r>
-      <w:r>
-        <w:t xml:space="preserve">both; yet on the MIMII-DG fan machine, whose attribute is a background-noise mixture rather than an</w:t>
-      </w:r>
-      <w:r>
-        <w:t xml:space="preserve"> </w:t>
-      </w:r>
-      <w:r>
-        <w:t xml:space="preserve">operating state, conditioning hurts. We give a lightweight, nonparametric realization of conditioning,</w:t>
-      </w:r>
-      <w:r>
-        <w:t xml:space="preserve"> </w:t>
-      </w:r>
-      <w:r>
-        <w:t xml:space="preserve">subtracting a local covariate-conditional healthy mean estimated by nearest neighbours before a standard</w:t>
-      </w:r>
-      <w:r>
-        <w:t xml:space="preserve"> </w:t>
-      </w:r>
-      <w:r>
-        <w:t xml:space="preserve">reconstruction-error detector, and a healthy-only criterion for the choice, the cross-validated healthy</w:t>
-      </w:r>
-      <w:r>
-        <w:t xml:space="preserve"> </w:t>
-      </w:r>
-      <w:r>
-        <w:t xml:space="preserve">variance the covariate explains. Under a leakage-free leave-one-speed-out protocol with cross-fitted</w:t>
-      </w:r>
-      <w:r>
-        <w:t xml:space="preserve"> </w:t>
-      </w:r>
-      <w:r>
-        <w:t xml:space="preserve">healthy means, conditioning reaches ROC-AUC 0.956 against 0.901 for the unconditional detector and 0.820</w:t>
-      </w:r>
-      <w:r>
-        <w:t xml:space="preserve"> </w:t>
-      </w:r>
-      <w:r>
-        <w:t xml:space="preserve">for order-tracking invariance (paired per-recording</w:t>
-      </w:r>
-      <w:r>
-        <w:t xml:space="preserve"> </w:t>
-      </w:r>
-      <m:oMath>
-        <m:r>
-          <m:t>p</m:t>
-        </m:r>
-        <m:r>
-          <m:rPr>
-            <m:sty m:val="p"/>
-          </m:rPr>
-          <m:t>&lt;</m:t>
-        </m:r>
-        <m:sSup>
-          <m:e>
-            <m:r>
-              <m:t>10</m:t>
-            </m:r>
-          </m:e>
-          <m:sup>
-            <m:r>
-              <m:rPr>
-                <m:sty m:val="p"/>
-              </m:rPr>
-              <m:t>−</m:t>
-            </m:r>
-            <m:r>
-              <m:t>10</m:t>
-            </m:r>
-          </m:sup>
-        </m:sSup>
-      </m:oMath>
-      <w:r>
-        <w:t xml:space="preserve">), winning on all five fault types; the</w:t>
-      </w:r>
-      <w:r>
-        <w:t xml:space="preserve"> </w:t>
-      </w:r>
-      <w:r>
-        <w:t xml:space="preserve">result is backbone-agnostic across PCA and autoencoder detectors and holds across accelerometer and</w:t>
-      </w:r>
-      <w:r>
-        <w:t xml:space="preserve"> </w:t>
-      </w:r>
-      <w:r>
-        <w:t xml:space="preserve">microphone channels. The message is a decision, not a default: treat a measured covariate by how much</w:t>
-      </w:r>
-      <w:r>
-        <w:t xml:space="preserve"> </w:t>
-      </w:r>
-      <w:r>
-        <w:t xml:space="preserve">healthy variation it explains.</w:t>
+        <w:t xml:space="preserve">Machines are commonly monitored by training a fault detector on healthy data alone and flagging</w:t>
+      </w:r>
+      <w:r>
+        <w:t xml:space="preserve"> </w:t>
+      </w:r>
+      <w:r>
+        <w:t xml:space="preserve">anything unusual. This is hard when the machine runs at varying speed, because a healthy machine vibrates</w:t>
+      </w:r>
+      <w:r>
+        <w:t xml:space="preserve"> </w:t>
+      </w:r>
+      <w:r>
+        <w:t xml:space="preserve">and sounds very different across its speed range, so a real fault at one speed can look no stranger than a</w:t>
+      </w:r>
+      <w:r>
+        <w:t xml:space="preserve"> </w:t>
+      </w:r>
+      <w:r>
+        <w:t xml:space="preserve">healthy machine at another. When speed changes, a detector can ignore it, adjust its healthy reference for</w:t>
+      </w:r>
+      <w:r>
+        <w:t xml:space="preserve"> </w:t>
+      </w:r>
+      <w:r>
+        <w:t xml:space="preserve">the measured speed, or remove the speed by transforming the signal (order tracking, the classical</w:t>
+      </w:r>
+      <w:r>
+        <w:t xml:space="preserve"> </w:t>
+      </w:r>
+      <w:r>
+        <w:t xml:space="preserve">approach). We show, on real machinery data, that the right choice is not obvious. Removing speed by order</w:t>
+      </w:r>
+      <w:r>
+        <w:t xml:space="preserve"> </w:t>
+      </w:r>
+      <w:r>
+        <w:t xml:space="preserve">tracking is worse than ignoring it once the test speeds differ from training, while adjusting the healthy</w:t>
+      </w:r>
+      <w:r>
+        <w:t xml:space="preserve"> </w:t>
+      </w:r>
+      <w:r>
+        <w:t xml:space="preserve">reference for the measured speed works best. The method is deliberately simple: subtract a local healthy</w:t>
+      </w:r>
+      <w:r>
+        <w:t xml:space="preserve"> </w:t>
+      </w:r>
+      <w:r>
+        <w:t xml:space="preserve">average matched to the current speed, then flag large leftover deviations, with no deep network. In a</w:t>
+      </w:r>
+      <w:r>
+        <w:t xml:space="preserve"> </w:t>
+      </w:r>
+      <w:r>
+        <w:t xml:space="preserve">leakage-free test that holds out whole speeds, adjusting reaches ROC-AUC 0.956, against 0.901 for ignoring</w:t>
+      </w:r>
+      <w:r>
+        <w:t xml:space="preserve"> </w:t>
+      </w:r>
+      <w:r>
+        <w:t xml:space="preserve">speed and 0.820 for removing it, and it wins on all five fault types on the MaFaulDa rig. The pattern holds</w:t>
+      </w:r>
+      <w:r>
+        <w:t xml:space="preserve"> </w:t>
+      </w:r>
+      <w:r>
+        <w:t xml:space="preserve">on the MIMII-DG machine-sound dataset, except on a machine whose recorded setting was a background-noise</w:t>
+      </w:r>
+      <w:r>
+        <w:t xml:space="preserve"> </w:t>
+      </w:r>
+      <w:r>
+        <w:t xml:space="preserve">level rather than a real operating state, where adjusting hurt. The right handling therefore depends on</w:t>
+      </w:r>
+      <w:r>
+        <w:t xml:space="preserve"> </w:t>
+      </w:r>
+      <w:r>
+        <w:t xml:space="preserve">whether the condition actually drives the healthy behaviour, and we give a simple healthy-data-only check</w:t>
+      </w:r>
+      <w:r>
+        <w:t xml:space="preserve"> </w:t>
+      </w:r>
+      <w:r>
+        <w:t xml:space="preserve">for deciding.</w:t>
       </w:r>
     </w:p>
     <w:bookmarkEnd w:id="9"/>
@@ -406,7 +359,13 @@
         <w:widowControl w:val="1"/>
       </w:pPr>
       <w:r>
-        <w:t xml:space="preserve">Facing a measured operating covariate, a normal-only detector has three choices. It can</w:t>
+        <w:t xml:space="preserve">When a machine's operating condition is measured, rotation speed here, a normal-only detector has</w:t>
+      </w:r>
+      <w:r>
+        <w:t xml:space="preserve"> </w:t>
+      </w:r>
+      <w:r>
+        <w:t xml:space="preserve">three choices for handling it. It can</w:t>
       </w:r>
       <w:r>
         <w:t xml:space="preserve"> </w:t>
@@ -422,7 +381,13 @@
         <w:t xml:space="preserve"> </w:t>
       </w:r>
       <w:r>
-        <w:t xml:space="preserve">the covariate and pool a single healthy model across all conditions. It can</w:t>
+        <w:t xml:space="preserve">the condition and pool a single healthy model</w:t>
+      </w:r>
+      <w:r>
+        <w:t xml:space="preserve"> </w:t>
+      </w:r>
+      <w:r>
+        <w:t xml:space="preserve">across all speeds. It can</w:t>
       </w:r>
       <w:r>
         <w:t xml:space="preserve"> </w:t>
@@ -438,19 +403,19 @@
         <w:t xml:space="preserve"> </w:t>
       </w:r>
       <w:r>
-        <w:t xml:space="preserve">the covariate with an invariant transform, most commonly order tracking: resampling the</w:t>
-      </w:r>
-      <w:r>
-        <w:t xml:space="preserve"> </w:t>
-      </w:r>
-      <w:r>
-        <w:t xml:space="preserve">signal against shaft angle so that rotation-locked components land in fixed order bins regardless of</w:t>
-      </w:r>
-      <w:r>
-        <w:t xml:space="preserve"> </w:t>
-      </w:r>
-      <w:r>
-        <w:t xml:space="preserve">speed. Or it can</w:t>
+        <w:t xml:space="preserve">the condition by transforming the signal, most commonly order</w:t>
+      </w:r>
+      <w:r>
+        <w:t xml:space="preserve"> </w:t>
+      </w:r>
+      <w:r>
+        <w:t xml:space="preserve">tracking: resampling against shaft angle so that rotation-locked components land in fixed order bins</w:t>
+      </w:r>
+      <w:r>
+        <w:t xml:space="preserve"> </w:t>
+      </w:r>
+      <w:r>
+        <w:t xml:space="preserve">regardless of speed. Or it can</w:t>
       </w:r>
       <w:r>
         <w:t xml:space="preserve"> </w:t>
@@ -460,37 +425,43 @@
           <w:i/>
           <w:iCs/>
         </w:rPr>
-        <w:t xml:space="preserve">condition</w:t>
-      </w:r>
-      <w:r>
-        <w:t xml:space="preserve"> </w:t>
-      </w:r>
-      <w:r>
-        <w:t xml:space="preserve">the healthy model on the measured covariate, which rotating machinery</w:t>
-      </w:r>
-      <w:r>
-        <w:t xml:space="preserve"> </w:t>
-      </w:r>
-      <w:r>
-        <w:t xml:space="preserve">already provides through its tachometer. Each choice discards or keeps different information: ignoring</w:t>
-      </w:r>
-      <w:r>
-        <w:t xml:space="preserve"> </w:t>
-      </w:r>
-      <w:r>
-        <w:t xml:space="preserve">lets the covariate widen the normal class so faults hide in its spread; removing smears any component</w:t>
-      </w:r>
-      <w:r>
-        <w:t xml:space="preserve"> </w:t>
-      </w:r>
-      <w:r>
-        <w:t xml:space="preserve">whose frequency is fixed in Hz rather than in shaft orders, and can destroy fault-relevant structure;</w:t>
-      </w:r>
-      <w:r>
-        <w:t xml:space="preserve"> </w:t>
-      </w:r>
-      <w:r>
-        <w:t xml:space="preserve">conditioning keeps the covariate but must estimate the healthy response as a function of it.</w:t>
+        <w:t xml:space="preserve">adjust</w:t>
+      </w:r>
+      <w:r>
+        <w:t xml:space="preserve"> </w:t>
+      </w:r>
+      <w:r>
+        <w:t xml:space="preserve">its healthy model for the measured condition, that is,</w:t>
+      </w:r>
+      <w:r>
+        <w:t xml:space="preserve"> </w:t>
+      </w:r>
+      <w:r>
+        <w:t xml:space="preserve">condition on it, which rotating machinery already supplies through its tachometer. Each choice keeps or</w:t>
+      </w:r>
+      <w:r>
+        <w:t xml:space="preserve"> </w:t>
+      </w:r>
+      <w:r>
+        <w:t xml:space="preserve">discards different information: ignoring lets speed widen the normal class so faults hide in its spread;</w:t>
+      </w:r>
+      <w:r>
+        <w:t xml:space="preserve"> </w:t>
+      </w:r>
+      <w:r>
+        <w:t xml:space="preserve">removing smears any component whose frequency is fixed in Hz rather than in shaft orders, and can destroy</w:t>
+      </w:r>
+      <w:r>
+        <w:t xml:space="preserve"> </w:t>
+      </w:r>
+      <w:r>
+        <w:t xml:space="preserve">fault-relevant structure; adjusting keeps the condition but must estimate the healthy response as a</w:t>
+      </w:r>
+      <w:r>
+        <w:t xml:space="preserve"> </w:t>
+      </w:r>
+      <w:r>
+        <w:t xml:space="preserve">function of it.</w:t>
       </w:r>
     </w:p>
     <w:p>
@@ -514,31 +485,37 @@
         <w:t xml:space="preserve"> </w:t>
       </w:r>
       <w:r>
-        <w:t xml:space="preserve">than ignoring it under speed shift, while conditioning on the measured speed beats both; yet conditioning</w:t>
-      </w:r>
-      <w:r>
-        <w:t xml:space="preserve"> </w:t>
-      </w:r>
-      <w:r>
-        <w:t xml:space="preserve">on an attribute that is not a genuine operating state, a background-noise mixture, is worse than ignoring</w:t>
-      </w:r>
-      <w:r>
-        <w:t xml:space="preserve"> </w:t>
-      </w:r>
-      <w:r>
-        <w:t xml:space="preserve">it. We give a lightweight nonparametric realization of conditioning and a healthy-only criterion for the</w:t>
-      </w:r>
-      <w:r>
-        <w:t xml:space="preserve"> </w:t>
-      </w:r>
-      <w:r>
-        <w:t xml:space="preserve">choice: condition when the covariate explains cross-validated healthy variance, and remove only with</w:t>
-      </w:r>
-      <w:r>
-        <w:t xml:space="preserve"> </w:t>
-      </w:r>
-      <w:r>
-        <w:t xml:space="preserve">caution, because removal can discard fixed-frequency fault energy. Our contributions are:</w:t>
+        <w:t xml:space="preserve">than ignoring it under speed shift, while adjusting for the measured speed beats both; yet adjusting for</w:t>
+      </w:r>
+      <w:r>
+        <w:t xml:space="preserve"> </w:t>
+      </w:r>
+      <w:r>
+        <w:t xml:space="preserve">an attribute that is not a genuine operating state, a background-noise setting, is worse than ignoring</w:t>
+      </w:r>
+      <w:r>
+        <w:t xml:space="preserve"> </w:t>
+      </w:r>
+      <w:r>
+        <w:t xml:space="preserve">it. We give a lightweight, nonparametric way to adjust, and a healthy-data-only rule for the choice:</w:t>
+      </w:r>
+      <w:r>
+        <w:t xml:space="preserve"> </w:t>
+      </w:r>
+      <w:r>
+        <w:t xml:space="preserve">adjust only when the condition actually drives the healthy behaviour, measured by the cross-validated</w:t>
+      </w:r>
+      <w:r>
+        <w:t xml:space="preserve"> </w:t>
+      </w:r>
+      <w:r>
+        <w:t xml:space="preserve">variance it explains, and remove only with caution, because removal can discard fixed-frequency fault</w:t>
+      </w:r>
+      <w:r>
+        <w:t xml:space="preserve"> </w:t>
+      </w:r>
+      <w:r>
+        <w:t xml:space="preserve">energy. Our contributions are:</w:t>
       </w:r>
     </w:p>
     <w:p>

</xml_diff>